<commit_message>
Apply round-5 review fixes (12 findings): CompletedCategories__c field + scan progress checklist, getScoreCounts drives Left Panel counts, getCurrentScanFindings 5-param signature, Finding X of TotalFindings__c, Trend vs Previous data source, Cancelled app state + cooldown fix, buildFinding blank CMT fallback, CSV 30MB size guard, getScanRunStatus returns completedCategories, getOrgInfo + getScoreCounts error states, i18n v2 gap acknowledgment
</commit_message>
<xml_diff>
--- a/projects/org-security-scanner/Org Security Scanner - Technical Plan.docx
+++ b/projects/org-security-scanner/Org Security Scanner - Technical Plan.docx
@@ -1404,6 +1404,92 @@
               <w:rPr>
                 <w:sz w:val="18"/>
               </w:rPr>
+              <w:t>Completed Categories</w:t>
+            </w:r>
+          </w:p>
+        </w:tc>
+        <w:tc>
+          <w:tcPr>
+            <w:tcW w:type="dxa" w:w="2351"/>
+            <w:vAlign w:val="center"/>
+          </w:tcPr>
+          <w:p>
+            <w:pPr>
+              <w:jc w:val="left"/>
+            </w:pPr>
+            <w:r>
+              <w:rPr>
+                <w:rFonts w:ascii="Courier New" w:hAnsi="Courier New"/>
+                <w:color w:val="8B0000"/>
+                <w:sz w:val="18"/>
+              </w:rPr>
+              <w:t>CompletedCategories__c</w:t>
+            </w:r>
+          </w:p>
+        </w:tc>
+        <w:tc>
+          <w:tcPr>
+            <w:tcW w:type="dxa" w:w="2351"/>
+            <w:vAlign w:val="center"/>
+          </w:tcPr>
+          <w:p>
+            <w:pPr>
+              <w:jc w:val="left"/>
+            </w:pPr>
+            <w:r>
+              <w:rPr>
+                <w:sz w:val="18"/>
+              </w:rPr>
+              <w:t>LongTextArea(1000)</w:t>
+            </w:r>
+          </w:p>
+        </w:tc>
+        <w:tc>
+          <w:tcPr>
+            <w:tcW w:type="dxa" w:w="2351"/>
+            <w:vAlign w:val="center"/>
+          </w:tcPr>
+          <w:p>
+            <w:pPr>
+              <w:jc w:val="left"/>
+            </w:pPr>
+            <w:r>
+              <w:rPr>
+                <w:sz w:val="18"/>
+              </w:rPr>
+              <w:t xml:space="preserve">Comma-delimited category codes that completed successfully (e.g. </w:t>
+            </w:r>
+            <w:r>
+              <w:rPr>
+                <w:rFonts w:ascii="Courier New" w:hAnsi="Courier New"/>
+                <w:color w:val="8B0000"/>
+                <w:sz w:val="18"/>
+              </w:rPr>
+              <w:t>UA,GU,SRA</w:t>
+            </w:r>
+            <w:r>
+              <w:rPr>
+                <w:sz w:val="18"/>
+              </w:rPr>
+              <w:t>). Each runner appends its code on success - mirrors FailedCategories__c pattern. The scan progress view polls getScanRunStatus() which returns this field so the UI can render a 13-item checklist with completed categories ticked.</w:t>
+            </w:r>
+          </w:p>
+        </w:tc>
+      </w:tr>
+      <w:tr>
+        <w:tc>
+          <w:tcPr>
+            <w:tcW w:type="dxa" w:w="2351"/>
+            <w:vAlign w:val="center"/>
+          </w:tcPr>
+          <w:p>
+            <w:pPr>
+              <w:jc w:val="left"/>
+            </w:pPr>
+            <w:r>
+              <w:rPr>
+                <w:sz w:val="18"/>
+              </w:rPr>
               <w:t>Is Partial Scan</w:t>
             </w:r>
           </w:p>
@@ -4718,7 +4804,13 @@
           <w:color w:val="8B0000"/>
           <w:sz w:val="20"/>
         </w:rPr>
-        <w:t>getCurrentScanFindings(String scanRunId, String lastSeenId, Integer lastRank, Integer pageSize)</w:t>
+        <w:t>getCurrentScanFindings(String scanRunId, String lastSeenId, Integer lastRank, Integer pageSize, String searchTerm)</w:t>
+      </w:r>
+      <w:r>
+        <w:rPr>
+          <w:sz w:val="20"/>
+        </w:rPr>
+        <w:t xml:space="preserve"> (searchTerm = null for no text filter)</w:t>
       </w:r>
     </w:p>
     <w:p>
@@ -9394,7 +9486,7 @@
           <w:color w:val="000080"/>
           <w:sz w:val="17"/>
         </w:rPr>
-        <w:t xml:space="preserve">                                    Appends failed category code to FailedCategories__c on error</w:t>
+        <w:t xml:space="preserve">                                    Appends failed category code to FailedCategories__c on error.</w:t>
       </w:r>
     </w:p>
     <w:p>
@@ -9409,7 +9501,7 @@
           <w:color w:val="000080"/>
           <w:sz w:val="17"/>
         </w:rPr>
-        <w:t>SecScanOrchestrator.cls           - Entry point Queueable</w:t>
+        <w:t xml:space="preserve">                                    Appends completed category code to CompletedCategories__c on</w:t>
       </w:r>
     </w:p>
     <w:p>
@@ -9424,7 +9516,7 @@
           <w:color w:val="000080"/>
           <w:sz w:val="17"/>
         </w:rPr>
-        <w:t xml:space="preserve">                                    Creates SecurityScanRun__c</w:t>
+        <w:t xml:space="preserve">                                    success (after runner.execute() returns without exception).</w:t>
       </w:r>
     </w:p>
     <w:p>
@@ -9439,7 +9531,7 @@
           <w:color w:val="000080"/>
           <w:sz w:val="17"/>
         </w:rPr>
-        <w:t xml:space="preserve">                                    Receives sessionId from SecScanController (sync context)</w:t>
+        <w:t>SecScanOrchestrator.cls           - Entry point Queueable</w:t>
       </w:r>
     </w:p>
     <w:p>
@@ -9454,7 +9546,7 @@
           <w:color w:val="000080"/>
           <w:sz w:val="17"/>
         </w:rPr>
-        <w:t xml:space="preserve">                                    Starts chain</w:t>
+        <w:t xml:space="preserve">                                    Creates SecurityScanRun__c</w:t>
       </w:r>
     </w:p>
     <w:p>
@@ -9469,7 +9561,7 @@
           <w:color w:val="000080"/>
           <w:sz w:val="17"/>
         </w:rPr>
-        <w:t>SecScanRetentionBatch.cls         - Database.Batchable, scope 200</w:t>
+        <w:t xml:space="preserve">                                    Receives sessionId from SecScanController (sync context)</w:t>
       </w:r>
     </w:p>
     <w:p>
@@ -9484,7 +9576,7 @@
           <w:color w:val="000080"/>
           <w:sz w:val="17"/>
         </w:rPr>
-        <w:t xml:space="preserve">                                    Triggered by finalizeScan() after scan completes AND by nightly scheduler</w:t>
+        <w:t xml:space="preserve">                                    Starts chain</w:t>
       </w:r>
     </w:p>
     <w:p>
@@ -9499,7 +9591,7 @@
           <w:color w:val="000080"/>
           <w:sz w:val="17"/>
         </w:rPr>
-        <w:t xml:space="preserve">                                    start(): query SecurityScanRun__c records beyond MaxScanRuns__c limit</w:t>
+        <w:t>SecScanRetentionBatch.cls         - Database.Batchable, scope 1 (NOT 200 - scope=200 means 200 runs</w:t>
       </w:r>
     </w:p>
     <w:p>
@@ -9514,7 +9606,7 @@
           <w:color w:val="000080"/>
           <w:sz w:val="17"/>
         </w:rPr>
-        <w:t xml:space="preserve">                                    Also prunes orphaned Running/Cancelled runs older than 24h in same start()</w:t>
+        <w:t xml:space="preserve">                                    per execute() transaction; at 100 findings/run = 20,000 child deletes,</w:t>
       </w:r>
     </w:p>
     <w:p>
@@ -9529,7 +9621,7 @@
           <w:color w:val="000080"/>
           <w:sz w:val="17"/>
         </w:rPr>
-        <w:t xml:space="preserve">                                    execute(): explicitly delete child SecurityFinding__c first, then parent</w:t>
+        <w:t xml:space="preserve">                                    exceeding the 10,000 DML row limit. scope=1: one run + its children</w:t>
       </w:r>
     </w:p>
     <w:p>
@@ -9544,7 +9636,7 @@
           <w:color w:val="000080"/>
           <w:sz w:val="17"/>
         </w:rPr>
-        <w:t xml:space="preserve">                                    Decoupled from scan execution - DML row limit cannot block a new scan</w:t>
+        <w:t xml:space="preserve">                                    per transaction, safe at any realistic finding volume)</w:t>
       </w:r>
     </w:p>
     <w:p>
@@ -9559,7 +9651,7 @@
           <w:color w:val="000080"/>
           <w:sz w:val="17"/>
         </w:rPr>
-        <w:t xml:space="preserve">                                    (Inline cascade-delete of 5 runs x 2,500+ findings = 12,500 DML rows,</w:t>
+        <w:t xml:space="preserve">                                    Triggered by finalizeScan() after scan completes AND by nightly scheduler</w:t>
       </w:r>
     </w:p>
     <w:p>
@@ -9574,7 +9666,7 @@
           <w:color w:val="000080"/>
           <w:sz w:val="17"/>
         </w:rPr>
-        <w:t xml:space="preserve">                                    exceeding the 10,000 Apex DML limit - this batch pattern avoids that)</w:t>
+        <w:t xml:space="preserve">                                    start(): query SecurityScanRun__c records beyond MaxScanRuns__c limit</w:t>
       </w:r>
     </w:p>
     <w:p>
@@ -9589,7 +9681,7 @@
           <w:color w:val="000080"/>
           <w:sz w:val="17"/>
         </w:rPr>
-        <w:t>SecScanOrphanCleanupSchedulable.cls - Schedulable wrapper. Fires SecScanRetentionBatch nightly.</w:t>
+        <w:t xml:space="preserve">                                    Also prunes orphaned Running/Cancelled runs older than 24h in same start()</w:t>
       </w:r>
     </w:p>
     <w:p>
@@ -9604,7 +9696,7 @@
           <w:color w:val="000080"/>
           <w:sz w:val="17"/>
         </w:rPr>
-        <w:t xml:space="preserve">                                    Handles runs that never reached finalizeScan() (scan crashed before</w:t>
+        <w:t xml:space="preserve">                                    execute(): explicitly delete child SecurityFinding__c first, then parent</w:t>
       </w:r>
     </w:p>
     <w:p>
@@ -9619,7 +9711,7 @@
           <w:color w:val="000080"/>
           <w:sz w:val="17"/>
         </w:rPr>
-        <w:t xml:space="preserve">                                    the final Queueable executed). Without this, stuck Running runs</w:t>
+        <w:t xml:space="preserve">                                    Decoupled from scan execution - DML row limit cannot block a new scan</w:t>
       </w:r>
     </w:p>
     <w:p>
@@ -9634,7 +9726,7 @@
           <w:color w:val="000080"/>
           <w:sz w:val="17"/>
         </w:rPr>
-        <w:t xml:space="preserve">                                    accumulate indefinitely. Schedule at installation: daily at 02:00.</w:t>
+        <w:t xml:space="preserve">                                    (Inline cascade-delete of 5 runs x 2,500+ findings = 12,500 DML rows,</w:t>
       </w:r>
     </w:p>
     <w:p>
@@ -9649,7 +9741,7 @@
           <w:color w:val="000080"/>
           <w:sz w:val="17"/>
         </w:rPr>
-        <w:t xml:space="preserve">                                    System.schedule('SecScan Nightly Cleanup', '0 0 2 * * ?',</w:t>
+        <w:t xml:space="preserve">                                    exceeding the 10,000 Apex DML limit - this batch pattern avoids that)</w:t>
       </w:r>
     </w:p>
     <w:p>
@@ -9664,7 +9756,7 @@
           <w:color w:val="000080"/>
           <w:sz w:val="17"/>
         </w:rPr>
-        <w:t xml:space="preserve">                                        new SecScanOrphanCleanupSchedulable());</w:t>
+        <w:t>SecScanOrphanCleanupSchedulable.cls - Schedulable wrapper. Fires SecScanRetentionBatch nightly.</w:t>
       </w:r>
     </w:p>
     <w:p>
@@ -9679,7 +9771,7 @@
           <w:color w:val="000080"/>
           <w:sz w:val="17"/>
         </w:rPr>
-        <w:t>SecScanRunnerContinuation.cls     - Heap-safe continuation Queueable for AA and LA runners</w:t>
+        <w:t xml:space="preserve">                                    Handles runs that never reached finalizeScan() (scan crashed before</w:t>
       </w:r>
     </w:p>
     <w:p>
@@ -9694,7 +9786,7 @@
           <w:color w:val="000080"/>
           <w:sz w:val="17"/>
         </w:rPr>
-        <w:t xml:space="preserve">                                    Constructor: (Id scanRunId, List&lt;String&gt; runners, Integer currentIndex,</w:t>
+        <w:t xml:space="preserve">                                    the final Queueable executed). Without this, stuck Running runs</w:t>
       </w:r>
     </w:p>
     <w:p>
@@ -9709,7 +9801,7 @@
           <w:color w:val="000080"/>
           <w:sz w:val="17"/>
         </w:rPr>
-        <w:t xml:space="preserve">                                    String sessionId, Integer pageOffset)</w:t>
+        <w:t xml:space="preserve">                                    accumulate indefinitely. Schedule at installation: daily at 02:00.</w:t>
       </w:r>
     </w:p>
     <w:p>
@@ -9724,7 +9816,7 @@
           <w:color w:val="000080"/>
           <w:sz w:val="17"/>
         </w:rPr>
-        <w:t xml:space="preserve">                                    Resumes Tooling API paging from pageOffset, saves additional findings,</w:t>
+        <w:t xml:space="preserve">                                    System.schedule('SecScan Nightly Cleanup', '0 0 2 * * ?',</w:t>
       </w:r>
     </w:p>
     <w:p>
@@ -9739,7 +9831,7 @@
           <w:color w:val="000080"/>
           <w:sz w:val="17"/>
         </w:rPr>
-        <w:t xml:space="preserve">                                    then calls System.enqueueJob(new SecScanRunnerChain(scanRunId, runners,</w:t>
+        <w:t xml:space="preserve">                                        new SecScanOrphanCleanupSchedulable());</w:t>
       </w:r>
     </w:p>
     <w:p>
@@ -9754,7 +9846,7 @@
           <w:color w:val="000080"/>
           <w:sz w:val="17"/>
         </w:rPr>
-        <w:t xml:space="preserve">                                    currentIndex + 1, sessionId)) to resume the main chain</w:t>
+        <w:t>SecScanRunnerContinuation.cls     - Heap-safe continuation Queueable for AA and LA runners</w:t>
       </w:r>
     </w:p>
     <w:p>
@@ -9769,7 +9861,7 @@
           <w:color w:val="000080"/>
           <w:sz w:val="17"/>
         </w:rPr>
-        <w:t xml:space="preserve">                                    CRITICAL: must carry the full runner list and currentIndex - without</w:t>
+        <w:t xml:space="preserve">                                    Constructor: (Id scanRunId, List&lt;String&gt; runners, Integer currentIndex,</w:t>
       </w:r>
     </w:p>
     <w:p>
@@ -9784,7 +9876,7 @@
           <w:color w:val="000080"/>
           <w:sz w:val="17"/>
         </w:rPr>
-        <w:t xml:space="preserve">                                    this, the chain terminates after the heap-overflow category</w:t>
+        <w:t xml:space="preserve">                                    String sessionId, Integer pageOffset)</w:t>
       </w:r>
     </w:p>
     <w:p>
@@ -9799,6 +9891,7 @@
           <w:color w:val="000080"/>
           <w:sz w:val="17"/>
         </w:rPr>
+        <w:t xml:space="preserve">                                    execute() MUST check Status__c for Cancelled first (same pattern as</w:t>
       </w:r>
     </w:p>
     <w:p>
@@ -9813,7 +9906,7 @@
           <w:color w:val="000080"/>
           <w:sz w:val="17"/>
         </w:rPr>
-        <w:t>13 Category Runners (each extends SecScanCategoryRunner):</w:t>
+        <w:t xml:space="preserve">                                    SecScanRunnerChain). Without this check, a cancelled scan that triggered</w:t>
       </w:r>
     </w:p>
     <w:p>
@@ -9828,7 +9921,7 @@
           <w:color w:val="000080"/>
           <w:sz w:val="17"/>
         </w:rPr>
-        <w:t xml:space="preserve">  SecScanRunnerUserAccess.cls         - UA  - 7 checks</w:t>
+        <w:t xml:space="preserve">                                    a continuation still processes all remaining Tooling API pages (30+ seconds</w:t>
       </w:r>
     </w:p>
     <w:p>
@@ -9843,7 +9936,7 @@
           <w:color w:val="000080"/>
           <w:sz w:val="17"/>
         </w:rPr>
-        <w:t xml:space="preserve">  SecScanRunnerGuestUser.cls          - GU  - 15 checks (most API-intensive)</w:t>
+        <w:t xml:space="preserve">                                    of wasted callouts and DML in large orgs) before the next chain link</w:t>
       </w:r>
     </w:p>
     <w:p>
@@ -9858,7 +9951,7 @@
           <w:color w:val="000080"/>
           <w:sz w:val="17"/>
         </w:rPr>
-        <w:t xml:space="preserve">                                        CRITICAL: all 15 checks must operate on data fetched</w:t>
+        <w:t xml:space="preserve">                                    checks and halts. Guard: query Status__c; if Cancelled, call</w:t>
       </w:r>
     </w:p>
     <w:p>
@@ -9873,7 +9966,7 @@
           <w:color w:val="000080"/>
           <w:sz w:val="17"/>
         </w:rPr>
-        <w:t xml:space="preserve">                                        in bulk - never one Tooling API call per profile per check.</w:t>
+        <w:t xml:space="preserve">                                    finalizeScan() and return without enqueueing the next chain link.</w:t>
       </w:r>
     </w:p>
     <w:p>
@@ -9888,7 +9981,7 @@
           <w:color w:val="000080"/>
           <w:sz w:val="17"/>
         </w:rPr>
-        <w:t xml:space="preserve">                                        Pattern: one query fetches all Guest profiles + permissions,</w:t>
+        <w:t xml:space="preserve">                                    Resumes Tooling API paging from pageOffset, saves additional findings,</w:t>
       </w:r>
     </w:p>
     <w:p>
@@ -9903,7 +9996,7 @@
           <w:color w:val="000080"/>
           <w:sz w:val="17"/>
         </w:rPr>
-        <w:t xml:space="preserve">                                        load into memory as Map&lt;Id, Map&lt;String,Object&gt;&gt;,</w:t>
+        <w:t xml:space="preserve">                                    then calls System.enqueueJob(new SecScanRunnerChain(scanRunId, runners,</w:t>
       </w:r>
     </w:p>
     <w:p>
@@ -9918,7 +10011,7 @@
           <w:color w:val="000080"/>
           <w:sz w:val="17"/>
         </w:rPr>
-        <w:t xml:space="preserve">                                        run all 15 checks against the in-memory collection.</w:t>
+        <w:t xml:space="preserve">                                    currentIndex + 1, sessionId)) to resume the main chain</w:t>
       </w:r>
     </w:p>
     <w:p>
@@ -9933,7 +10026,7 @@
           <w:color w:val="000080"/>
           <w:sz w:val="17"/>
         </w:rPr>
-        <w:t xml:space="preserve">                                        Maximum callouts for GU: ~3 (profiles, settings, experience).</w:t>
+        <w:t xml:space="preserve">                                    CRITICAL: must carry the full runner list and currentIndex - without</w:t>
       </w:r>
     </w:p>
     <w:p>
@@ -9948,7 +10041,7 @@
           <w:color w:val="000080"/>
           <w:sz w:val="17"/>
         </w:rPr>
-        <w:t xml:space="preserve">                                        Per-profile queries would exceed the 100-callout limit.</w:t>
+        <w:t xml:space="preserve">                                    this, the chain terminates after the heap-overflow category</w:t>
       </w:r>
     </w:p>
     <w:p>
@@ -9963,7 +10056,6 @@
           <w:color w:val="000080"/>
           <w:sz w:val="17"/>
         </w:rPr>
-        <w:t xml:space="preserve">  SecScanRunnerSharingAccess.cls      - SRA - 7 checks</w:t>
       </w:r>
     </w:p>
     <w:p>
@@ -9978,7 +10070,7 @@
           <w:color w:val="000080"/>
           <w:sz w:val="17"/>
         </w:rPr>
-        <w:t xml:space="preserve">  SecScanRunnerSessionAuth.cls        - SA  - 12 checks</w:t>
+        <w:t>13 Category Runners (each extends SecScanCategoryRunner):</w:t>
       </w:r>
     </w:p>
     <w:p>
@@ -9993,7 +10085,7 @@
           <w:color w:val="000080"/>
           <w:sz w:val="17"/>
         </w:rPr>
-        <w:t xml:space="preserve">  SecScanRunnerConnectedApps.cls      - CAI - 8 checks</w:t>
+        <w:t xml:space="preserve">  SecScanRunnerUserAccess.cls         - UA  - 7 checks</w:t>
       </w:r>
     </w:p>
     <w:p>
@@ -10008,7 +10100,7 @@
           <w:color w:val="000080"/>
           <w:sz w:val="17"/>
         </w:rPr>
-        <w:t xml:space="preserve">  SecScanRunnerApexAutomation.cls     - AA  - 8 checks</w:t>
+        <w:t xml:space="preserve">  SecScanRunnerGuestUser.cls          - GU  - 15 checks (most API-intensive)</w:t>
       </w:r>
     </w:p>
     <w:p>
@@ -10023,7 +10115,7 @@
           <w:color w:val="000080"/>
           <w:sz w:val="17"/>
         </w:rPr>
-        <w:t xml:space="preserve">  SecScanRunnerLwcAura.cls            - LA  - 3 checks</w:t>
+        <w:t xml:space="preserve">                                        CRITICAL: all 15 checks must operate on data fetched</w:t>
       </w:r>
     </w:p>
     <w:p>
@@ -10038,7 +10130,7 @@
           <w:color w:val="000080"/>
           <w:sz w:val="17"/>
         </w:rPr>
-        <w:t xml:space="preserve">  SecScanRunnerAgentforce.cls         - AGA - 5 checks</w:t>
+        <w:t xml:space="preserve">                                        in bulk - never one Tooling API call per profile per check.</w:t>
       </w:r>
     </w:p>
     <w:p>
@@ -10053,7 +10145,7 @@
           <w:color w:val="000080"/>
           <w:sz w:val="17"/>
         </w:rPr>
-        <w:t xml:space="preserve">  SecScanRunnerMetadataSecrets.cls    - MS  - 4 checks</w:t>
+        <w:t xml:space="preserve">                                        Pattern: one query fetches all Guest profiles + permissions,</w:t>
       </w:r>
     </w:p>
     <w:p>
@@ -10068,7 +10160,7 @@
           <w:color w:val="000080"/>
           <w:sz w:val="17"/>
         </w:rPr>
-        <w:t xml:space="preserve">  SecScanRunnerFileUpload.cls         - FUE - 3 checks (uses SecScanMetadataService)</w:t>
+        <w:t xml:space="preserve">                                        load into memory as Map&lt;Id, Map&lt;String,Object&gt;&gt;,</w:t>
       </w:r>
     </w:p>
     <w:p>
@@ -10083,7 +10175,7 @@
           <w:color w:val="000080"/>
           <w:sz w:val="17"/>
         </w:rPr>
-        <w:t xml:space="preserve">  SecScanRunnerCertEncryption.cls     - CE  - 2 checks</w:t>
+        <w:t xml:space="preserve">                                        run all 15 checks against the in-memory collection.</w:t>
       </w:r>
     </w:p>
     <w:p>
@@ -10098,7 +10190,7 @@
           <w:color w:val="000080"/>
           <w:sz w:val="17"/>
         </w:rPr>
-        <w:t xml:space="preserve">  SecScanRunnerMonitoring.cls         - MON - 4 checks</w:t>
+        <w:t xml:space="preserve">                                        Maximum callouts for GU: ~3 (profiles, settings, experience).</w:t>
       </w:r>
     </w:p>
     <w:p>
@@ -10113,7 +10205,7 @@
           <w:color w:val="000080"/>
           <w:sz w:val="17"/>
         </w:rPr>
-        <w:t xml:space="preserve">  SecScanRunnerHealthCheck.cls        - HCB - 3 checks (uses SecScanMetadataService)</w:t>
+        <w:t xml:space="preserve">                                        Per-profile queries would exceed the 100-callout limit.</w:t>
       </w:r>
     </w:p>
     <w:p>
@@ -10128,6 +10220,7 @@
           <w:color w:val="000080"/>
           <w:sz w:val="17"/>
         </w:rPr>
+        <w:t xml:space="preserve">  SecScanRunnerSharingAccess.cls      - SRA - 7 checks</w:t>
       </w:r>
     </w:p>
     <w:p>
@@ -10142,7 +10235,7 @@
           <w:color w:val="000080"/>
           <w:sz w:val="17"/>
         </w:rPr>
-        <w:t>Apex Controllers (with sharing + WITH USER_MODE):</w:t>
+        <w:t xml:space="preserve">  SecScanRunnerSessionAuth.cls        - SA  - 12 checks</w:t>
       </w:r>
     </w:p>
     <w:p>
@@ -10157,7 +10250,7 @@
           <w:color w:val="000080"/>
           <w:sz w:val="17"/>
         </w:rPr>
-        <w:t xml:space="preserve">  SecScanController.cls             - startScan, getScanRuns, getScanRunStatus, cancelScan, exportFindingsCsv</w:t>
+        <w:t xml:space="preserve">  SecScanRunnerConnectedApps.cls      - CAI - 8 checks</w:t>
       </w:r>
     </w:p>
     <w:p>
@@ -10172,7 +10265,7 @@
           <w:color w:val="000080"/>
           <w:sz w:val="17"/>
         </w:rPr>
-        <w:t xml:space="preserve">  SecScanFindingsController.cls     - getCurrentScanFindings, getFindingDetail, updateFindingStatus, bulkUpdateFindingStatus</w:t>
+        <w:t xml:space="preserve">  SecScanRunnerApexAutomation.cls     - AA  - 8 checks</w:t>
       </w:r>
     </w:p>
     <w:p>
@@ -10187,6 +10280,7 @@
           <w:color w:val="000080"/>
           <w:sz w:val="17"/>
         </w:rPr>
+        <w:t xml:space="preserve">  SecScanRunnerLwcAura.cls            - LA  - 3 checks</w:t>
       </w:r>
     </w:p>
     <w:p>
@@ -10201,7 +10295,7 @@
           <w:color w:val="000080"/>
           <w:sz w:val="17"/>
         </w:rPr>
-        <w:t>SecScanTestDataFactory.cls        - Shared test utility. Single source of truth for</w:t>
+        <w:t xml:space="preserve">  SecScanRunnerAgentforce.cls         - AGA - 5 checks</w:t>
       </w:r>
     </w:p>
     <w:p>
@@ -10216,7 +10310,7 @@
           <w:color w:val="000080"/>
           <w:sz w:val="17"/>
         </w:rPr>
-        <w:t xml:space="preserve">                                    creating SecurityScanRun__c and SecurityFinding__c</w:t>
+        <w:t xml:space="preserve">  SecScanRunnerMetadataSecrets.cls    - MS  - 4 checks</w:t>
       </w:r>
     </w:p>
     <w:p>
@@ -10231,7 +10325,7 @@
           <w:color w:val="000080"/>
           <w:sz w:val="17"/>
         </w:rPr>
-        <w:t xml:space="preserve">                                    test records. All test classes use this - never</w:t>
+        <w:t xml:space="preserve">  SecScanRunnerFileUpload.cls         - FUE - 3 checks (uses SecScanMetadataService)</w:t>
       </w:r>
     </w:p>
     <w:p>
@@ -10246,7 +10340,7 @@
           <w:color w:val="000080"/>
           <w:sz w:val="17"/>
         </w:rPr>
-        <w:t xml:space="preserve">                                    construct records inline. Field changes require</w:t>
+        <w:t xml:space="preserve">  SecScanRunnerCertEncryption.cls     - CE  - 2 checks</w:t>
       </w:r>
     </w:p>
     <w:p>
@@ -10261,7 +10355,7 @@
           <w:color w:val="000080"/>
           <w:sz w:val="17"/>
         </w:rPr>
-        <w:t xml:space="preserve">                                    updating one file only.</w:t>
+        <w:t xml:space="preserve">  SecScanRunnerMonitoring.cls         - MON - 4 checks</w:t>
       </w:r>
     </w:p>
     <w:p>
@@ -10276,6 +10370,7 @@
           <w:color w:val="000080"/>
           <w:sz w:val="17"/>
         </w:rPr>
+        <w:t xml:space="preserve">  SecScanRunnerHealthCheck.cls        - HCB - 3 checks (uses SecScanMetadataService)</w:t>
       </w:r>
     </w:p>
     <w:p>
@@ -10290,7 +10385,6 @@
           <w:color w:val="000080"/>
           <w:sz w:val="17"/>
         </w:rPr>
-        <w:t>Tests:</w:t>
       </w:r>
     </w:p>
     <w:p>
@@ -10305,7 +10399,7 @@
           <w:color w:val="000080"/>
           <w:sz w:val="17"/>
         </w:rPr>
-        <w:t xml:space="preserve">  SecScanOrchestratorTest.cls</w:t>
+        <w:t>Apex Controllers (with sharing + WITH USER_MODE):</w:t>
       </w:r>
     </w:p>
     <w:p>
@@ -10320,7 +10414,7 @@
           <w:color w:val="000080"/>
           <w:sz w:val="17"/>
         </w:rPr>
-        <w:t xml:space="preserve">  SecScanToolingServiceTest.cls</w:t>
+        <w:t xml:space="preserve">  SecScanController.cls             - startScan, getScanRuns, getScanRunStatus, cancelScan, exportFindingsCsv</w:t>
       </w:r>
     </w:p>
     <w:p>
@@ -10335,7 +10429,7 @@
           <w:color w:val="000080"/>
           <w:sz w:val="17"/>
         </w:rPr>
-        <w:t xml:space="preserve">  SecScanMetadataServiceTest.cls          - SOAP fault parsing, malformed XML, timeout handling</w:t>
+        <w:t xml:space="preserve">  SecScanFindingsController.cls     - getCurrentScanFindings, getFindingDetail, updateFindingStatus, bulkUpdateFindingStatus</w:t>
       </w:r>
     </w:p>
     <w:p>
@@ -10350,7 +10444,6 @@
           <w:color w:val="000080"/>
           <w:sz w:val="17"/>
         </w:rPr>
-        <w:t xml:space="preserve">  SecScanRunnerUserAccessTest.cls         - UA</w:t>
       </w:r>
     </w:p>
     <w:p>
@@ -10365,7 +10458,7 @@
           <w:color w:val="000080"/>
           <w:sz w:val="17"/>
         </w:rPr>
-        <w:t xml:space="preserve">  SecScanRunnerGuestUserTest.cls          - GU</w:t>
+        <w:t>SecScanTestDataFactory.cls        - Shared test utility. Single source of truth for</w:t>
       </w:r>
     </w:p>
     <w:p>
@@ -10380,7 +10473,7 @@
           <w:color w:val="000080"/>
           <w:sz w:val="17"/>
         </w:rPr>
-        <w:t xml:space="preserve">  SecScanRunnerSharingAccessTest.cls      - SRA</w:t>
+        <w:t xml:space="preserve">                                    creating SecurityScanRun__c and SecurityFinding__c</w:t>
       </w:r>
     </w:p>
     <w:p>
@@ -10395,7 +10488,7 @@
           <w:color w:val="000080"/>
           <w:sz w:val="17"/>
         </w:rPr>
-        <w:t xml:space="preserve">  SecScanRunnerSessionAuthTest.cls        - SA</w:t>
+        <w:t xml:space="preserve">                                    test records. All test classes use this - never</w:t>
       </w:r>
     </w:p>
     <w:p>
@@ -10410,7 +10503,7 @@
           <w:color w:val="000080"/>
           <w:sz w:val="17"/>
         </w:rPr>
-        <w:t xml:space="preserve">  SecScanRunnerConnectedAppsTest.cls      - CAI</w:t>
+        <w:t xml:space="preserve">                                    construct records inline. Field changes require</w:t>
       </w:r>
     </w:p>
     <w:p>
@@ -10425,7 +10518,7 @@
           <w:color w:val="000080"/>
           <w:sz w:val="17"/>
         </w:rPr>
-        <w:t xml:space="preserve">  SecScanRunnerApexAutomationTest.cls     - AA</w:t>
+        <w:t xml:space="preserve">                                    updating one file only.</w:t>
       </w:r>
     </w:p>
     <w:p>
@@ -10440,7 +10533,6 @@
           <w:color w:val="000080"/>
           <w:sz w:val="17"/>
         </w:rPr>
-        <w:t xml:space="preserve">  SecScanRunnerLwcAuraTest.cls            - LA</w:t>
       </w:r>
     </w:p>
     <w:p>
@@ -10455,7 +10547,7 @@
           <w:color w:val="000080"/>
           <w:sz w:val="17"/>
         </w:rPr>
-        <w:t xml:space="preserve">  SecScanRunnerAgentforceTest.cls         - AGA</w:t>
+        <w:t>Tests:</w:t>
       </w:r>
     </w:p>
     <w:p>
@@ -10470,7 +10562,7 @@
           <w:color w:val="000080"/>
           <w:sz w:val="17"/>
         </w:rPr>
-        <w:t xml:space="preserve">  SecScanRunnerMetadataSecretsTest.cls    - MS</w:t>
+        <w:t xml:space="preserve">  SecScanOrchestratorTest.cls</w:t>
       </w:r>
     </w:p>
     <w:p>
@@ -10485,7 +10577,7 @@
           <w:color w:val="000080"/>
           <w:sz w:val="17"/>
         </w:rPr>
-        <w:t xml:space="preserve">  SecScanRunnerFileUploadTest.cls         - FUE</w:t>
+        <w:t xml:space="preserve">  SecScanToolingServiceTest.cls</w:t>
       </w:r>
     </w:p>
     <w:p>
@@ -10500,7 +10592,7 @@
           <w:color w:val="000080"/>
           <w:sz w:val="17"/>
         </w:rPr>
-        <w:t xml:space="preserve">  SecScanRunnerCertEncryptionTest.cls     - CE</w:t>
+        <w:t xml:space="preserve">  SecScanMetadataServiceTest.cls          - SOAP fault parsing, malformed XML, timeout handling</w:t>
       </w:r>
     </w:p>
     <w:p>
@@ -10515,7 +10607,7 @@
           <w:color w:val="000080"/>
           <w:sz w:val="17"/>
         </w:rPr>
-        <w:t xml:space="preserve">  SecScanRunnerMonitoringTest.cls         - MON</w:t>
+        <w:t xml:space="preserve">  SecScanRunnerUserAccessTest.cls         - UA</w:t>
       </w:r>
     </w:p>
     <w:p>
@@ -10530,7 +10622,7 @@
           <w:color w:val="000080"/>
           <w:sz w:val="17"/>
         </w:rPr>
-        <w:t xml:space="preserve">  SecScanRunnerHealthCheckTest.cls        - HCB</w:t>
+        <w:t xml:space="preserve">  SecScanRunnerGuestUserTest.cls          - GU</w:t>
       </w:r>
     </w:p>
     <w:p>
@@ -10545,7 +10637,7 @@
           <w:color w:val="000080"/>
           <w:sz w:val="17"/>
         </w:rPr>
-        <w:t xml:space="preserve">  SecScanControllerTest.cls</w:t>
+        <w:t xml:space="preserve">  SecScanRunnerSharingAccessTest.cls      - SRA</w:t>
       </w:r>
     </w:p>
     <w:p>
@@ -10560,7 +10652,7 @@
           <w:color w:val="000080"/>
           <w:sz w:val="17"/>
         </w:rPr>
-        <w:t xml:space="preserve">  SecScanFindingsControllerTest.cls</w:t>
+        <w:t xml:space="preserve">  SecScanRunnerSessionAuthTest.cls        - SA</w:t>
       </w:r>
     </w:p>
     <w:p>
@@ -10575,7 +10667,7 @@
           <w:color w:val="000080"/>
           <w:sz w:val="17"/>
         </w:rPr>
-        <w:t xml:space="preserve">  SecScanCategoryRunnerTest.cls           - enforces buildFinding() normalization contract</w:t>
+        <w:t xml:space="preserve">  SecScanRunnerConnectedAppsTest.cls      - CAI</w:t>
       </w:r>
     </w:p>
     <w:p>
@@ -10590,7 +10682,7 @@
           <w:color w:val="000080"/>
           <w:sz w:val="17"/>
         </w:rPr>
-        <w:t xml:space="preserve">  SecScanRetentionBatchTest.cls           - verifies old runs deleted, findings cascade-deleted</w:t>
+        <w:t xml:space="preserve">  SecScanRunnerApexAutomationTest.cls     - AA</w:t>
       </w:r>
     </w:p>
     <w:p>
@@ -10605,7 +10697,7 @@
           <w:color w:val="000080"/>
           <w:sz w:val="17"/>
         </w:rPr>
-        <w:t xml:space="preserve">  SecScanOrphanCleanupSchedulableTest.cls - schedule the job, verify it appears in CronTrigger, unschedule. Minimal coverage sufficient for deployment.</w:t>
+        <w:t xml:space="preserve">  SecScanRunnerLwcAuraTest.cls            - LA</w:t>
       </w:r>
     </w:p>
     <w:p>
@@ -10620,6 +10712,7 @@
           <w:color w:val="000080"/>
           <w:sz w:val="17"/>
         </w:rPr>
+        <w:t xml:space="preserve">  SecScanRunnerAgentforceTest.cls         - AGA</w:t>
       </w:r>
     </w:p>
     <w:p>
@@ -10634,7 +10727,7 @@
           <w:color w:val="000080"/>
           <w:sz w:val="17"/>
         </w:rPr>
-        <w:t>Testing strategy for private runner methods: annotate private detection methods with @TestVisible.</w:t>
+        <w:t xml:space="preserve">  SecScanRunnerMetadataSecretsTest.cls    - MS</w:t>
       </w:r>
     </w:p>
     <w:p>
@@ -10649,7 +10742,7 @@
           <w:color w:val="000080"/>
           <w:sz w:val="17"/>
         </w:rPr>
-        <w:t>Runner tests call the public execute() method for integration-level coverage and the @TestVisible</w:t>
+        <w:t xml:space="preserve">  SecScanRunnerFileUploadTest.cls         - FUE</w:t>
       </w:r>
     </w:p>
     <w:p>
@@ -10664,7 +10757,7 @@
           <w:color w:val="000080"/>
           <w:sz w:val="17"/>
         </w:rPr>
-        <w:t>methods directly for isolated unit assertions. Do not test private methods only through execute() -</w:t>
+        <w:t xml:space="preserve">  SecScanRunnerCertEncryptionTest.cls     - CE</w:t>
       </w:r>
     </w:p>
     <w:p>
@@ -10679,6 +10772,170 @@
           <w:color w:val="000080"/>
           <w:sz w:val="17"/>
         </w:rPr>
+        <w:t xml:space="preserve">  SecScanRunnerMonitoringTest.cls         - MON</w:t>
+      </w:r>
+    </w:p>
+    <w:p>
+      <w:pPr>
+        <w:pStyle w:val="NoSpacing"/>
+        <w:ind w:left="567"/>
+        <w:shd w:val="clear" w:color="auto" w:fill="F0F0F0"/>
+      </w:pPr>
+      <w:r>
+        <w:rPr>
+          <w:rFonts w:ascii="Courier New" w:hAnsi="Courier New"/>
+          <w:color w:val="000080"/>
+          <w:sz w:val="17"/>
+        </w:rPr>
+        <w:t xml:space="preserve">  SecScanRunnerHealthCheckTest.cls        - HCB</w:t>
+      </w:r>
+    </w:p>
+    <w:p>
+      <w:pPr>
+        <w:pStyle w:val="NoSpacing"/>
+        <w:ind w:left="567"/>
+        <w:shd w:val="clear" w:color="auto" w:fill="F0F0F0"/>
+      </w:pPr>
+      <w:r>
+        <w:rPr>
+          <w:rFonts w:ascii="Courier New" w:hAnsi="Courier New"/>
+          <w:color w:val="000080"/>
+          <w:sz w:val="17"/>
+        </w:rPr>
+        <w:t xml:space="preserve">  SecScanControllerTest.cls</w:t>
+      </w:r>
+    </w:p>
+    <w:p>
+      <w:pPr>
+        <w:pStyle w:val="NoSpacing"/>
+        <w:ind w:left="567"/>
+        <w:shd w:val="clear" w:color="auto" w:fill="F0F0F0"/>
+      </w:pPr>
+      <w:r>
+        <w:rPr>
+          <w:rFonts w:ascii="Courier New" w:hAnsi="Courier New"/>
+          <w:color w:val="000080"/>
+          <w:sz w:val="17"/>
+        </w:rPr>
+        <w:t xml:space="preserve">  SecScanFindingsControllerTest.cls</w:t>
+      </w:r>
+    </w:p>
+    <w:p>
+      <w:pPr>
+        <w:pStyle w:val="NoSpacing"/>
+        <w:ind w:left="567"/>
+        <w:shd w:val="clear" w:color="auto" w:fill="F0F0F0"/>
+      </w:pPr>
+      <w:r>
+        <w:rPr>
+          <w:rFonts w:ascii="Courier New" w:hAnsi="Courier New"/>
+          <w:color w:val="000080"/>
+          <w:sz w:val="17"/>
+        </w:rPr>
+        <w:t xml:space="preserve">  SecScanCategoryRunnerTest.cls           - enforces buildFinding() normalization contract</w:t>
+      </w:r>
+    </w:p>
+    <w:p>
+      <w:pPr>
+        <w:pStyle w:val="NoSpacing"/>
+        <w:ind w:left="567"/>
+        <w:shd w:val="clear" w:color="auto" w:fill="F0F0F0"/>
+      </w:pPr>
+      <w:r>
+        <w:rPr>
+          <w:rFonts w:ascii="Courier New" w:hAnsi="Courier New"/>
+          <w:color w:val="000080"/>
+          <w:sz w:val="17"/>
+        </w:rPr>
+        <w:t xml:space="preserve">  SecScanRetentionBatchTest.cls           - verifies old runs deleted, findings cascade-deleted</w:t>
+      </w:r>
+    </w:p>
+    <w:p>
+      <w:pPr>
+        <w:pStyle w:val="NoSpacing"/>
+        <w:ind w:left="567"/>
+        <w:shd w:val="clear" w:color="auto" w:fill="F0F0F0"/>
+      </w:pPr>
+      <w:r>
+        <w:rPr>
+          <w:rFonts w:ascii="Courier New" w:hAnsi="Courier New"/>
+          <w:color w:val="000080"/>
+          <w:sz w:val="17"/>
+        </w:rPr>
+        <w:t xml:space="preserve">  SecScanOrphanCleanupSchedulableTest.cls - schedule the job, verify it appears in CronTrigger, unschedule. Minimal coverage sufficient for deployment.</w:t>
+      </w:r>
+    </w:p>
+    <w:p>
+      <w:pPr>
+        <w:pStyle w:val="NoSpacing"/>
+        <w:ind w:left="567"/>
+        <w:shd w:val="clear" w:color="auto" w:fill="F0F0F0"/>
+      </w:pPr>
+      <w:r>
+        <w:rPr>
+          <w:rFonts w:ascii="Courier New" w:hAnsi="Courier New"/>
+          <w:color w:val="000080"/>
+          <w:sz w:val="17"/>
+        </w:rPr>
+      </w:r>
+    </w:p>
+    <w:p>
+      <w:pPr>
+        <w:pStyle w:val="NoSpacing"/>
+        <w:ind w:left="567"/>
+        <w:shd w:val="clear" w:color="auto" w:fill="F0F0F0"/>
+      </w:pPr>
+      <w:r>
+        <w:rPr>
+          <w:rFonts w:ascii="Courier New" w:hAnsi="Courier New"/>
+          <w:color w:val="000080"/>
+          <w:sz w:val="17"/>
+        </w:rPr>
+        <w:t>Testing strategy for private runner methods: annotate private detection methods with @TestVisible.</w:t>
+      </w:r>
+    </w:p>
+    <w:p>
+      <w:pPr>
+        <w:pStyle w:val="NoSpacing"/>
+        <w:ind w:left="567"/>
+        <w:shd w:val="clear" w:color="auto" w:fill="F0F0F0"/>
+      </w:pPr>
+      <w:r>
+        <w:rPr>
+          <w:rFonts w:ascii="Courier New" w:hAnsi="Courier New"/>
+          <w:color w:val="000080"/>
+          <w:sz w:val="17"/>
+        </w:rPr>
+        <w:t>Runner tests call the public execute() method for integration-level coverage and the @TestVisible</w:t>
+      </w:r>
+    </w:p>
+    <w:p>
+      <w:pPr>
+        <w:pStyle w:val="NoSpacing"/>
+        <w:ind w:left="567"/>
+        <w:shd w:val="clear" w:color="auto" w:fill="F0F0F0"/>
+      </w:pPr>
+      <w:r>
+        <w:rPr>
+          <w:rFonts w:ascii="Courier New" w:hAnsi="Courier New"/>
+          <w:color w:val="000080"/>
+          <w:sz w:val="17"/>
+        </w:rPr>
+        <w:t>methods directly for isolated unit assertions. Do not test private methods only through execute() -</w:t>
+      </w:r>
+    </w:p>
+    <w:p>
+      <w:pPr>
+        <w:pStyle w:val="NoSpacing"/>
+        <w:ind w:left="567"/>
+        <w:shd w:val="clear" w:color="auto" w:fill="F0F0F0"/>
+      </w:pPr>
+      <w:r>
+        <w:rPr>
+          <w:rFonts w:ascii="Courier New" w:hAnsi="Courier New"/>
+          <w:color w:val="000080"/>
+          <w:sz w:val="17"/>
+        </w:rPr>
         <w:t>granular assertions on individual checks are not possible through the public surface alone.</w:t>
       </w:r>
     </w:p>
@@ -11300,7 +11557,67 @@
           <w:color w:val="000080"/>
           <w:sz w:val="17"/>
         </w:rPr>
-        <w:t xml:space="preserve">        SecScanOrchestrator.finalizeScan(scanRunId); // mark Completed with whatever ran</w:t>
+        <w:t xml:space="preserve">        // finalizeScan() computes Score__c, Grade__c, and aggregate counts from whatever categories ran.</w:t>
+      </w:r>
+    </w:p>
+    <w:p>
+      <w:pPr>
+        <w:pStyle w:val="NoSpacing"/>
+        <w:ind w:left="567"/>
+        <w:shd w:val="clear" w:color="auto" w:fill="F0F0F0"/>
+      </w:pPr>
+      <w:r>
+        <w:rPr>
+          <w:rFonts w:ascii="Courier New" w:hAnsi="Courier New"/>
+          <w:color w:val="000080"/>
+          <w:sz w:val="17"/>
+        </w:rPr>
+        <w:t xml:space="preserve">        // CRITICAL: finalizeScan() must NOT set Status__c = 'Completed' if current status is Cancelled.</w:t>
+      </w:r>
+    </w:p>
+    <w:p>
+      <w:pPr>
+        <w:pStyle w:val="NoSpacing"/>
+        <w:ind w:left="567"/>
+        <w:shd w:val="clear" w:color="auto" w:fill="F0F0F0"/>
+      </w:pPr>
+      <w:r>
+        <w:rPr>
+          <w:rFonts w:ascii="Courier New" w:hAnsi="Courier New"/>
+          <w:color w:val="000080"/>
+          <w:sz w:val="17"/>
+        </w:rPr>
+        <w:t xml:space="preserve">        // It must check status before writing: if (currentStatus != 'Cancelled') { run.Status__c = 'Completed'; }</w:t>
+      </w:r>
+    </w:p>
+    <w:p>
+      <w:pPr>
+        <w:pStyle w:val="NoSpacing"/>
+        <w:ind w:left="567"/>
+        <w:shd w:val="clear" w:color="auto" w:fill="F0F0F0"/>
+      </w:pPr>
+      <w:r>
+        <w:rPr>
+          <w:rFonts w:ascii="Courier New" w:hAnsi="Courier New"/>
+          <w:color w:val="000080"/>
+          <w:sz w:val="17"/>
+        </w:rPr>
+        <w:t xml:space="preserve">        // Without this guard, finalizeScan() overwrites Cancelled -&gt; Completed, contradicting the cancel test assertion.</w:t>
+      </w:r>
+    </w:p>
+    <w:p>
+      <w:pPr>
+        <w:pStyle w:val="NoSpacing"/>
+        <w:ind w:left="567"/>
+        <w:shd w:val="clear" w:color="auto" w:fill="F0F0F0"/>
+      </w:pPr>
+      <w:r>
+        <w:rPr>
+          <w:rFonts w:ascii="Courier New" w:hAnsi="Courier New"/>
+          <w:color w:val="000080"/>
+          <w:sz w:val="17"/>
+        </w:rPr>
+        <w:t xml:space="preserve">        SecScanOrchestrator.finalizeScan(scanRunId);</w:t>
       </w:r>
     </w:p>
     <w:p>
@@ -13105,7 +13422,35 @@
         <w:rPr>
           <w:sz w:val="20"/>
         </w:rPr>
-        <w:t xml:space="preserve"> always non-blank</w:t>
+        <w:t xml:space="preserve"> always populated - if blank (e.g. admin accidentally cleared a CMT field), </w:t>
+      </w:r>
+      <w:r>
+        <w:rPr>
+          <w:rFonts w:ascii="Courier New" w:hAnsi="Courier New"/>
+          <w:color w:val="8B0000"/>
+          <w:sz w:val="20"/>
+        </w:rPr>
+        <w:t>buildFinding()</w:t>
+      </w:r>
+      <w:r>
+        <w:rPr>
+          <w:sz w:val="20"/>
+        </w:rPr>
+        <w:t xml:space="preserve"> sets a fallback: </w:t>
+      </w:r>
+      <w:r>
+        <w:rPr>
+          <w:rFonts w:ascii="Courier New" w:hAnsi="Courier New"/>
+          <w:color w:val="8B0000"/>
+          <w:sz w:val="20"/>
+        </w:rPr>
+        <w:t>"No description available - check SecurityCheckDef__mdt record [CheckId]"</w:t>
+      </w:r>
+      <w:r>
+        <w:rPr>
+          <w:sz w:val="20"/>
+        </w:rPr>
+        <w:t>. This produces a visible finding that points directly at the data problem rather than crashing the entire category with a cryptic runner failure.</w:t>
       </w:r>
     </w:p>
     <w:p>
@@ -14484,7 +14829,48 @@
         <w:rPr>
           <w:sz w:val="20"/>
         </w:rPr>
-        <w:t xml:space="preserve"> lock prevents two simultaneous calls from both passing the check. The 5-minute UI cooldown is client-side only and does not protect against API calls or two browser tabs.</w:t>
+        <w:t xml:space="preserve"> lock prevents two simultaneous calls from both passing the check. The 5-minute UI cooldown is client-side only and does not protect against API calls or two browser tabs. </w:t>
+      </w:r>
+      <w:r>
+        <w:rPr>
+          <w:b/>
+          <w:sz w:val="20"/>
+        </w:rPr>
+        <w:t>V1 known gap:</w:t>
+      </w:r>
+      <w:r>
+        <w:rPr>
+          <w:sz w:val="20"/>
+        </w:rPr>
+        <w:t xml:space="preserve"> </w:t>
+      </w:r>
+      <w:r>
+        <w:rPr>
+          <w:rFonts w:ascii="Courier New" w:hAnsi="Courier New"/>
+          <w:color w:val="8B0000"/>
+          <w:sz w:val="20"/>
+        </w:rPr>
+        <w:t>FOR UPDATE</w:t>
+      </w:r>
+      <w:r>
+        <w:rPr>
+          <w:sz w:val="20"/>
+        </w:rPr>
+        <w:t xml:space="preserve"> only locks existing rows - it cannot prevent concurrent inserts. If two API calls arrive simultaneously when no scan is running (empty locked set), both pass the check and both insert a new run record. This requires sub-second simultaneous execution from two separate API clients; the UI cooldown eliminates the common case. V2 fix: insert the run record first, then query </w:t>
+      </w:r>
+      <w:r>
+        <w:rPr>
+          <w:rFonts w:ascii="Courier New" w:hAnsi="Courier New"/>
+          <w:color w:val="8B0000"/>
+          <w:sz w:val="20"/>
+        </w:rPr>
+        <w:t>SELECT COUNT() FROM SecurityScanRun__c WHERE Status__c IN ('Pending','Running') FOR UPDATE</w:t>
+      </w:r>
+      <w:r>
+        <w:rPr>
+          <w:sz w:val="20"/>
+        </w:rPr>
+        <w:t xml:space="preserve"> - if count &gt; 1, delete the just-inserted record and throw.</w:t>
       </w:r>
     </w:p>
     <w:p>
@@ -15530,7 +15916,7 @@
               <w:rPr>
                 <w:sz w:val="18"/>
               </w:rPr>
-              <w:t xml:space="preserve">Button replaced by spinner "Scan Running...". Progress view shown. Tab strip disabled. Adaptive polling: starts 2s, backs off to 5s after 20s, to 10s after 60s. </w:t>
+              <w:t xml:space="preserve">Button replaced by spinner "Scan Running...". Progress view shown - renders a 13-item checklist of all categories; completed categories ticked (green), failed categories marked red, remaining categories grey. Data from </w:t>
             </w:r>
             <w:r>
               <w:rPr>
@@ -15538,13 +15924,13 @@
                 <w:color w:val="8B0000"/>
                 <w:sz w:val="18"/>
               </w:rPr>
-              <w:t>clearInterval</w:t>
-            </w:r>
-            <w:r>
-              <w:rPr>
-                <w:sz w:val="18"/>
-              </w:rPr>
-              <w:t xml:space="preserve"> on Completed/Failed. v2: replace with </w:t>
+              <w:t>getScanRunStatus().completedCategories</w:t>
+            </w:r>
+            <w:r>
+              <w:rPr>
+                <w:sz w:val="18"/>
+              </w:rPr>
+              <w:t xml:space="preserve"> and </w:t>
             </w:r>
             <w:r>
               <w:rPr>
@@ -15552,13 +15938,13 @@
                 <w:color w:val="8B0000"/>
                 <w:sz w:val="18"/>
               </w:rPr>
-              <w:t>Scan_Progress__e</w:t>
-            </w:r>
-            <w:r>
-              <w:rPr>
-                <w:sz w:val="18"/>
-              </w:rPr>
-              <w:t xml:space="preserve"> Platform Event + </w:t>
+              <w:t>failedCategories</w:t>
+            </w:r>
+            <w:r>
+              <w:rPr>
+                <w:sz w:val="18"/>
+              </w:rPr>
+              <w:t xml:space="preserve"> polled on the adaptive interval. Tab strip disabled. Adaptive polling: starts 2s, backs off to 5s after 20s, to 10s after 60s. </w:t>
             </w:r>
             <w:r>
               <w:rPr>
@@ -15566,6 +15952,34 @@
                 <w:color w:val="8B0000"/>
                 <w:sz w:val="18"/>
               </w:rPr>
+              <w:t>clearInterval</w:t>
+            </w:r>
+            <w:r>
+              <w:rPr>
+                <w:sz w:val="18"/>
+              </w:rPr>
+              <w:t xml:space="preserve"> on Completed/Failed/Cancelled. v2: replace with </w:t>
+            </w:r>
+            <w:r>
+              <w:rPr>
+                <w:rFonts w:ascii="Courier New" w:hAnsi="Courier New"/>
+                <w:color w:val="8B0000"/>
+                <w:sz w:val="18"/>
+              </w:rPr>
+              <w:t>Scan_Progress__e</w:t>
+            </w:r>
+            <w:r>
+              <w:rPr>
+                <w:sz w:val="18"/>
+              </w:rPr>
+              <w:t xml:space="preserve"> Platform Event + </w:t>
+            </w:r>
+            <w:r>
+              <w:rPr>
+                <w:rFonts w:ascii="Courier New" w:hAnsi="Courier New"/>
+                <w:color w:val="8B0000"/>
+                <w:sz w:val="18"/>
+              </w:rPr>
               <w:t>lightning/empApi</w:t>
             </w:r>
             <w:r>
@@ -15681,6 +16095,42 @@
                 <w:sz w:val="18"/>
               </w:rPr>
               <w:t>Warning banner: "Running as a user without full metadata visibility - results may be incomplete."</w:t>
+            </w:r>
+          </w:p>
+        </w:tc>
+      </w:tr>
+      <w:tr>
+        <w:tc>
+          <w:tcPr>
+            <w:tcW w:type="dxa" w:w="4703"/>
+            <w:vAlign w:val="center"/>
+          </w:tcPr>
+          <w:p>
+            <w:pPr>
+              <w:jc w:val="left"/>
+            </w:pPr>
+            <w:r>
+              <w:rPr>
+                <w:sz w:val="18"/>
+              </w:rPr>
+              <w:t>Scan cancelled</w:t>
+            </w:r>
+          </w:p>
+        </w:tc>
+        <w:tc>
+          <w:tcPr>
+            <w:tcW w:type="dxa" w:w="4703"/>
+            <w:vAlign w:val="center"/>
+          </w:tcPr>
+          <w:p>
+            <w:pPr>
+              <w:jc w:val="left"/>
+            </w:pPr>
+            <w:r>
+              <w:rPr>
+                <w:sz w:val="18"/>
+              </w:rPr>
+              <w:t>Amber banner: "Scan was cancelled after [N] of 13 categories. Results are partial." Dashboard shows findings from completed categories. Score ring displays the partial score computed by finalizeScan(). Run button re-enabled immediately - cancelled scans do NOT consume the 5-minute cooldown (admin intentionally stopped the scan and should be able to re-run immediately).</w:t>
             </w:r>
           </w:p>
         </w:tc>
@@ -15839,7 +16289,7 @@
         <w:rPr>
           <w:sz w:val="20"/>
         </w:rPr>
-        <w:t>5-minute cooldown with countdown after scan runs</w:t>
+        <w:t>5-minute cooldown with countdown, starting from scan completion/failure detection (not from button click). If the scan takes 8 minutes, the cooldown expires during the scan and the button is available immediately on completion. Cancelled scans bypass the cooldown entirely - the admin should be able to re-run immediately after cancelling.</w:t>
       </w:r>
     </w:p>
     <w:p>
@@ -15927,7 +16377,200 @@
         <w:rPr>
           <w:sz w:val="20"/>
         </w:rPr>
-        <w:t xml:space="preserve"> - these are the authoritative values for history and export. Storing them prevents retroactive score shifts when CMT deduction weights are later edited. The LWC recalculates score live from the in-memory findings array for instant feedback when an admin changes a finding status to Remediated or False Positive within the current session - but the stored values persist.</w:t>
+        <w:t xml:space="preserve"> - these are the authoritative values for history and export. Storing them prevents retroactive score shifts when CMT deduction weights are later edited.</w:t>
+      </w:r>
+    </w:p>
+    <w:p>
+      <w:r>
+        <w:rPr>
+          <w:b/>
+          <w:sz w:val="20"/>
+        </w:rPr>
+        <w:t>Live score after status changes:</w:t>
+      </w:r>
+      <w:r>
+        <w:rPr>
+          <w:sz w:val="20"/>
+        </w:rPr>
+        <w:t xml:space="preserve"> The LWC does NOT recalculate score from in-memory </w:t>
+      </w:r>
+      <w:r>
+        <w:rPr>
+          <w:rFonts w:ascii="Courier New" w:hAnsi="Courier New"/>
+          <w:color w:val="8B0000"/>
+          <w:sz w:val="20"/>
+        </w:rPr>
+        <w:t>allFindings[]</w:t>
+      </w:r>
+      <w:r>
+        <w:rPr>
+          <w:sz w:val="20"/>
+        </w:rPr>
+        <w:t xml:space="preserve">. Findings are paginated at 100 per page - </w:t>
+      </w:r>
+      <w:r>
+        <w:rPr>
+          <w:rFonts w:ascii="Courier New" w:hAnsi="Courier New"/>
+          <w:color w:val="8B0000"/>
+          <w:sz w:val="20"/>
+        </w:rPr>
+        <w:t>allFindings[]</w:t>
+      </w:r>
+      <w:r>
+        <w:rPr>
+          <w:sz w:val="20"/>
+        </w:rPr>
+        <w:t xml:space="preserve"> only contains loaded pages. Calculating score from a partial array produces a wrong result (e.g. admin loads 100 of 400 findings, marks 3 Critical as Remediated - score recalculated from 100 findings, missing 300 High/Medium/Low findings on pages 2-4).</w:t>
+      </w:r>
+    </w:p>
+    <w:p>
+      <w:r>
+        <w:rPr>
+          <w:sz w:val="20"/>
+        </w:rPr>
+        <w:t xml:space="preserve">Instead: after every </w:t>
+      </w:r>
+      <w:r>
+        <w:rPr>
+          <w:rFonts w:ascii="Courier New" w:hAnsi="Courier New"/>
+          <w:color w:val="8B0000"/>
+          <w:sz w:val="20"/>
+        </w:rPr>
+        <w:t>updateFindingStatus</w:t>
+      </w:r>
+      <w:r>
+        <w:rPr>
+          <w:sz w:val="20"/>
+        </w:rPr>
+        <w:t xml:space="preserve"> or </w:t>
+      </w:r>
+      <w:r>
+        <w:rPr>
+          <w:rFonts w:ascii="Courier New" w:hAnsi="Courier New"/>
+          <w:color w:val="8B0000"/>
+          <w:sz w:val="20"/>
+        </w:rPr>
+        <w:t>bulkUpdateFindingStatus</w:t>
+      </w:r>
+      <w:r>
+        <w:rPr>
+          <w:sz w:val="20"/>
+        </w:rPr>
+        <w:t xml:space="preserve">, the LWC calls </w:t>
+      </w:r>
+      <w:r>
+        <w:rPr>
+          <w:rFonts w:ascii="Courier New" w:hAnsi="Courier New"/>
+          <w:color w:val="8B0000"/>
+          <w:sz w:val="20"/>
+        </w:rPr>
+        <w:t>getScoreCounts(String scanRunId)</w:t>
+      </w:r>
+      <w:r>
+        <w:rPr>
+          <w:sz w:val="20"/>
+        </w:rPr>
+        <w:t xml:space="preserve"> - a lightweight </w:t>
+      </w:r>
+      <w:r>
+        <w:rPr>
+          <w:rFonts w:ascii="Courier New" w:hAnsi="Courier New"/>
+          <w:color w:val="8B0000"/>
+          <w:sz w:val="20"/>
+        </w:rPr>
+        <w:t>@AuraEnabled(cacheable=false)</w:t>
+      </w:r>
+      <w:r>
+        <w:rPr>
+          <w:sz w:val="20"/>
+        </w:rPr>
+        <w:t xml:space="preserve"> method that returns </w:t>
+      </w:r>
+      <w:r>
+        <w:rPr>
+          <w:rFonts w:ascii="Courier New" w:hAnsi="Courier New"/>
+          <w:color w:val="8B0000"/>
+          <w:sz w:val="20"/>
+        </w:rPr>
+        <w:t>{ criticalOpen, highOpen, mediumOpen, lowOpen, infoOpen }</w:t>
+      </w:r>
+      <w:r>
+        <w:rPr>
+          <w:sz w:val="20"/>
+        </w:rPr>
+        <w:t xml:space="preserve"> (counts of findings where </w:t>
+      </w:r>
+      <w:r>
+        <w:rPr>
+          <w:rFonts w:ascii="Courier New" w:hAnsi="Courier New"/>
+          <w:color w:val="8B0000"/>
+          <w:sz w:val="20"/>
+        </w:rPr>
+        <w:t>Status__c NOT IN ('Remediated','False Positive')</w:t>
+      </w:r>
+      <w:r>
+        <w:rPr>
+          <w:sz w:val="20"/>
+        </w:rPr>
+        <w:t>). The LWC applies the CMT deduction formula to these server-side counts. No full page reload required, no in-memory array iteration.</w:t>
+      </w:r>
+    </w:p>
+    <w:p>
+      <w:r>
+        <w:rPr>
+          <w:rFonts w:ascii="Courier New" w:hAnsi="Courier New"/>
+          <w:color w:val="8B0000"/>
+          <w:sz w:val="20"/>
+        </w:rPr>
+        <w:t>getScoreCounts()</w:t>
+      </w:r>
+      <w:r>
+        <w:rPr>
+          <w:sz w:val="20"/>
+        </w:rPr>
+        <w:t xml:space="preserve"> is added to </w:t>
+      </w:r>
+      <w:r>
+        <w:rPr>
+          <w:rFonts w:ascii="Courier New" w:hAnsi="Courier New"/>
+          <w:color w:val="8B0000"/>
+          <w:sz w:val="20"/>
+        </w:rPr>
+        <w:t>SecScanFindingsController</w:t>
+      </w:r>
+      <w:r>
+        <w:rPr>
+          <w:sz w:val="20"/>
+        </w:rPr>
+        <w:t xml:space="preserve">. It is NOT used to update </w:t>
+      </w:r>
+      <w:r>
+        <w:rPr>
+          <w:rFonts w:ascii="Courier New" w:hAnsi="Courier New"/>
+          <w:color w:val="8B0000"/>
+          <w:sz w:val="20"/>
+        </w:rPr>
+        <w:t>Score__c</w:t>
+      </w:r>
+      <w:r>
+        <w:rPr>
+          <w:sz w:val="20"/>
+        </w:rPr>
+        <w:t xml:space="preserve"> on the run record - that value is frozen by </w:t>
+      </w:r>
+      <w:r>
+        <w:rPr>
+          <w:rFonts w:ascii="Courier New" w:hAnsi="Courier New"/>
+          <w:color w:val="8B0000"/>
+          <w:sz w:val="20"/>
+        </w:rPr>
+        <w:t>finalizeScan()</w:t>
+      </w:r>
+      <w:r>
+        <w:rPr>
+          <w:sz w:val="20"/>
+        </w:rPr>
+        <w:t xml:space="preserve"> and only reflects the state at scan completion (correct behavior - prevents retroactive changes).</w:t>
       </w:r>
     </w:p>
     <w:p>
@@ -16766,7 +17409,77 @@
         <w:rPr>
           <w:sz w:val="20"/>
         </w:rPr>
-        <w:t xml:space="preserve"> + count. Click filters Findings Explorer.</w:t>
+        <w:t xml:space="preserve"> + count. Click filters Findings Explorer. Counts are driven by </w:t>
+      </w:r>
+      <w:r>
+        <w:rPr>
+          <w:rFonts w:ascii="Courier New" w:hAnsi="Courier New"/>
+          <w:color w:val="8B0000"/>
+          <w:sz w:val="20"/>
+        </w:rPr>
+        <w:t>getScoreCounts()</w:t>
+      </w:r>
+      <w:r>
+        <w:rPr>
+          <w:sz w:val="20"/>
+        </w:rPr>
+        <w:t xml:space="preserve"> results after any status change (not the </w:t>
+      </w:r>
+      <w:r>
+        <w:rPr>
+          <w:rFonts w:ascii="Courier New" w:hAnsi="Courier New"/>
+          <w:color w:val="8B0000"/>
+          <w:sz w:val="20"/>
+        </w:rPr>
+        <w:t>SecurityScanRun__c</w:t>
+      </w:r>
+      <w:r>
+        <w:rPr>
+          <w:sz w:val="20"/>
+        </w:rPr>
+        <w:t xml:space="preserve"> parent record counts, which are frozen at scan completion). On initial load, derive from the parent record counts; after any </w:t>
+      </w:r>
+      <w:r>
+        <w:rPr>
+          <w:rFonts w:ascii="Courier New" w:hAnsi="Courier New"/>
+          <w:color w:val="8B0000"/>
+          <w:sz w:val="20"/>
+        </w:rPr>
+        <w:t>updateFindingStatus</w:t>
+      </w:r>
+      <w:r>
+        <w:rPr>
+          <w:sz w:val="20"/>
+        </w:rPr>
+        <w:t xml:space="preserve"> / </w:t>
+      </w:r>
+      <w:r>
+        <w:rPr>
+          <w:rFonts w:ascii="Courier New" w:hAnsi="Courier New"/>
+          <w:color w:val="8B0000"/>
+          <w:sz w:val="20"/>
+        </w:rPr>
+        <w:t>bulkUpdateFindingStatus</w:t>
+      </w:r>
+      <w:r>
+        <w:rPr>
+          <w:sz w:val="20"/>
+        </w:rPr>
+        <w:t xml:space="preserve">, refresh from </w:t>
+      </w:r>
+      <w:r>
+        <w:rPr>
+          <w:rFonts w:ascii="Courier New" w:hAnsi="Courier New"/>
+          <w:color w:val="8B0000"/>
+          <w:sz w:val="20"/>
+        </w:rPr>
+        <w:t>getScoreCounts()</w:t>
+      </w:r>
+      <w:r>
+        <w:rPr>
+          <w:sz w:val="20"/>
+        </w:rPr>
+        <w:t>.</w:t>
       </w:r>
     </w:p>
     <w:p>
@@ -16784,7 +17497,7 @@
         <w:rPr>
           <w:sz w:val="20"/>
         </w:rPr>
-        <w:t>: 3-tile grid - Open / Critical / Pending Recommendations. Each clickable.</w:t>
+        <w:t>: 3-tile grid - Open / Critical / Pending Recommendations. Each clickable. Same data source rule as Severity Breakdown.</w:t>
       </w:r>
     </w:p>
     <w:p>
@@ -16802,7 +17515,35 @@
         <w:rPr>
           <w:sz w:val="20"/>
         </w:rPr>
-        <w:t>: Table comparing this scan vs last, delta arrows color-coded.</w:t>
+        <w:t xml:space="preserve">: Table comparing this scan vs the previous scan, delta arrows color-coded. Data source: </w:t>
+      </w:r>
+      <w:r>
+        <w:rPr>
+          <w:rFonts w:ascii="Courier New" w:hAnsi="Courier New"/>
+          <w:color w:val="8B0000"/>
+          <w:sz w:val="20"/>
+        </w:rPr>
+        <w:t>getScanRuns()</w:t>
+      </w:r>
+      <w:r>
+        <w:rPr>
+          <w:sz w:val="20"/>
+        </w:rPr>
+        <w:t xml:space="preserve"> already returns the full scan list. The LWC selects the most recent Completed run with the same </w:t>
+      </w:r>
+      <w:r>
+        <w:rPr>
+          <w:rFonts w:ascii="Courier New" w:hAnsi="Courier New"/>
+          <w:color w:val="8B0000"/>
+          <w:sz w:val="20"/>
+        </w:rPr>
+        <w:t>OrgId__c</w:t>
+      </w:r>
+      <w:r>
+        <w:rPr>
+          <w:sz w:val="20"/>
+        </w:rPr>
+        <w:t xml:space="preserve"> as the current run (handles sandbox refresh - do not compare across orgs). Columns: per-severity count delta and score delta. Null-safe: first scan has no previous - render "No previous scan" placeholder. No new Apex method required.</w:t>
       </w:r>
     </w:p>
     <w:p>
@@ -16968,7 +17709,7 @@
         <w:rPr>
           <w:sz w:val="20"/>
         </w:rPr>
-        <w:t>Search box (debounced 300ms) across name, description, component</w:t>
+        <w:t>Search box (debounced 300ms) - see text search spec below</w:t>
       </w:r>
     </w:p>
     <w:p>
@@ -17043,6 +17784,232 @@
           <w:b/>
           <w:sz w:val="20"/>
         </w:rPr>
+        <w:t>Filter change rule:</w:t>
+      </w:r>
+      <w:r>
+        <w:rPr>
+          <w:sz w:val="20"/>
+        </w:rPr>
+        <w:t xml:space="preserve"> When any filter value changes (category, severity, status, or search term), the LWC must reset </w:t>
+      </w:r>
+      <w:r>
+        <w:rPr>
+          <w:rFonts w:ascii="Courier New" w:hAnsi="Courier New"/>
+          <w:color w:val="8B0000"/>
+          <w:sz w:val="20"/>
+        </w:rPr>
+        <w:t>lastSeenId = null</w:t>
+      </w:r>
+      <w:r>
+        <w:rPr>
+          <w:sz w:val="20"/>
+        </w:rPr>
+        <w:t xml:space="preserve">, </w:t>
+      </w:r>
+      <w:r>
+        <w:rPr>
+          <w:rFonts w:ascii="Courier New" w:hAnsi="Courier New"/>
+          <w:color w:val="8B0000"/>
+          <w:sz w:val="20"/>
+        </w:rPr>
+        <w:t>lastRank = null</w:t>
+      </w:r>
+      <w:r>
+        <w:rPr>
+          <w:sz w:val="20"/>
+        </w:rPr>
+        <w:t xml:space="preserve">, and clear </w:t>
+      </w:r>
+      <w:r>
+        <w:rPr>
+          <w:rFonts w:ascii="Courier New" w:hAnsi="Courier New"/>
+          <w:color w:val="8B0000"/>
+          <w:sz w:val="20"/>
+        </w:rPr>
+        <w:t>allFindings[]</w:t>
+      </w:r>
+      <w:r>
+        <w:rPr>
+          <w:sz w:val="20"/>
+        </w:rPr>
+        <w:t xml:space="preserve"> before calling </w:t>
+      </w:r>
+      <w:r>
+        <w:rPr>
+          <w:rFonts w:ascii="Courier New" w:hAnsi="Courier New"/>
+          <w:color w:val="8B0000"/>
+          <w:sz w:val="20"/>
+        </w:rPr>
+        <w:t>getCurrentScanFindings</w:t>
+      </w:r>
+      <w:r>
+        <w:rPr>
+          <w:sz w:val="20"/>
+        </w:rPr>
+        <w:t>. The KEYSET cursor values reference a specific finding by rank + ID in the unfiltered result set. Reusing a stale cursor with a different filter set produces skipped records or wrong results (e.g. cursor from finding #200 unfiltered points to a finding that does not exist in the "Guest User" filtered subset).</w:t>
+      </w:r>
+    </w:p>
+    <w:p>
+      <w:r>
+        <w:rPr>
+          <w:b/>
+          <w:sz w:val="20"/>
+        </w:rPr>
+        <w:t>Text search spec (Issue 3):</w:t>
+      </w:r>
+      <w:r>
+        <w:rPr>
+          <w:sz w:val="20"/>
+        </w:rPr>
+        <w:t xml:space="preserve"> Search runs server-side via dynamic SOQL </w:t>
+      </w:r>
+      <w:r>
+        <w:rPr>
+          <w:rFonts w:ascii="Courier New" w:hAnsi="Courier New"/>
+          <w:color w:val="8B0000"/>
+          <w:sz w:val="20"/>
+        </w:rPr>
+        <w:t>LIKE</w:t>
+      </w:r>
+      <w:r>
+        <w:rPr>
+          <w:sz w:val="20"/>
+        </w:rPr>
+        <w:t xml:space="preserve"> clause added to </w:t>
+      </w:r>
+      <w:r>
+        <w:rPr>
+          <w:rFonts w:ascii="Courier New" w:hAnsi="Courier New"/>
+          <w:color w:val="8B0000"/>
+          <w:sz w:val="20"/>
+        </w:rPr>
+        <w:t>getCurrentScanFindings</w:t>
+      </w:r>
+      <w:r>
+        <w:rPr>
+          <w:sz w:val="20"/>
+        </w:rPr>
+        <w:t xml:space="preserve">. Fields searched: </w:t>
+      </w:r>
+      <w:r>
+        <w:rPr>
+          <w:rFonts w:ascii="Courier New" w:hAnsi="Courier New"/>
+          <w:color w:val="8B0000"/>
+          <w:sz w:val="20"/>
+        </w:rPr>
+        <w:t>CheckName__c</w:t>
+      </w:r>
+      <w:r>
+        <w:rPr>
+          <w:sz w:val="20"/>
+        </w:rPr>
+        <w:t xml:space="preserve"> (Text 255) and </w:t>
+      </w:r>
+      <w:r>
+        <w:rPr>
+          <w:rFonts w:ascii="Courier New" w:hAnsi="Courier New"/>
+          <w:color w:val="8B0000"/>
+          <w:sz w:val="20"/>
+        </w:rPr>
+        <w:t>AffectedComponent__c</w:t>
+      </w:r>
+      <w:r>
+        <w:rPr>
+          <w:sz w:val="20"/>
+        </w:rPr>
+        <w:t xml:space="preserve"> (Text 255) only. </w:t>
+      </w:r>
+      <w:r>
+        <w:rPr>
+          <w:rFonts w:ascii="Courier New" w:hAnsi="Courier New"/>
+          <w:color w:val="8B0000"/>
+          <w:sz w:val="20"/>
+        </w:rPr>
+        <w:t>Description__c</w:t>
+      </w:r>
+      <w:r>
+        <w:rPr>
+          <w:sz w:val="20"/>
+        </w:rPr>
+        <w:t xml:space="preserve"> is excluded from SOQL search - LIKE on a 32KB LongTextArea performs a full table scan even within the ScanRun__c predicate; at 9,000+ findings this is unacceptably slow. Clause: </w:t>
+      </w:r>
+      <w:r>
+        <w:rPr>
+          <w:rFonts w:ascii="Courier New" w:hAnsi="Courier New"/>
+          <w:color w:val="8B0000"/>
+          <w:sz w:val="20"/>
+        </w:rPr>
+        <w:t>AND (CheckName__c LIKE :searchPattern OR AffectedComponent__c LIKE :searchPattern)</w:t>
+      </w:r>
+      <w:r>
+        <w:rPr>
+          <w:sz w:val="20"/>
+        </w:rPr>
+        <w:t xml:space="preserve"> where </w:t>
+      </w:r>
+      <w:r>
+        <w:rPr>
+          <w:rFonts w:ascii="Courier New" w:hAnsi="Courier New"/>
+          <w:color w:val="8B0000"/>
+          <w:sz w:val="20"/>
+        </w:rPr>
+        <w:t>searchPattern = '%' + String.escapeSingleQuotes(term) + '%'</w:t>
+      </w:r>
+      <w:r>
+        <w:rPr>
+          <w:sz w:val="20"/>
+        </w:rPr>
+        <w:t xml:space="preserve">. As a secondary pass, the LWC filters loaded records client-side against </w:t>
+      </w:r>
+      <w:r>
+        <w:rPr>
+          <w:rFonts w:ascii="Courier New" w:hAnsi="Courier New"/>
+          <w:color w:val="8B0000"/>
+          <w:sz w:val="20"/>
+        </w:rPr>
+        <w:t>Description__c</w:t>
+      </w:r>
+      <w:r>
+        <w:rPr>
+          <w:sz w:val="20"/>
+        </w:rPr>
+        <w:t xml:space="preserve"> for admins who expect description matching. </w:t>
+      </w:r>
+      <w:r>
+        <w:rPr>
+          <w:rFonts w:ascii="Courier New" w:hAnsi="Courier New"/>
+          <w:color w:val="8B0000"/>
+          <w:sz w:val="20"/>
+        </w:rPr>
+        <w:t>getCurrentScanFindings</w:t>
+      </w:r>
+      <w:r>
+        <w:rPr>
+          <w:sz w:val="20"/>
+        </w:rPr>
+        <w:t xml:space="preserve"> signature gains an optional </w:t>
+      </w:r>
+      <w:r>
+        <w:rPr>
+          <w:rFonts w:ascii="Courier New" w:hAnsi="Courier New"/>
+          <w:color w:val="8B0000"/>
+          <w:sz w:val="20"/>
+        </w:rPr>
+        <w:t>String searchTerm</w:t>
+      </w:r>
+      <w:r>
+        <w:rPr>
+          <w:sz w:val="20"/>
+        </w:rPr>
+        <w:t xml:space="preserve"> parameter (null = no text filter).</w:t>
+      </w:r>
+    </w:p>
+    <w:p>
+      <w:r>
+        <w:rPr>
+          <w:b/>
+          <w:sz w:val="20"/>
+        </w:rPr>
         <w:t>Findings List:</w:t>
       </w:r>
     </w:p>
@@ -17453,7 +18420,49 @@
         <w:rPr>
           <w:sz w:val="20"/>
         </w:rPr>
-        <w:t xml:space="preserve"> Close X | Prev/Next navigation "Finding 3 of 47" | Check Name | Severity badge | Type pill</w:t>
+        <w:t xml:space="preserve"> Close X | Prev/Next navigation "Finding 3 of [TotalFindings__c]" | Check Name | Severity badge | Type pill. The denominator uses </w:t>
+      </w:r>
+      <w:r>
+        <w:rPr>
+          <w:rFonts w:ascii="Courier New" w:hAnsi="Courier New"/>
+          <w:color w:val="8B0000"/>
+          <w:sz w:val="20"/>
+        </w:rPr>
+        <w:t>TotalFindings__c</w:t>
+      </w:r>
+      <w:r>
+        <w:rPr>
+          <w:sz w:val="20"/>
+        </w:rPr>
+        <w:t xml:space="preserve"> from the parent </w:t>
+      </w:r>
+      <w:r>
+        <w:rPr>
+          <w:rFonts w:ascii="Courier New" w:hAnsi="Courier New"/>
+          <w:color w:val="8B0000"/>
+          <w:sz w:val="20"/>
+        </w:rPr>
+        <w:t>SecurityScanRun__c</w:t>
+      </w:r>
+      <w:r>
+        <w:rPr>
+          <w:sz w:val="20"/>
+        </w:rPr>
+        <w:t xml:space="preserve"> - not </w:t>
+      </w:r>
+      <w:r>
+        <w:rPr>
+          <w:rFonts w:ascii="Courier New" w:hAnsi="Courier New"/>
+          <w:color w:val="8B0000"/>
+          <w:sz w:val="20"/>
+        </w:rPr>
+        <w:t>allFindings[].length</w:t>
+      </w:r>
+      <w:r>
+        <w:rPr>
+          <w:sz w:val="20"/>
+        </w:rPr>
+        <w:t>, which changes as the admin loads more pages. When the admin reaches the last loaded finding before all pages are fetched, show "Load more findings to continue" in place of the Next button instead of disabling it silently.</w:t>
       </w:r>
     </w:p>
     <w:p>
@@ -17690,6 +18699,80 @@
           <w:sz w:val="20"/>
         </w:rPr>
         <w:t>Note field (required for Risk Accepted and False Positive)</w:t>
+      </w:r>
+    </w:p>
+    <w:p>
+      <w:pPr>
+        <w:pStyle w:val="ListBullet"/>
+      </w:pPr>
+      <w:r>
+        <w:rPr>
+          <w:b/>
+          <w:sz w:val="20"/>
+        </w:rPr>
+        <w:t>Submit button debounce:</w:t>
+      </w:r>
+      <w:r>
+        <w:rPr>
+          <w:sz w:val="20"/>
+        </w:rPr>
+        <w:t xml:space="preserve"> After clicking Save, disable the status form buttons for the duration of the </w:t>
+      </w:r>
+      <w:r>
+        <w:rPr>
+          <w:rFonts w:ascii="Courier New" w:hAnsi="Courier New"/>
+          <w:color w:val="8B0000"/>
+          <w:sz w:val="20"/>
+        </w:rPr>
+        <w:t>updateFindingStatus</w:t>
+      </w:r>
+      <w:r>
+        <w:rPr>
+          <w:sz w:val="20"/>
+        </w:rPr>
+        <w:t xml:space="preserve"> call + </w:t>
+      </w:r>
+      <w:r>
+        <w:rPr>
+          <w:rFonts w:ascii="Courier New" w:hAnsi="Courier New"/>
+          <w:color w:val="8B0000"/>
+          <w:sz w:val="20"/>
+        </w:rPr>
+        <w:t>refreshApex</w:t>
+      </w:r>
+      <w:r>
+        <w:rPr>
+          <w:sz w:val="20"/>
+        </w:rPr>
+        <w:t xml:space="preserve"> cycle (typically 1-2 seconds). Without this, rapid Prev/Next + Save clicks produce near-simultaneous Apex calls - each triggers its own </w:t>
+      </w:r>
+      <w:r>
+        <w:rPr>
+          <w:rFonts w:ascii="Courier New" w:hAnsi="Courier New"/>
+          <w:color w:val="8B0000"/>
+          <w:sz w:val="20"/>
+        </w:rPr>
+        <w:t>refreshApex</w:t>
+      </w:r>
+      <w:r>
+        <w:rPr>
+          <w:sz w:val="20"/>
+        </w:rPr>
+        <w:t xml:space="preserve"> on </w:t>
+      </w:r>
+      <w:r>
+        <w:rPr>
+          <w:rFonts w:ascii="Courier New" w:hAnsi="Courier New"/>
+          <w:color w:val="8B0000"/>
+          <w:sz w:val="20"/>
+        </w:rPr>
+        <w:t>getFindingDetail</w:t>
+      </w:r>
+      <w:r>
+        <w:rPr>
+          <w:sz w:val="20"/>
+        </w:rPr>
+        <w:t>, causing a flicker storm and potentially hitting the 25 concurrent long-running requests per user limit in some Salesforce editions.</w:t>
       </w:r>
     </w:p>
     <w:p>
@@ -18688,7 +19771,77 @@
         <w:rPr>
           <w:sz w:val="20"/>
         </w:rPr>
-        <w:t xml:space="preserve"> immutably -&gt; all children re-render from props. No child mutates data directly.</w:t>
+        <w:t xml:space="preserve"> immutably -&gt; all children re-render from props. No child mutates data directly. After status mutations, also calls </w:t>
+      </w:r>
+      <w:r>
+        <w:rPr>
+          <w:rFonts w:ascii="Courier New" w:hAnsi="Courier New"/>
+          <w:color w:val="8B0000"/>
+          <w:sz w:val="20"/>
+        </w:rPr>
+        <w:t>getScoreCounts()</w:t>
+      </w:r>
+      <w:r>
+        <w:rPr>
+          <w:sz w:val="20"/>
+        </w:rPr>
+        <w:t xml:space="preserve"> to refresh both (1) the live score ring and (2) the Left Panel severity breakdown and Quick Stats - these come from </w:t>
+      </w:r>
+      <w:r>
+        <w:rPr>
+          <w:rFonts w:ascii="Courier New" w:hAnsi="Courier New"/>
+          <w:color w:val="8B0000"/>
+          <w:sz w:val="20"/>
+        </w:rPr>
+        <w:t>getScoreCounts()</w:t>
+      </w:r>
+      <w:r>
+        <w:rPr>
+          <w:sz w:val="20"/>
+        </w:rPr>
+        <w:t xml:space="preserve"> results after any status change, not from the </w:t>
+      </w:r>
+      <w:r>
+        <w:rPr>
+          <w:rFonts w:ascii="Courier New" w:hAnsi="Courier New"/>
+          <w:color w:val="8B0000"/>
+          <w:sz w:val="20"/>
+        </w:rPr>
+        <w:t>SecurityScanRun__c</w:t>
+      </w:r>
+      <w:r>
+        <w:rPr>
+          <w:sz w:val="20"/>
+        </w:rPr>
+        <w:t xml:space="preserve"> parent record counts which are set once by </w:t>
+      </w:r>
+      <w:r>
+        <w:rPr>
+          <w:rFonts w:ascii="Courier New" w:hAnsi="Courier New"/>
+          <w:color w:val="8B0000"/>
+          <w:sz w:val="20"/>
+        </w:rPr>
+        <w:t>finalizeScan()</w:t>
+      </w:r>
+      <w:r>
+        <w:rPr>
+          <w:sz w:val="20"/>
+        </w:rPr>
+        <w:t xml:space="preserve"> and never updated. The parent record counts represent the "at scan completion" snapshot; live counts come from </w:t>
+      </w:r>
+      <w:r>
+        <w:rPr>
+          <w:rFonts w:ascii="Courier New" w:hAnsi="Courier New"/>
+          <w:color w:val="8B0000"/>
+          <w:sz w:val="20"/>
+        </w:rPr>
+        <w:t>getScoreCounts()</w:t>
+      </w:r>
+      <w:r>
+        <w:rPr>
+          <w:sz w:val="20"/>
+        </w:rPr>
+        <w:t>.</w:t>
       </w:r>
     </w:p>
     <w:p>
@@ -19679,6 +20832,20 @@
           <w:color w:val="8B0000"/>
           <w:sz w:val="20"/>
         </w:rPr>
+        <w:t>getScoreCounts</w:t>
+      </w:r>
+      <w:r>
+        <w:rPr>
+          <w:sz w:val="20"/>
+        </w:rPr>
+        <w:t xml:space="preserve"> (called after every status mutation - drives both live score ring AND Left Panel severity counts), </w:t>
+      </w:r>
+      <w:r>
+        <w:rPr>
+          <w:rFonts w:ascii="Courier New" w:hAnsi="Courier New"/>
+          <w:color w:val="8B0000"/>
+          <w:sz w:val="20"/>
+        </w:rPr>
         <w:t>runSecurityScan</w:t>
       </w:r>
       <w:r>
@@ -20441,7 +21608,7 @@
           <w:color w:val="8B0000"/>
           <w:sz w:val="20"/>
         </w:rPr>
-        <w:t>{ status, failedCategories, isPartialScan }</w:t>
+        <w:t>{ status, failedCategories, completedCategories, isPartialScan }</w:t>
       </w:r>
       <w:r>
         <w:rPr>
@@ -20461,6 +21628,714 @@
         <w:rPr>
           <w:sz w:val="20"/>
         </w:rPr>
+        <w:t xml:space="preserve">. </w:t>
+      </w:r>
+      <w:r>
+        <w:rPr>
+          <w:rFonts w:ascii="Courier New" w:hAnsi="Courier New"/>
+          <w:color w:val="8B0000"/>
+          <w:sz w:val="20"/>
+        </w:rPr>
+        <w:t>completedCategories</w:t>
+      </w:r>
+      <w:r>
+        <w:rPr>
+          <w:sz w:val="20"/>
+        </w:rPr>
+        <w:t xml:space="preserve"> is the value of </w:t>
+      </w:r>
+      <w:r>
+        <w:rPr>
+          <w:rFonts w:ascii="Courier New" w:hAnsi="Courier New"/>
+          <w:color w:val="8B0000"/>
+          <w:sz w:val="20"/>
+        </w:rPr>
+        <w:t>CompletedCategories__c</w:t>
+      </w:r>
+      <w:r>
+        <w:rPr>
+          <w:sz w:val="20"/>
+        </w:rPr>
+        <w:t xml:space="preserve"> - used by the scan progress view to tick completed categories in the 13-item checklist.</w:t>
+      </w:r>
+    </w:p>
+    <w:p>
+      <w:pPr>
+        <w:pStyle w:val="ListBullet"/>
+      </w:pPr>
+      <w:r>
+        <w:rPr>
+          <w:rFonts w:ascii="Courier New" w:hAnsi="Courier New"/>
+          <w:color w:val="8B0000"/>
+          <w:sz w:val="20"/>
+        </w:rPr>
+        <w:t>cancelScan(String scanRunId)</w:t>
+      </w:r>
+      <w:r>
+        <w:rPr>
+          <w:sz w:val="20"/>
+        </w:rPr>
+        <w:t xml:space="preserve"> - NOT cacheable (mutation). Sets </w:t>
+      </w:r>
+      <w:r>
+        <w:rPr>
+          <w:rFonts w:ascii="Courier New" w:hAnsi="Courier New"/>
+          <w:color w:val="8B0000"/>
+          <w:sz w:val="20"/>
+        </w:rPr>
+        <w:t>Status__c = 'Cancelled'</w:t>
+      </w:r>
+      <w:r>
+        <w:rPr>
+          <w:sz w:val="20"/>
+        </w:rPr>
+        <w:t xml:space="preserve">. The running Queueable chain cannot be aborted externally - each </w:t>
+      </w:r>
+      <w:r>
+        <w:rPr>
+          <w:rFonts w:ascii="Courier New" w:hAnsi="Courier New"/>
+          <w:color w:val="8B0000"/>
+          <w:sz w:val="20"/>
+        </w:rPr>
+        <w:t>SecScanRunnerChain.execute()</w:t>
+      </w:r>
+      <w:r>
+        <w:rPr>
+          <w:sz w:val="20"/>
+        </w:rPr>
+        <w:t xml:space="preserve"> checks </w:t>
+      </w:r>
+      <w:r>
+        <w:rPr>
+          <w:rFonts w:ascii="Courier New" w:hAnsi="Courier New"/>
+          <w:color w:val="8B0000"/>
+          <w:sz w:val="20"/>
+        </w:rPr>
+        <w:t>Status__c</w:t>
+      </w:r>
+      <w:r>
+        <w:rPr>
+          <w:sz w:val="20"/>
+        </w:rPr>
+        <w:t xml:space="preserve"> at the start of its transaction; if Cancelled, it skips the current category and does not enqueue the next link. The scan halts at the next category boundary, not immediately.</w:t>
+      </w:r>
+    </w:p>
+    <w:p>
+      <w:pPr>
+        <w:pStyle w:val="ListBullet"/>
+      </w:pPr>
+      <w:r>
+        <w:rPr>
+          <w:rFonts w:ascii="Courier New" w:hAnsi="Courier New"/>
+          <w:color w:val="8B0000"/>
+          <w:sz w:val="20"/>
+        </w:rPr>
+        <w:t>exportFindingsCsv(String scanRunId)</w:t>
+      </w:r>
+      <w:r>
+        <w:rPr>
+          <w:sz w:val="20"/>
+        </w:rPr>
+        <w:t xml:space="preserve"> - NOT cacheable (mutation). Generates CSV from findings. Creates </w:t>
+      </w:r>
+      <w:r>
+        <w:rPr>
+          <w:rFonts w:ascii="Courier New" w:hAnsi="Courier New"/>
+          <w:color w:val="8B0000"/>
+          <w:sz w:val="20"/>
+        </w:rPr>
+        <w:t>ContentVersion</w:t>
+      </w:r>
+      <w:r>
+        <w:rPr>
+          <w:sz w:val="20"/>
+        </w:rPr>
+        <w:t xml:space="preserve"> with the CSV body. Creates </w:t>
+      </w:r>
+      <w:r>
+        <w:rPr>
+          <w:rFonts w:ascii="Courier New" w:hAnsi="Courier New"/>
+          <w:color w:val="8B0000"/>
+          <w:sz w:val="20"/>
+        </w:rPr>
+        <w:t>ContentDocumentLink</w:t>
+      </w:r>
+      <w:r>
+        <w:rPr>
+          <w:sz w:val="20"/>
+        </w:rPr>
+        <w:t xml:space="preserve"> with </w:t>
+      </w:r>
+      <w:r>
+        <w:rPr>
+          <w:rFonts w:ascii="Courier New" w:hAnsi="Courier New"/>
+          <w:color w:val="8B0000"/>
+          <w:sz w:val="20"/>
+        </w:rPr>
+        <w:t>ShareType = 'I'</w:t>
+      </w:r>
+      <w:r>
+        <w:rPr>
+          <w:sz w:val="20"/>
+        </w:rPr>
+        <w:t xml:space="preserve"> (Inferred from parent) and </w:t>
+      </w:r>
+      <w:r>
+        <w:rPr>
+          <w:rFonts w:ascii="Courier New" w:hAnsi="Courier New"/>
+          <w:color w:val="8B0000"/>
+          <w:sz w:val="20"/>
+        </w:rPr>
+        <w:t>Visibility = 'InternalUsers'</w:t>
+      </w:r>
+      <w:r>
+        <w:rPr>
+          <w:sz w:val="20"/>
+        </w:rPr>
+        <w:t xml:space="preserve">. Returns </w:t>
+      </w:r>
+      <w:r>
+        <w:rPr>
+          <w:rFonts w:ascii="Courier New" w:hAnsi="Courier New"/>
+          <w:color w:val="8B0000"/>
+          <w:sz w:val="20"/>
+        </w:rPr>
+        <w:t>ContentDocumentId</w:t>
+      </w:r>
+      <w:r>
+        <w:rPr>
+          <w:sz w:val="20"/>
+        </w:rPr>
+        <w:t xml:space="preserve">. Never returns raw String. CSV columns (in order): </w:t>
+      </w:r>
+      <w:r>
+        <w:rPr>
+          <w:rFonts w:ascii="Courier New" w:hAnsi="Courier New"/>
+          <w:color w:val="8B0000"/>
+          <w:sz w:val="20"/>
+        </w:rPr>
+        <w:t>CheckId</w:t>
+      </w:r>
+      <w:r>
+        <w:rPr>
+          <w:sz w:val="20"/>
+        </w:rPr>
+        <w:t xml:space="preserve">, </w:t>
+      </w:r>
+      <w:r>
+        <w:rPr>
+          <w:rFonts w:ascii="Courier New" w:hAnsi="Courier New"/>
+          <w:color w:val="8B0000"/>
+          <w:sz w:val="20"/>
+        </w:rPr>
+        <w:t>CheckName</w:t>
+      </w:r>
+      <w:r>
+        <w:rPr>
+          <w:sz w:val="20"/>
+        </w:rPr>
+        <w:t xml:space="preserve">, </w:t>
+      </w:r>
+      <w:r>
+        <w:rPr>
+          <w:rFonts w:ascii="Courier New" w:hAnsi="Courier New"/>
+          <w:color w:val="8B0000"/>
+          <w:sz w:val="20"/>
+        </w:rPr>
+        <w:t>Category</w:t>
+      </w:r>
+      <w:r>
+        <w:rPr>
+          <w:sz w:val="20"/>
+        </w:rPr>
+        <w:t xml:space="preserve">, </w:t>
+      </w:r>
+      <w:r>
+        <w:rPr>
+          <w:rFonts w:ascii="Courier New" w:hAnsi="Courier New"/>
+          <w:color w:val="8B0000"/>
+          <w:sz w:val="20"/>
+        </w:rPr>
+        <w:t>Severity</w:t>
+      </w:r>
+      <w:r>
+        <w:rPr>
+          <w:sz w:val="20"/>
+        </w:rPr>
+        <w:t xml:space="preserve">, </w:t>
+      </w:r>
+      <w:r>
+        <w:rPr>
+          <w:rFonts w:ascii="Courier New" w:hAnsi="Courier New"/>
+          <w:color w:val="8B0000"/>
+          <w:sz w:val="20"/>
+        </w:rPr>
+        <w:t>FindingType</w:t>
+      </w:r>
+      <w:r>
+        <w:rPr>
+          <w:sz w:val="20"/>
+        </w:rPr>
+        <w:t xml:space="preserve">, </w:t>
+      </w:r>
+      <w:r>
+        <w:rPr>
+          <w:rFonts w:ascii="Courier New" w:hAnsi="Courier New"/>
+          <w:color w:val="8B0000"/>
+          <w:sz w:val="20"/>
+        </w:rPr>
+        <w:t>Status</w:t>
+      </w:r>
+      <w:r>
+        <w:rPr>
+          <w:sz w:val="20"/>
+        </w:rPr>
+        <w:t xml:space="preserve">, </w:t>
+      </w:r>
+      <w:r>
+        <w:rPr>
+          <w:rFonts w:ascii="Courier New" w:hAnsi="Courier New"/>
+          <w:color w:val="8B0000"/>
+          <w:sz w:val="20"/>
+        </w:rPr>
+        <w:t>AffectedComponent</w:t>
+      </w:r>
+      <w:r>
+        <w:rPr>
+          <w:sz w:val="20"/>
+        </w:rPr>
+        <w:t xml:space="preserve">, </w:t>
+      </w:r>
+      <w:r>
+        <w:rPr>
+          <w:rFonts w:ascii="Courier New" w:hAnsi="Courier New"/>
+          <w:color w:val="8B0000"/>
+          <w:sz w:val="20"/>
+        </w:rPr>
+        <w:t>AffectedComponentType</w:t>
+      </w:r>
+      <w:r>
+        <w:rPr>
+          <w:sz w:val="20"/>
+        </w:rPr>
+        <w:t xml:space="preserve">, </w:t>
+      </w:r>
+      <w:r>
+        <w:rPr>
+          <w:rFonts w:ascii="Courier New" w:hAnsi="Courier New"/>
+          <w:color w:val="8B0000"/>
+          <w:sz w:val="20"/>
+        </w:rPr>
+        <w:t>Description</w:t>
+      </w:r>
+      <w:r>
+        <w:rPr>
+          <w:sz w:val="20"/>
+        </w:rPr>
+        <w:t xml:space="preserve">, </w:t>
+      </w:r>
+      <w:r>
+        <w:rPr>
+          <w:rFonts w:ascii="Courier New" w:hAnsi="Courier New"/>
+          <w:color w:val="8B0000"/>
+          <w:sz w:val="20"/>
+        </w:rPr>
+        <w:t>Impact</w:t>
+      </w:r>
+      <w:r>
+        <w:rPr>
+          <w:sz w:val="20"/>
+        </w:rPr>
+        <w:t xml:space="preserve">, </w:t>
+      </w:r>
+      <w:r>
+        <w:rPr>
+          <w:rFonts w:ascii="Courier New" w:hAnsi="Courier New"/>
+          <w:color w:val="8B0000"/>
+          <w:sz w:val="20"/>
+        </w:rPr>
+        <w:t>Remediation</w:t>
+      </w:r>
+      <w:r>
+        <w:rPr>
+          <w:sz w:val="20"/>
+        </w:rPr>
+        <w:t xml:space="preserve">, </w:t>
+      </w:r>
+      <w:r>
+        <w:rPr>
+          <w:rFonts w:ascii="Courier New" w:hAnsi="Courier New"/>
+          <w:color w:val="8B0000"/>
+          <w:sz w:val="20"/>
+        </w:rPr>
+        <w:t>AcknowledgedBy</w:t>
+      </w:r>
+      <w:r>
+        <w:rPr>
+          <w:sz w:val="20"/>
+        </w:rPr>
+        <w:t xml:space="preserve"> (user name, not ID), </w:t>
+      </w:r>
+      <w:r>
+        <w:rPr>
+          <w:rFonts w:ascii="Courier New" w:hAnsi="Courier New"/>
+          <w:color w:val="8B0000"/>
+          <w:sz w:val="20"/>
+        </w:rPr>
+        <w:t>AcknowledgedDate</w:t>
+      </w:r>
+      <w:r>
+        <w:rPr>
+          <w:sz w:val="20"/>
+        </w:rPr>
+        <w:t xml:space="preserve">, </w:t>
+      </w:r>
+      <w:r>
+        <w:rPr>
+          <w:rFonts w:ascii="Courier New" w:hAnsi="Courier New"/>
+          <w:color w:val="8B0000"/>
+          <w:sz w:val="20"/>
+        </w:rPr>
+        <w:t>SalesforceDocUrl</w:t>
+      </w:r>
+      <w:r>
+        <w:rPr>
+          <w:sz w:val="20"/>
+        </w:rPr>
+        <w:t xml:space="preserve">. Header row uses field labels. </w:t>
+      </w:r>
+      <w:r>
+        <w:rPr>
+          <w:rFonts w:ascii="Courier New" w:hAnsi="Courier New"/>
+          <w:color w:val="8B0000"/>
+          <w:sz w:val="20"/>
+        </w:rPr>
+        <w:t>RawEvidence__c</w:t>
+      </w:r>
+      <w:r>
+        <w:rPr>
+          <w:sz w:val="20"/>
+        </w:rPr>
+        <w:t xml:space="preserve"> excluded (too large, scrubbed - admins use the detail panel for evidence). CSV encoding: RFC 4180 compliant - fields containing commas, double quotes, or newlines are enclosed in double quotes; double quotes within field values are escaped as two consecutive double quotes (</w:t>
+      </w:r>
+      <w:r>
+        <w:rPr>
+          <w:rFonts w:ascii="Courier New" w:hAnsi="Courier New"/>
+          <w:color w:val="8B0000"/>
+          <w:sz w:val="20"/>
+        </w:rPr>
+        <w:t>""</w:t>
+      </w:r>
+      <w:r>
+        <w:rPr>
+          <w:sz w:val="20"/>
+        </w:rPr>
+        <w:t xml:space="preserve">). </w:t>
+      </w:r>
+      <w:r>
+        <w:rPr>
+          <w:rFonts w:ascii="Courier New" w:hAnsi="Courier New"/>
+          <w:color w:val="8B0000"/>
+          <w:sz w:val="20"/>
+        </w:rPr>
+        <w:t>Description__c</w:t>
+      </w:r>
+      <w:r>
+        <w:rPr>
+          <w:sz w:val="20"/>
+        </w:rPr>
+        <w:t xml:space="preserve">, </w:t>
+      </w:r>
+      <w:r>
+        <w:rPr>
+          <w:rFonts w:ascii="Courier New" w:hAnsi="Courier New"/>
+          <w:color w:val="8B0000"/>
+          <w:sz w:val="20"/>
+        </w:rPr>
+        <w:t>Impact__c</w:t>
+      </w:r>
+      <w:r>
+        <w:rPr>
+          <w:sz w:val="20"/>
+        </w:rPr>
+        <w:t xml:space="preserve">, and </w:t>
+      </w:r>
+      <w:r>
+        <w:rPr>
+          <w:rFonts w:ascii="Courier New" w:hAnsi="Courier New"/>
+          <w:color w:val="8B0000"/>
+          <w:sz w:val="20"/>
+        </w:rPr>
+        <w:t>Remediation__c</w:t>
+      </w:r>
+      <w:r>
+        <w:rPr>
+          <w:sz w:val="20"/>
+        </w:rPr>
+        <w:t xml:space="preserve"> will contain commas and newlines - naive comma-joining corrupts the file. </w:t>
+      </w:r>
+      <w:r>
+        <w:rPr>
+          <w:b/>
+          <w:sz w:val="20"/>
+        </w:rPr>
+        <w:t>Size guard:</w:t>
+      </w:r>
+      <w:r>
+        <w:rPr>
+          <w:sz w:val="20"/>
+        </w:rPr>
+        <w:t xml:space="preserve"> ContentVersion body limit is ~37MB. After building the CSV string, check </w:t>
+      </w:r>
+      <w:r>
+        <w:rPr>
+          <w:rFonts w:ascii="Courier New" w:hAnsi="Courier New"/>
+          <w:color w:val="8B0000"/>
+          <w:sz w:val="20"/>
+        </w:rPr>
+        <w:t>csvBody.length() &gt; 30000000</w:t>
+      </w:r>
+      <w:r>
+        <w:rPr>
+          <w:sz w:val="20"/>
+        </w:rPr>
+        <w:t xml:space="preserve"> (30MB safety margin). If exceeded: truncate </w:t>
+      </w:r>
+      <w:r>
+        <w:rPr>
+          <w:rFonts w:ascii="Courier New" w:hAnsi="Courier New"/>
+          <w:color w:val="8B0000"/>
+          <w:sz w:val="20"/>
+        </w:rPr>
+        <w:t>Description__c</w:t>
+      </w:r>
+      <w:r>
+        <w:rPr>
+          <w:sz w:val="20"/>
+        </w:rPr>
+        <w:t xml:space="preserve">, </w:t>
+      </w:r>
+      <w:r>
+        <w:rPr>
+          <w:rFonts w:ascii="Courier New" w:hAnsi="Courier New"/>
+          <w:color w:val="8B0000"/>
+          <w:sz w:val="20"/>
+        </w:rPr>
+        <w:t>Impact__c</w:t>
+      </w:r>
+      <w:r>
+        <w:rPr>
+          <w:sz w:val="20"/>
+        </w:rPr>
+        <w:t xml:space="preserve">, and </w:t>
+      </w:r>
+      <w:r>
+        <w:rPr>
+          <w:rFonts w:ascii="Courier New" w:hAnsi="Courier New"/>
+          <w:color w:val="8B0000"/>
+          <w:sz w:val="20"/>
+        </w:rPr>
+        <w:t>Remediation__c</w:t>
+      </w:r>
+      <w:r>
+        <w:rPr>
+          <w:sz w:val="20"/>
+        </w:rPr>
+        <w:t xml:space="preserve"> to 500 chars each and append </w:t>
+      </w:r>
+      <w:r>
+        <w:rPr>
+          <w:rFonts w:ascii="Courier New" w:hAnsi="Courier New"/>
+          <w:color w:val="8B0000"/>
+          <w:sz w:val="20"/>
+        </w:rPr>
+        <w:t>[truncated - see detail panel for full text]</w:t>
+      </w:r>
+      <w:r>
+        <w:rPr>
+          <w:sz w:val="20"/>
+        </w:rPr>
+        <w:t xml:space="preserve">, then rebuild and save. Document this in the ContentVersion </w:t>
+      </w:r>
+      <w:r>
+        <w:rPr>
+          <w:rFonts w:ascii="Courier New" w:hAnsi="Courier New"/>
+          <w:color w:val="8B0000"/>
+          <w:sz w:val="20"/>
+        </w:rPr>
+        <w:t>Description</w:t>
+      </w:r>
+      <w:r>
+        <w:rPr>
+          <w:sz w:val="20"/>
+        </w:rPr>
+        <w:t xml:space="preserve"> field: "Full text columns truncated - finding count exceeded 30MB export limit." At typical v1 volumes (under 1,000 findings at 2KB/finding average) this guard will never fire; it is required for production orgs with verbose CMT definitions and large finding sets.</w:t>
+      </w:r>
+    </w:p>
+    <w:p>
+      <w:r>
+        <w:rPr>
+          <w:b/>
+          <w:sz w:val="20"/>
+        </w:rPr>
+        <w:t>`SecScanFindingsController`:</w:t>
+      </w:r>
+    </w:p>
+    <w:p>
+      <w:pPr>
+        <w:pStyle w:val="ListBullet"/>
+      </w:pPr>
+      <w:r>
+        <w:rPr>
+          <w:rFonts w:ascii="Courier New" w:hAnsi="Courier New"/>
+          <w:color w:val="8B0000"/>
+          <w:sz w:val="20"/>
+        </w:rPr>
+        <w:t>getCurrentScanFindings(String scanRunId, String lastSeenId, Integer lastRank, Integer pageSize, String searchTerm)</w:t>
+      </w:r>
+      <w:r>
+        <w:rPr>
+          <w:sz w:val="20"/>
+        </w:rPr>
+        <w:t xml:space="preserve"> - </w:t>
+      </w:r>
+      <w:r>
+        <w:rPr>
+          <w:b/>
+          <w:sz w:val="20"/>
+        </w:rPr>
+        <w:t>NOT cacheable</w:t>
+      </w:r>
+      <w:r>
+        <w:rPr>
+          <w:sz w:val="20"/>
+        </w:rPr>
+        <w:t xml:space="preserve">. KEYSET paginated (default 100), severity-first composite sort. Both </w:t>
+      </w:r>
+      <w:r>
+        <w:rPr>
+          <w:rFonts w:ascii="Courier New" w:hAnsi="Courier New"/>
+          <w:color w:val="8B0000"/>
+          <w:sz w:val="20"/>
+        </w:rPr>
+        <w:t>lastSeenId</w:t>
+      </w:r>
+      <w:r>
+        <w:rPr>
+          <w:sz w:val="20"/>
+        </w:rPr>
+        <w:t xml:space="preserve"> and </w:t>
+      </w:r>
+      <w:r>
+        <w:rPr>
+          <w:rFonts w:ascii="Courier New" w:hAnsi="Courier New"/>
+          <w:color w:val="8B0000"/>
+          <w:sz w:val="20"/>
+        </w:rPr>
+        <w:t>lastRank</w:t>
+      </w:r>
+      <w:r>
+        <w:rPr>
+          <w:sz w:val="20"/>
+        </w:rPr>
+        <w:t xml:space="preserve"> = null for first page. </w:t>
+      </w:r>
+      <w:r>
+        <w:rPr>
+          <w:rFonts w:ascii="Courier New" w:hAnsi="Courier New"/>
+          <w:color w:val="8B0000"/>
+          <w:sz w:val="20"/>
+        </w:rPr>
+        <w:t>searchTerm</w:t>
+      </w:r>
+      <w:r>
+        <w:rPr>
+          <w:sz w:val="20"/>
+        </w:rPr>
+        <w:t xml:space="preserve"> = null for no text filter. Returns </w:t>
+      </w:r>
+      <w:r>
+        <w:rPr>
+          <w:rFonts w:ascii="Courier New" w:hAnsi="Courier New"/>
+          <w:color w:val="8B0000"/>
+          <w:sz w:val="20"/>
+        </w:rPr>
+        <w:t>SecScanApiResponse&lt;FindingsPageDTO&gt;</w:t>
+      </w:r>
+      <w:r>
+        <w:rPr>
+          <w:sz w:val="20"/>
+        </w:rPr>
+        <w:t xml:space="preserve"> where </w:t>
+      </w:r>
+      <w:r>
+        <w:rPr>
+          <w:rFonts w:ascii="Courier New" w:hAnsi="Courier New"/>
+          <w:color w:val="8B0000"/>
+          <w:sz w:val="20"/>
+        </w:rPr>
+        <w:t>FindingsPageDTO</w:t>
+      </w:r>
+      <w:r>
+        <w:rPr>
+          <w:sz w:val="20"/>
+        </w:rPr>
+        <w:t xml:space="preserve"> has </w:t>
+      </w:r>
+      <w:r>
+        <w:rPr>
+          <w:rFonts w:ascii="Courier New" w:hAnsi="Courier New"/>
+          <w:color w:val="8B0000"/>
+          <w:sz w:val="20"/>
+        </w:rPr>
+        <w:t>List&lt;SecurityFinding__c&gt; findings</w:t>
+      </w:r>
+      <w:r>
+        <w:rPr>
+          <w:sz w:val="20"/>
+        </w:rPr>
+        <w:t xml:space="preserve">, </w:t>
+      </w:r>
+      <w:r>
+        <w:rPr>
+          <w:rFonts w:ascii="Courier New" w:hAnsi="Courier New"/>
+          <w:color w:val="8B0000"/>
+          <w:sz w:val="20"/>
+        </w:rPr>
+        <w:t>Boolean hasMore</w:t>
+      </w:r>
+      <w:r>
+        <w:rPr>
+          <w:sz w:val="20"/>
+        </w:rPr>
+        <w:t xml:space="preserve">, </w:t>
+      </w:r>
+      <w:r>
+        <w:rPr>
+          <w:rFonts w:ascii="Courier New" w:hAnsi="Courier New"/>
+          <w:color w:val="8B0000"/>
+          <w:sz w:val="20"/>
+        </w:rPr>
+        <w:t>String lastSeenId</w:t>
+      </w:r>
+      <w:r>
+        <w:rPr>
+          <w:sz w:val="20"/>
+        </w:rPr>
+        <w:t xml:space="preserve">, </w:t>
+      </w:r>
+      <w:r>
+        <w:rPr>
+          <w:rFonts w:ascii="Courier New" w:hAnsi="Courier New"/>
+          <w:color w:val="8B0000"/>
+          <w:sz w:val="20"/>
+        </w:rPr>
+        <w:t>Integer lastRank</w:t>
+      </w:r>
+      <w:r>
+        <w:rPr>
+          <w:sz w:val="20"/>
+        </w:rPr>
         <w:t>.</w:t>
       </w:r>
     </w:p>
@@ -20474,13 +22349,26 @@
           <w:color w:val="8B0000"/>
           <w:sz w:val="20"/>
         </w:rPr>
-        <w:t>cancelScan(String scanRunId)</w:t>
-      </w:r>
-      <w:r>
-        <w:rPr>
-          <w:sz w:val="20"/>
-        </w:rPr>
-        <w:t xml:space="preserve"> - NOT cacheable (mutation). Sets </w:t>
+        <w:t>getScoreCounts(String scanRunId)</w:t>
+      </w:r>
+      <w:r>
+        <w:rPr>
+          <w:sz w:val="20"/>
+        </w:rPr>
+        <w:t xml:space="preserve"> - </w:t>
+      </w:r>
+      <w:r>
+        <w:rPr>
+          <w:b/>
+          <w:sz w:val="20"/>
+        </w:rPr>
+        <w:t>NOT cacheable</w:t>
+      </w:r>
+      <w:r>
+        <w:rPr>
+          <w:sz w:val="20"/>
+        </w:rPr>
+        <w:t xml:space="preserve">. Returns </w:t>
       </w:r>
       <w:r>
         <w:rPr>
@@ -20488,13 +22376,13 @@
           <w:color w:val="8B0000"/>
           <w:sz w:val="20"/>
         </w:rPr>
-        <w:t>Status__c = 'Cancelled'</w:t>
-      </w:r>
-      <w:r>
-        <w:rPr>
-          <w:sz w:val="20"/>
-        </w:rPr>
-        <w:t xml:space="preserve">. The running Queueable chain cannot be aborted externally - each </w:t>
+        <w:t>{ criticalOpen, highOpen, mediumOpen, lowOpen, infoOpen }</w:t>
+      </w:r>
+      <w:r>
+        <w:rPr>
+          <w:sz w:val="20"/>
+        </w:rPr>
+        <w:t xml:space="preserve"> - live counts of findings where </w:t>
       </w:r>
       <w:r>
         <w:rPr>
@@ -20502,13 +22390,13 @@
           <w:color w:val="8B0000"/>
           <w:sz w:val="20"/>
         </w:rPr>
-        <w:t>SecScanRunnerChain.execute()</w:t>
-      </w:r>
-      <w:r>
-        <w:rPr>
-          <w:sz w:val="20"/>
-        </w:rPr>
-        <w:t xml:space="preserve"> checks </w:t>
+        <w:t>Status__c NOT IN ('Remediated','False Positive')</w:t>
+      </w:r>
+      <w:r>
+        <w:rPr>
+          <w:sz w:val="20"/>
+        </w:rPr>
+        <w:t xml:space="preserve">. Called after every </w:t>
       </w:r>
       <w:r>
         <w:rPr>
@@ -20516,32 +22404,27 @@
           <w:color w:val="8B0000"/>
           <w:sz w:val="20"/>
         </w:rPr>
-        <w:t>Status__c</w:t>
-      </w:r>
-      <w:r>
-        <w:rPr>
-          <w:sz w:val="20"/>
-        </w:rPr>
-        <w:t xml:space="preserve"> at the start of its transaction; if Cancelled, it skips the current category and does not enqueue the next link. The scan halts at the next category boundary, not immediately.</w:t>
-      </w:r>
-    </w:p>
-    <w:p>
-      <w:pPr>
-        <w:pStyle w:val="ListBullet"/>
-      </w:pPr>
+        <w:t>updateFindingStatus</w:t>
+      </w:r>
+      <w:r>
+        <w:rPr>
+          <w:sz w:val="20"/>
+        </w:rPr>
+        <w:t xml:space="preserve"> / </w:t>
+      </w:r>
       <w:r>
         <w:rPr>
           <w:rFonts w:ascii="Courier New" w:hAnsi="Courier New"/>
           <w:color w:val="8B0000"/>
           <w:sz w:val="20"/>
         </w:rPr>
-        <w:t>exportFindingsCsv(String scanRunId)</w:t>
-      </w:r>
-      <w:r>
-        <w:rPr>
-          <w:sz w:val="20"/>
-        </w:rPr>
-        <w:t xml:space="preserve"> - NOT cacheable (mutation). Generates CSV from findings. Creates </w:t>
+        <w:t>bulkUpdateFindingStatus</w:t>
+      </w:r>
+      <w:r>
+        <w:rPr>
+          <w:sz w:val="20"/>
+        </w:rPr>
+        <w:t xml:space="preserve"> so the LWC can recalculate the live score from server-side counts rather than from the partial in-memory </w:t>
       </w:r>
       <w:r>
         <w:rPr>
@@ -20549,432 +22432,13 @@
           <w:color w:val="8B0000"/>
           <w:sz w:val="20"/>
         </w:rPr>
-        <w:t>ContentVersion</w:t>
-      </w:r>
-      <w:r>
-        <w:rPr>
-          <w:sz w:val="20"/>
-        </w:rPr>
-        <w:t xml:space="preserve"> with the CSV body. Creates </w:t>
-      </w:r>
-      <w:r>
-        <w:rPr>
-          <w:rFonts w:ascii="Courier New" w:hAnsi="Courier New"/>
-          <w:color w:val="8B0000"/>
-          <w:sz w:val="20"/>
-        </w:rPr>
-        <w:t>ContentDocumentLink</w:t>
-      </w:r>
-      <w:r>
-        <w:rPr>
-          <w:sz w:val="20"/>
-        </w:rPr>
-        <w:t xml:space="preserve"> with </w:t>
-      </w:r>
-      <w:r>
-        <w:rPr>
-          <w:rFonts w:ascii="Courier New" w:hAnsi="Courier New"/>
-          <w:color w:val="8B0000"/>
-          <w:sz w:val="20"/>
-        </w:rPr>
-        <w:t>ShareType = 'I'</w:t>
-      </w:r>
-      <w:r>
-        <w:rPr>
-          <w:sz w:val="20"/>
-        </w:rPr>
-        <w:t xml:space="preserve"> (Inferred from parent) and </w:t>
-      </w:r>
-      <w:r>
-        <w:rPr>
-          <w:rFonts w:ascii="Courier New" w:hAnsi="Courier New"/>
-          <w:color w:val="8B0000"/>
-          <w:sz w:val="20"/>
-        </w:rPr>
-        <w:t>Visibility = 'InternalUsers'</w:t>
-      </w:r>
-      <w:r>
-        <w:rPr>
-          <w:sz w:val="20"/>
-        </w:rPr>
-        <w:t xml:space="preserve">. Returns </w:t>
-      </w:r>
-      <w:r>
-        <w:rPr>
-          <w:rFonts w:ascii="Courier New" w:hAnsi="Courier New"/>
-          <w:color w:val="8B0000"/>
-          <w:sz w:val="20"/>
-        </w:rPr>
-        <w:t>ContentDocumentId</w:t>
-      </w:r>
-      <w:r>
-        <w:rPr>
-          <w:sz w:val="20"/>
-        </w:rPr>
-        <w:t xml:space="preserve">. Never returns raw String. CSV columns (in order): </w:t>
-      </w:r>
-      <w:r>
-        <w:rPr>
-          <w:rFonts w:ascii="Courier New" w:hAnsi="Courier New"/>
-          <w:color w:val="8B0000"/>
-          <w:sz w:val="20"/>
-        </w:rPr>
-        <w:t>CheckId</w:t>
-      </w:r>
-      <w:r>
-        <w:rPr>
-          <w:sz w:val="20"/>
-        </w:rPr>
-        <w:t xml:space="preserve">, </w:t>
-      </w:r>
-      <w:r>
-        <w:rPr>
-          <w:rFonts w:ascii="Courier New" w:hAnsi="Courier New"/>
-          <w:color w:val="8B0000"/>
-          <w:sz w:val="20"/>
-        </w:rPr>
-        <w:t>CheckName</w:t>
-      </w:r>
-      <w:r>
-        <w:rPr>
-          <w:sz w:val="20"/>
-        </w:rPr>
-        <w:t xml:space="preserve">, </w:t>
-      </w:r>
-      <w:r>
-        <w:rPr>
-          <w:rFonts w:ascii="Courier New" w:hAnsi="Courier New"/>
-          <w:color w:val="8B0000"/>
-          <w:sz w:val="20"/>
-        </w:rPr>
-        <w:t>Category</w:t>
-      </w:r>
-      <w:r>
-        <w:rPr>
-          <w:sz w:val="20"/>
-        </w:rPr>
-        <w:t xml:space="preserve">, </w:t>
-      </w:r>
-      <w:r>
-        <w:rPr>
-          <w:rFonts w:ascii="Courier New" w:hAnsi="Courier New"/>
-          <w:color w:val="8B0000"/>
-          <w:sz w:val="20"/>
-        </w:rPr>
-        <w:t>Severity</w:t>
-      </w:r>
-      <w:r>
-        <w:rPr>
-          <w:sz w:val="20"/>
-        </w:rPr>
-        <w:t xml:space="preserve">, </w:t>
-      </w:r>
-      <w:r>
-        <w:rPr>
-          <w:rFonts w:ascii="Courier New" w:hAnsi="Courier New"/>
-          <w:color w:val="8B0000"/>
-          <w:sz w:val="20"/>
-        </w:rPr>
-        <w:t>FindingType</w:t>
-      </w:r>
-      <w:r>
-        <w:rPr>
-          <w:sz w:val="20"/>
-        </w:rPr>
-        <w:t xml:space="preserve">, </w:t>
-      </w:r>
-      <w:r>
-        <w:rPr>
-          <w:rFonts w:ascii="Courier New" w:hAnsi="Courier New"/>
-          <w:color w:val="8B0000"/>
-          <w:sz w:val="20"/>
-        </w:rPr>
-        <w:t>Status</w:t>
-      </w:r>
-      <w:r>
-        <w:rPr>
-          <w:sz w:val="20"/>
-        </w:rPr>
-        <w:t xml:space="preserve">, </w:t>
-      </w:r>
-      <w:r>
-        <w:rPr>
-          <w:rFonts w:ascii="Courier New" w:hAnsi="Courier New"/>
-          <w:color w:val="8B0000"/>
-          <w:sz w:val="20"/>
-        </w:rPr>
-        <w:t>AffectedComponent</w:t>
-      </w:r>
-      <w:r>
-        <w:rPr>
-          <w:sz w:val="20"/>
-        </w:rPr>
-        <w:t xml:space="preserve">, </w:t>
-      </w:r>
-      <w:r>
-        <w:rPr>
-          <w:rFonts w:ascii="Courier New" w:hAnsi="Courier New"/>
-          <w:color w:val="8B0000"/>
-          <w:sz w:val="20"/>
-        </w:rPr>
-        <w:t>AffectedComponentType</w:t>
-      </w:r>
-      <w:r>
-        <w:rPr>
-          <w:sz w:val="20"/>
-        </w:rPr>
-        <w:t xml:space="preserve">, </w:t>
-      </w:r>
-      <w:r>
-        <w:rPr>
-          <w:rFonts w:ascii="Courier New" w:hAnsi="Courier New"/>
-          <w:color w:val="8B0000"/>
-          <w:sz w:val="20"/>
-        </w:rPr>
-        <w:t>Description</w:t>
-      </w:r>
-      <w:r>
-        <w:rPr>
-          <w:sz w:val="20"/>
-        </w:rPr>
-        <w:t xml:space="preserve">, </w:t>
-      </w:r>
-      <w:r>
-        <w:rPr>
-          <w:rFonts w:ascii="Courier New" w:hAnsi="Courier New"/>
-          <w:color w:val="8B0000"/>
-          <w:sz w:val="20"/>
-        </w:rPr>
-        <w:t>Impact</w:t>
-      </w:r>
-      <w:r>
-        <w:rPr>
-          <w:sz w:val="20"/>
-        </w:rPr>
-        <w:t xml:space="preserve">, </w:t>
-      </w:r>
-      <w:r>
-        <w:rPr>
-          <w:rFonts w:ascii="Courier New" w:hAnsi="Courier New"/>
-          <w:color w:val="8B0000"/>
-          <w:sz w:val="20"/>
-        </w:rPr>
-        <w:t>Remediation</w:t>
-      </w:r>
-      <w:r>
-        <w:rPr>
-          <w:sz w:val="20"/>
-        </w:rPr>
-        <w:t xml:space="preserve">, </w:t>
-      </w:r>
-      <w:r>
-        <w:rPr>
-          <w:rFonts w:ascii="Courier New" w:hAnsi="Courier New"/>
-          <w:color w:val="8B0000"/>
-          <w:sz w:val="20"/>
-        </w:rPr>
-        <w:t>AcknowledgedBy</w:t>
-      </w:r>
-      <w:r>
-        <w:rPr>
-          <w:sz w:val="20"/>
-        </w:rPr>
-        <w:t xml:space="preserve"> (user name, not ID), </w:t>
-      </w:r>
-      <w:r>
-        <w:rPr>
-          <w:rFonts w:ascii="Courier New" w:hAnsi="Courier New"/>
-          <w:color w:val="8B0000"/>
-          <w:sz w:val="20"/>
-        </w:rPr>
-        <w:t>AcknowledgedDate</w:t>
-      </w:r>
-      <w:r>
-        <w:rPr>
-          <w:sz w:val="20"/>
-        </w:rPr>
-        <w:t xml:space="preserve">, </w:t>
-      </w:r>
-      <w:r>
-        <w:rPr>
-          <w:rFonts w:ascii="Courier New" w:hAnsi="Courier New"/>
-          <w:color w:val="8B0000"/>
-          <w:sz w:val="20"/>
-        </w:rPr>
-        <w:t>SalesforceDocUrl</w:t>
-      </w:r>
-      <w:r>
-        <w:rPr>
-          <w:sz w:val="20"/>
-        </w:rPr>
-        <w:t xml:space="preserve">. Header row uses field labels. </w:t>
-      </w:r>
-      <w:r>
-        <w:rPr>
-          <w:rFonts w:ascii="Courier New" w:hAnsi="Courier New"/>
-          <w:color w:val="8B0000"/>
-          <w:sz w:val="20"/>
-        </w:rPr>
-        <w:t>RawEvidence__c</w:t>
-      </w:r>
-      <w:r>
-        <w:rPr>
-          <w:sz w:val="20"/>
-        </w:rPr>
-        <w:t xml:space="preserve"> excluded (too large, scrubbed - admins use the detail panel for evidence).</w:t>
-      </w:r>
-    </w:p>
-    <w:p>
-      <w:r>
-        <w:rPr>
-          <w:b/>
-          <w:sz w:val="20"/>
-        </w:rPr>
-        <w:t>`SecScanFindingsController`:</w:t>
-      </w:r>
-    </w:p>
-    <w:p>
-      <w:pPr>
-        <w:pStyle w:val="ListBullet"/>
-      </w:pPr>
-      <w:r>
-        <w:rPr>
-          <w:rFonts w:ascii="Courier New" w:hAnsi="Courier New"/>
-          <w:color w:val="8B0000"/>
-          <w:sz w:val="20"/>
-        </w:rPr>
-        <w:t>getCurrentScanFindings(String scanRunId, String lastSeenId, Integer lastRank, Integer pageSize)</w:t>
-      </w:r>
-      <w:r>
-        <w:rPr>
-          <w:sz w:val="20"/>
-        </w:rPr>
-        <w:t xml:space="preserve"> - </w:t>
-      </w:r>
-      <w:r>
-        <w:rPr>
-          <w:b/>
-          <w:sz w:val="20"/>
-        </w:rPr>
-        <w:t>NOT cacheable</w:t>
-      </w:r>
-      <w:r>
-        <w:rPr>
-          <w:sz w:val="20"/>
-        </w:rPr>
-        <w:t xml:space="preserve">. KEYSET paginated (default 100), severity-first composite sort. Both </w:t>
-      </w:r>
-      <w:r>
-        <w:rPr>
-          <w:rFonts w:ascii="Courier New" w:hAnsi="Courier New"/>
-          <w:color w:val="8B0000"/>
-          <w:sz w:val="20"/>
-        </w:rPr>
-        <w:t>lastSeenId</w:t>
-      </w:r>
-      <w:r>
-        <w:rPr>
-          <w:sz w:val="20"/>
-        </w:rPr>
-        <w:t xml:space="preserve"> and </w:t>
-      </w:r>
-      <w:r>
-        <w:rPr>
-          <w:rFonts w:ascii="Courier New" w:hAnsi="Courier New"/>
-          <w:color w:val="8B0000"/>
-          <w:sz w:val="20"/>
-        </w:rPr>
-        <w:t>lastRank</w:t>
-      </w:r>
-      <w:r>
-        <w:rPr>
-          <w:sz w:val="20"/>
-        </w:rPr>
-        <w:t xml:space="preserve"> = null for first page. Returns </w:t>
-      </w:r>
-      <w:r>
-        <w:rPr>
-          <w:rFonts w:ascii="Courier New" w:hAnsi="Courier New"/>
-          <w:color w:val="8B0000"/>
-          <w:sz w:val="20"/>
-        </w:rPr>
-        <w:t>SecScanApiResponse&lt;FindingsPageDTO&gt;</w:t>
-      </w:r>
-      <w:r>
-        <w:rPr>
-          <w:sz w:val="20"/>
-        </w:rPr>
-        <w:t xml:space="preserve"> where </w:t>
-      </w:r>
-      <w:r>
-        <w:rPr>
-          <w:rFonts w:ascii="Courier New" w:hAnsi="Courier New"/>
-          <w:color w:val="8B0000"/>
-          <w:sz w:val="20"/>
-        </w:rPr>
-        <w:t>FindingsPageDTO</w:t>
-      </w:r>
-      <w:r>
-        <w:rPr>
-          <w:sz w:val="20"/>
-        </w:rPr>
-        <w:t xml:space="preserve"> has </w:t>
-      </w:r>
-      <w:r>
-        <w:rPr>
-          <w:rFonts w:ascii="Courier New" w:hAnsi="Courier New"/>
-          <w:color w:val="8B0000"/>
-          <w:sz w:val="20"/>
-        </w:rPr>
-        <w:t>List&lt;SecurityFinding__c&gt; findings</w:t>
-      </w:r>
-      <w:r>
-        <w:rPr>
-          <w:sz w:val="20"/>
-        </w:rPr>
-        <w:t xml:space="preserve">, </w:t>
-      </w:r>
-      <w:r>
-        <w:rPr>
-          <w:rFonts w:ascii="Courier New" w:hAnsi="Courier New"/>
-          <w:color w:val="8B0000"/>
-          <w:sz w:val="20"/>
-        </w:rPr>
-        <w:t>Boolean hasMore</w:t>
-      </w:r>
-      <w:r>
-        <w:rPr>
-          <w:sz w:val="20"/>
-        </w:rPr>
-        <w:t xml:space="preserve">, </w:t>
-      </w:r>
-      <w:r>
-        <w:rPr>
-          <w:rFonts w:ascii="Courier New" w:hAnsi="Courier New"/>
-          <w:color w:val="8B0000"/>
-          <w:sz w:val="20"/>
-        </w:rPr>
-        <w:t>String lastSeenId</w:t>
-      </w:r>
-      <w:r>
-        <w:rPr>
-          <w:sz w:val="20"/>
-        </w:rPr>
-        <w:t xml:space="preserve">, </w:t>
-      </w:r>
-      <w:r>
-        <w:rPr>
-          <w:rFonts w:ascii="Courier New" w:hAnsi="Courier New"/>
-          <w:color w:val="8B0000"/>
-          <w:sz w:val="20"/>
-        </w:rPr>
-        <w:t>Integer lastRank</w:t>
-      </w:r>
-      <w:r>
-        <w:rPr>
-          <w:sz w:val="20"/>
-        </w:rPr>
-        <w:t>.</w:t>
+        <w:t>allFindings[]</w:t>
+      </w:r>
+      <w:r>
+        <w:rPr>
+          <w:sz w:val="20"/>
+        </w:rPr>
+        <w:t>. Without this, paginated findings cause a wrong live score (score computed from 100 loaded findings, not the actual 400).</w:t>
       </w:r>
     </w:p>
     <w:p>
@@ -24691,6 +26155,218 @@
           </w:p>
         </w:tc>
       </w:tr>
+      <w:tr>
+        <w:tc>
+          <w:tcPr>
+            <w:tcW w:type="dxa" w:w="2351"/>
+            <w:vAlign w:val="center"/>
+          </w:tcPr>
+          <w:p>
+            <w:pPr>
+              <w:jc w:val="left"/>
+            </w:pPr>
+            <w:r>
+              <w:rPr>
+                <w:rFonts w:ascii="Courier New" w:hAnsi="Courier New"/>
+                <w:color w:val="8B0000"/>
+                <w:sz w:val="18"/>
+              </w:rPr>
+              <w:t>getScoreCounts()</w:t>
+            </w:r>
+            <w:r>
+              <w:rPr>
+                <w:sz w:val="18"/>
+              </w:rPr>
+              <w:t xml:space="preserve"> failure</w:t>
+            </w:r>
+          </w:p>
+        </w:tc>
+        <w:tc>
+          <w:tcPr>
+            <w:tcW w:type="dxa" w:w="2351"/>
+            <w:vAlign w:val="center"/>
+          </w:tcPr>
+          <w:p>
+            <w:pPr>
+              <w:jc w:val="left"/>
+            </w:pPr>
+            <w:r>
+              <w:rPr>
+                <w:sz w:val="18"/>
+              </w:rPr>
+              <w:t>QueryException or unexpected error in counts query</w:t>
+            </w:r>
+          </w:p>
+        </w:tc>
+        <w:tc>
+          <w:tcPr>
+            <w:tcW w:type="dxa" w:w="2351"/>
+            <w:vAlign w:val="center"/>
+          </w:tcPr>
+          <w:p>
+            <w:pPr>
+              <w:jc w:val="left"/>
+            </w:pPr>
+            <w:r>
+              <w:rPr>
+                <w:sz w:val="18"/>
+              </w:rPr>
+              <w:t xml:space="preserve">Display stored </w:t>
+            </w:r>
+            <w:r>
+              <w:rPr>
+                <w:rFonts w:ascii="Courier New" w:hAnsi="Courier New"/>
+                <w:color w:val="8B0000"/>
+                <w:sz w:val="18"/>
+              </w:rPr>
+              <w:t>Score__c</w:t>
+            </w:r>
+            <w:r>
+              <w:rPr>
+                <w:sz w:val="18"/>
+              </w:rPr>
+              <w:t xml:space="preserve"> and </w:t>
+            </w:r>
+            <w:r>
+              <w:rPr>
+                <w:rFonts w:ascii="Courier New" w:hAnsi="Courier New"/>
+                <w:color w:val="8B0000"/>
+                <w:sz w:val="18"/>
+              </w:rPr>
+              <w:t>Grade__c</w:t>
+            </w:r>
+            <w:r>
+              <w:rPr>
+                <w:sz w:val="18"/>
+              </w:rPr>
+              <w:t xml:space="preserve"> from the run record as fallback. Append a non-blocking note near the score ring: "Live score unavailable - showing score at scan completion." Do not block the UI.</w:t>
+            </w:r>
+          </w:p>
+        </w:tc>
+        <w:tc>
+          <w:tcPr>
+            <w:tcW w:type="dxa" w:w="2351"/>
+            <w:vAlign w:val="center"/>
+          </w:tcPr>
+          <w:p>
+            <w:pPr>
+              <w:jc w:val="left"/>
+            </w:pPr>
+            <w:r>
+              <w:rPr>
+                <w:sz w:val="18"/>
+              </w:rPr>
+              <w:t xml:space="preserve">Refresh the page to retry. If persistent, check </w:t>
+            </w:r>
+            <w:r>
+              <w:rPr>
+                <w:rFonts w:ascii="Courier New" w:hAnsi="Courier New"/>
+                <w:color w:val="8B0000"/>
+                <w:sz w:val="18"/>
+              </w:rPr>
+              <w:t>SecurityFinding__c</w:t>
+            </w:r>
+            <w:r>
+              <w:rPr>
+                <w:sz w:val="18"/>
+              </w:rPr>
+              <w:t xml:space="preserve"> field access on the Permission Set.</w:t>
+            </w:r>
+          </w:p>
+        </w:tc>
+      </w:tr>
+      <w:tr>
+        <w:tc>
+          <w:tcPr>
+            <w:tcW w:type="dxa" w:w="2351"/>
+            <w:vAlign w:val="center"/>
+          </w:tcPr>
+          <w:p>
+            <w:pPr>
+              <w:jc w:val="left"/>
+            </w:pPr>
+            <w:r>
+              <w:rPr>
+                <w:rFonts w:ascii="Courier New" w:hAnsi="Courier New"/>
+                <w:color w:val="8B0000"/>
+                <w:sz w:val="18"/>
+              </w:rPr>
+              <w:t>getOrgInfo()</w:t>
+            </w:r>
+            <w:r>
+              <w:rPr>
+                <w:sz w:val="18"/>
+              </w:rPr>
+              <w:t xml:space="preserve"> failure</w:t>
+            </w:r>
+          </w:p>
+        </w:tc>
+        <w:tc>
+          <w:tcPr>
+            <w:tcW w:type="dxa" w:w="2351"/>
+            <w:vAlign w:val="center"/>
+          </w:tcPr>
+          <w:p>
+            <w:pPr>
+              <w:jc w:val="left"/>
+            </w:pPr>
+            <w:r>
+              <w:rPr>
+                <w:sz w:val="18"/>
+              </w:rPr>
+              <w:t>QueryException or permission issue on LWC init</w:t>
+            </w:r>
+          </w:p>
+        </w:tc>
+        <w:tc>
+          <w:tcPr>
+            <w:tcW w:type="dxa" w:w="2351"/>
+            <w:vAlign w:val="center"/>
+          </w:tcPr>
+          <w:p>
+            <w:pPr>
+              <w:jc w:val="left"/>
+            </w:pPr>
+            <w:r>
+              <w:rPr>
+                <w:sz w:val="18"/>
+              </w:rPr>
+              <w:t>Toast warning: "Unable to determine org type. Proceed with caution." Treat as production: show the red persistent banner as the safe default. Do not silently assume sandbox - missing the production warning is a worse outcome than a false positive warning.</w:t>
+            </w:r>
+          </w:p>
+        </w:tc>
+        <w:tc>
+          <w:tcPr>
+            <w:tcW w:type="dxa" w:w="2351"/>
+            <w:vAlign w:val="center"/>
+          </w:tcPr>
+          <w:p>
+            <w:pPr>
+              <w:jc w:val="left"/>
+            </w:pPr>
+            <w:r>
+              <w:rPr>
+                <w:sz w:val="18"/>
+              </w:rPr>
+              <w:t xml:space="preserve">Refresh the page. If persistent, verify the running user has Read on </w:t>
+            </w:r>
+            <w:r>
+              <w:rPr>
+                <w:rFonts w:ascii="Courier New" w:hAnsi="Courier New"/>
+                <w:color w:val="8B0000"/>
+                <w:sz w:val="18"/>
+              </w:rPr>
+              <w:t>Organization</w:t>
+            </w:r>
+            <w:r>
+              <w:rPr>
+                <w:sz w:val="18"/>
+              </w:rPr>
+              <w:t xml:space="preserve"> (standard object, always accessible to authenticated users - persistent failure indicates an unusual org restriction).</w:t>
+            </w:r>
+          </w:p>
+        </w:tc>
+      </w:tr>
     </w:tbl>
     <w:p/>
     <w:p>
@@ -25415,7 +27091,7 @@
                 <w:color w:val="8B0000"/>
                 <w:sz w:val="18"/>
               </w:rPr>
-              <w:t>getCurrentScanFindings(runId, null, null, 10)</w:t>
+              <w:t>getCurrentScanFindings(runId, null, null, 10, null)</w:t>
             </w:r>
             <w:r>
               <w:rPr>
@@ -25492,6 +27168,92 @@
                 <w:sz w:val="18"/>
               </w:rPr>
               <w:t>. Verify Critical findings appear before Informational findings across pages.</w:t>
+            </w:r>
+          </w:p>
+        </w:tc>
+      </w:tr>
+      <w:tr>
+        <w:tc>
+          <w:tcPr>
+            <w:tcW w:type="dxa" w:w="4703"/>
+            <w:vAlign w:val="center"/>
+          </w:tcPr>
+          <w:p>
+            <w:pPr>
+              <w:jc w:val="left"/>
+            </w:pPr>
+            <w:r>
+              <w:rPr>
+                <w:rFonts w:ascii="Courier New" w:hAnsi="Courier New"/>
+                <w:color w:val="8B0000"/>
+                <w:sz w:val="18"/>
+              </w:rPr>
+              <w:t>getScoreCounts()</w:t>
+            </w:r>
+            <w:r>
+              <w:rPr>
+                <w:sz w:val="18"/>
+              </w:rPr>
+              <w:t xml:space="preserve"> after status change</w:t>
+            </w:r>
+          </w:p>
+        </w:tc>
+        <w:tc>
+          <w:tcPr>
+            <w:tcW w:type="dxa" w:w="4703"/>
+            <w:vAlign w:val="center"/>
+          </w:tcPr>
+          <w:p>
+            <w:pPr>
+              <w:jc w:val="left"/>
+            </w:pPr>
+            <w:r>
+              <w:rPr>
+                <w:sz w:val="18"/>
+              </w:rPr>
+              <w:t xml:space="preserve">Mark 1 Critical finding as Remediated. Call </w:t>
+            </w:r>
+            <w:r>
+              <w:rPr>
+                <w:rFonts w:ascii="Courier New" w:hAnsi="Courier New"/>
+                <w:color w:val="8B0000"/>
+                <w:sz w:val="18"/>
+              </w:rPr>
+              <w:t>getScoreCounts(runId)</w:t>
+            </w:r>
+            <w:r>
+              <w:rPr>
+                <w:sz w:val="18"/>
+              </w:rPr>
+              <w:t xml:space="preserve">. Verify </w:t>
+            </w:r>
+            <w:r>
+              <w:rPr>
+                <w:rFonts w:ascii="Courier New" w:hAnsi="Courier New"/>
+                <w:color w:val="8B0000"/>
+                <w:sz w:val="18"/>
+              </w:rPr>
+              <w:t>criticalOpen</w:t>
+            </w:r>
+            <w:r>
+              <w:rPr>
+                <w:sz w:val="18"/>
+              </w:rPr>
+              <w:t xml:space="preserve"> = original Critical count - 1. Mark as False Positive instead - verify same result. Mark as Acknowledged - verify </w:t>
+            </w:r>
+            <w:r>
+              <w:rPr>
+                <w:rFonts w:ascii="Courier New" w:hAnsi="Courier New"/>
+                <w:color w:val="8B0000"/>
+                <w:sz w:val="18"/>
+              </w:rPr>
+              <w:t>criticalOpen</w:t>
+            </w:r>
+            <w:r>
+              <w:rPr>
+                <w:sz w:val="18"/>
+              </w:rPr>
+              <w:t xml:space="preserve"> unchanged (Acknowledged is not excluded from score).</w:t>
             </w:r>
           </w:p>
         </w:tc>
@@ -26998,6 +28760,22 @@
           <w:sz w:val="20"/>
         </w:rPr>
         <w:t>, which is never sent to any AI model.</w:t>
+      </w:r>
+    </w:p>
+    <w:p>
+      <w:pPr>
+        <w:pStyle w:val="Heading3"/>
+      </w:pPr>
+      <w:r>
+        <w:t>i18n - v2 Gap</w:t>
+      </w:r>
+    </w:p>
+    <w:p>
+      <w:r>
+        <w:rPr>
+          <w:sz w:val="20"/>
+        </w:rPr>
+        <w:t>v1 is English-only. All LWC UI strings are hardcoded in templates and JavaScript. All 76 CMT check definitions contain English-only Description, Impact, and Remediation text. v2 consideration: extract LWC UI strings to Custom Labels for Translation Workbench support. CMT check definitions remain English in v1 - multi-language support would require per-locale CMT record sets or a Translation Workbench extension point.</w:t>
       </w:r>
     </w:p>
     <w:sectPr>

</xml_diff>

<commit_message>
Apply UX round fixes (12 findings): initializing skeleton, status state machine, heatmap short codes, left panel 260px+collapsible, destructive row action safety, score ring breakdown popover, remove description truncation, severity group headers, export button+feedback, mobile back gesture, WCAG medium yellow contrast, first-scan onboarding
</commit_message>
<xml_diff>
--- a/projects/org-security-scanner/Org Security Scanner - Technical Plan.docx
+++ b/projects/org-security-scanner/Org Security Scanner - Technical Plan.docx
@@ -15644,7 +15644,7 @@
           <w:color w:val="000080"/>
           <w:sz w:val="17"/>
         </w:rPr>
-        <w:t xml:space="preserve">  |-- [ Left Panel - 320px fixed sticky ]</w:t>
+        <w:t xml:space="preserve">  |-- [ Left Panel - 260px fixed sticky, collapsible ]</w:t>
       </w:r>
     </w:p>
     <w:p>
@@ -15813,6 +15813,56 @@
               <w:rPr>
                 <w:sz w:val="18"/>
               </w:rPr>
+              <w:t>Initializing</w:t>
+            </w:r>
+          </w:p>
+        </w:tc>
+        <w:tc>
+          <w:tcPr>
+            <w:tcW w:type="dxa" w:w="4703"/>
+            <w:vAlign w:val="center"/>
+          </w:tcPr>
+          <w:p>
+            <w:pPr>
+              <w:jc w:val="left"/>
+            </w:pPr>
+            <w:r>
+              <w:rPr>
+                <w:sz w:val="18"/>
+              </w:rPr>
+              <w:t xml:space="preserve">Page skeleton shown from LWC mount until all three @wire calls resolve (getScanRuns, getOrgInfo, getOrgSecuritySettings). Render the structural layout (header bar outline, tab strip, left panel, content area) as grey shimmer placeholder blocks using SLDS </w:t>
+            </w:r>
+            <w:r>
+              <w:rPr>
+                <w:rFonts w:ascii="Courier New" w:hAnsi="Courier New"/>
+                <w:color w:val="8B0000"/>
+                <w:sz w:val="18"/>
+              </w:rPr>
+              <w:t>slds-is-loading</w:t>
+            </w:r>
+            <w:r>
+              <w:rPr>
+                <w:sz w:val="18"/>
+              </w:rPr>
+              <w:t xml:space="preserve"> shimmer pattern. Prevents blank-screen flash and layout shift when data arrives. Transition to the appropriate state when all wires resolve.</w:t>
+            </w:r>
+          </w:p>
+        </w:tc>
+      </w:tr>
+      <w:tr>
+        <w:tc>
+          <w:tcPr>
+            <w:tcW w:type="dxa" w:w="4703"/>
+            <w:vAlign w:val="center"/>
+          </w:tcPr>
+          <w:p>
+            <w:pPr>
+              <w:jc w:val="left"/>
+            </w:pPr>
+            <w:r>
+              <w:rPr>
+                <w:sz w:val="18"/>
+              </w:rPr>
               <w:t>No scan yet</w:t>
             </w:r>
           </w:p>
@@ -15830,7 +15880,21 @@
               <w:rPr>
                 <w:sz w:val="18"/>
               </w:rPr>
-              <w:t>Empty state illustration + CTA. Tab strip disabled.</w:t>
+              <w:t xml:space="preserve">Empty state illustration + CTA. Tab strip disabled. Onboarding context below illustration (4 bullets): "Checks 76 security configurations across 13 categories. Read-only - makes no changes to your org. Typical scan time: 2-5 minutes. Results stored in-org, auto-deleted after [MaxScanRuns__c] scans." Last value read from </w:t>
+            </w:r>
+            <w:r>
+              <w:rPr>
+                <w:rFonts w:ascii="Courier New" w:hAnsi="Courier New"/>
+                <w:color w:val="8B0000"/>
+                <w:sz w:val="18"/>
+              </w:rPr>
+              <w:t>getOrgSecuritySettings()</w:t>
+            </w:r>
+            <w:r>
+              <w:rPr>
+                <w:sz w:val="18"/>
+              </w:rPr>
+              <w:t>.</w:t>
             </w:r>
           </w:p>
         </w:tc>
@@ -16228,7 +16292,74 @@
         <w:rPr>
           <w:sz w:val="20"/>
         </w:rPr>
-        <w:t>)</w:t>
+        <w:t>) + "Export CSV" icon button (</w:t>
+      </w:r>
+      <w:r>
+        <w:rPr>
+          <w:rFonts w:ascii="Courier New" w:hAnsi="Courier New"/>
+          <w:color w:val="8B0000"/>
+          <w:sz w:val="20"/>
+        </w:rPr>
+        <w:t>utility:download</w:t>
+      </w:r>
+      <w:r>
+        <w:rPr>
+          <w:sz w:val="20"/>
+        </w:rPr>
+        <w:t>, placed left of Run button). Export exports all findings for the current scan (not filtered subset - the CSV is a compliance artifact). Export button shows a spinner during generation. On success: toast "CSV exported - [Download]" where Download opens the ContentDocument. On failure: show error toast per the error states table. Export button is disabled during a running scan and when no scan exists.</w:t>
+      </w:r>
+    </w:p>
+    <w:p>
+      <w:pPr>
+        <w:pStyle w:val="ListBullet"/>
+      </w:pPr>
+      <w:r>
+        <w:rPr>
+          <w:sz w:val="20"/>
+        </w:rPr>
+        <w:t xml:space="preserve">Score Ring: clicking or hovering the ring shows an </w:t>
+      </w:r>
+      <w:r>
+        <w:rPr>
+          <w:rFonts w:ascii="Courier New" w:hAnsi="Courier New"/>
+          <w:color w:val="8B0000"/>
+          <w:sz w:val="20"/>
+        </w:rPr>
+        <w:t>slds-popover</w:t>
+      </w:r>
+      <w:r>
+        <w:rPr>
+          <w:sz w:val="20"/>
+        </w:rPr>
+        <w:t xml:space="preserve"> score breakdown. Content: "Starting score: 100. Critical: -[N] ([count] x [deduct], cap [cap]). High: -[N]. Medium: -[N]. Low: -[N]. Info: -[N]. Excluded: [R+FP count] Remediated/False Positive. Final: [score] (Grade [letter])." Values computed from </w:t>
+      </w:r>
+      <w:r>
+        <w:rPr>
+          <w:rFonts w:ascii="Courier New" w:hAnsi="Courier New"/>
+          <w:color w:val="8B0000"/>
+          <w:sz w:val="20"/>
+        </w:rPr>
+        <w:t>getScoreCounts()</w:t>
+      </w:r>
+      <w:r>
+        <w:rPr>
+          <w:sz w:val="20"/>
+        </w:rPr>
+        <w:t xml:space="preserve"> result and </w:t>
+      </w:r>
+      <w:r>
+        <w:rPr>
+          <w:rFonts w:ascii="Courier New" w:hAnsi="Courier New"/>
+          <w:color w:val="8B0000"/>
+          <w:sz w:val="20"/>
+        </w:rPr>
+        <w:t>getOrgSecuritySettings()</w:t>
+      </w:r>
+      <w:r>
+        <w:rPr>
+          <w:sz w:val="20"/>
+        </w:rPr>
+        <w:t xml:space="preserve"> CMT weights - both already in the LWC. Helps admins explain the score to stakeholders.</w:t>
       </w:r>
     </w:p>
     <w:p>
@@ -17373,11 +17504,145 @@
       </w:r>
     </w:p>
     <w:p>
+      <w:r>
+        <w:rPr>
+          <w:b/>
+          <w:sz w:val="20"/>
+        </w:rPr>
+        <w:t>WCAG contrast requirement:</w:t>
+      </w:r>
+      <w:r>
+        <w:rPr>
+          <w:sz w:val="20"/>
+        </w:rPr>
+        <w:t xml:space="preserve"> </w:t>
+      </w:r>
+      <w:r>
+        <w:rPr>
+          <w:rFonts w:ascii="Courier New" w:hAnsi="Courier New"/>
+          <w:color w:val="8B0000"/>
+          <w:sz w:val="20"/>
+        </w:rPr>
+        <w:t>--color-medium</w:t>
+      </w:r>
+      <w:r>
+        <w:rPr>
+          <w:sz w:val="20"/>
+        </w:rPr>
+        <w:t xml:space="preserve"> (</w:t>
+      </w:r>
+      <w:r>
+        <w:rPr>
+          <w:rFonts w:ascii="Courier New" w:hAnsi="Courier New"/>
+          <w:color w:val="8B0000"/>
+          <w:sz w:val="20"/>
+        </w:rPr>
+        <w:t>#f4bc25</w:t>
+      </w:r>
+      <w:r>
+        <w:rPr>
+          <w:sz w:val="20"/>
+        </w:rPr>
+        <w:t xml:space="preserve"> yellow) on a white background produces a contrast ratio of ~1.7:1 - WCAG AA requires 4.5:1 for normal text and 3:1 for large text. Both fail. Fix:</w:t>
+      </w:r>
+    </w:p>
+    <w:p>
+      <w:pPr>
+        <w:pStyle w:val="ListBullet"/>
+      </w:pPr>
+      <w:r>
+        <w:rPr>
+          <w:sz w:val="20"/>
+        </w:rPr>
+        <w:t xml:space="preserve">Severity label text (e.g. "Medium") always uses </w:t>
+      </w:r>
+      <w:r>
+        <w:rPr>
+          <w:rFonts w:ascii="Courier New" w:hAnsi="Courier New"/>
+          <w:color w:val="8B0000"/>
+          <w:sz w:val="20"/>
+        </w:rPr>
+        <w:t>--lwc-colorTextDefault</w:t>
+      </w:r>
+      <w:r>
+        <w:rPr>
+          <w:sz w:val="20"/>
+        </w:rPr>
+        <w:t xml:space="preserve"> (dark grey), never the severity color. Only the dot/badge background uses the severity color token.</w:t>
+      </w:r>
+    </w:p>
+    <w:p>
+      <w:pPr>
+        <w:pStyle w:val="ListBullet"/>
+      </w:pPr>
+      <w:r>
+        <w:rPr>
+          <w:sz w:val="20"/>
+        </w:rPr>
+        <w:t>Heatmap amber cells ("1-3 findings"): use dark text (</w:t>
+      </w:r>
+      <w:r>
+        <w:rPr>
+          <w:rFonts w:ascii="Courier New" w:hAnsi="Courier New"/>
+          <w:color w:val="8B0000"/>
+          <w:sz w:val="20"/>
+        </w:rPr>
+        <w:t>--lwc-colorTextDefault</w:t>
+      </w:r>
+      <w:r>
+        <w:rPr>
+          <w:sz w:val="20"/>
+        </w:rPr>
+        <w:t>) on the amber background, not white text. Amber background with white text also fails contrast.</w:t>
+      </w:r>
+    </w:p>
+    <w:p>
+      <w:pPr>
+        <w:pStyle w:val="ListBullet"/>
+      </w:pPr>
+      <w:r>
+        <w:rPr>
+          <w:rFonts w:ascii="Courier New" w:hAnsi="Courier New"/>
+          <w:color w:val="8B0000"/>
+          <w:sz w:val="20"/>
+        </w:rPr>
+        <w:t>--color-medium</w:t>
+      </w:r>
+      <w:r>
+        <w:rPr>
+          <w:sz w:val="20"/>
+        </w:rPr>
+        <w:t xml:space="preserve"> is acceptable as a background color with dark foreground text or as an icon fill where the icon is large enough to meet the 3:1 large-text threshold. It must not be used as foreground text color on white.</w:t>
+      </w:r>
+    </w:p>
+    <w:p>
       <w:pPr>
         <w:pStyle w:val="Heading3"/>
       </w:pPr>
       <w:r>
-        <w:t>Left Panel (Persistent, 320px)</w:t>
+        <w:t>Left Panel (Persistent, 260px, collapsible)</w:t>
+      </w:r>
+    </w:p>
+    <w:p>
+      <w:r>
+        <w:rPr>
+          <w:sz w:val="20"/>
+        </w:rPr>
+        <w:t xml:space="preserve">Width reduced from 320px to 260px. At 1366px viewport (common in government/NGO), the Salesforce nav (~220px) + 320px left panel + 45% detail panel (~515px) leaves only ~311px for the findings list - unusable. At 260px the findings list retains ~371px with the detail panel open, which is workable. The panel has a collapse toggle arrow on its right edge; when collapsed it renders as a 40px icon strip so admins working in the detail panel can recover full width. Collapsed state persisted to </w:t>
+      </w:r>
+      <w:r>
+        <w:rPr>
+          <w:rFonts w:ascii="Courier New" w:hAnsi="Courier New"/>
+          <w:color w:val="8B0000"/>
+          <w:sz w:val="20"/>
+        </w:rPr>
+        <w:t>localStorage</w:t>
+      </w:r>
+      <w:r>
+        <w:rPr>
+          <w:sz w:val="20"/>
+        </w:rPr>
+        <w:t xml:space="preserve"> across sessions.</w:t>
       </w:r>
     </w:p>
     <w:p>
@@ -17589,7 +17854,35 @@
         <w:rPr>
           <w:sz w:val="20"/>
         </w:rPr>
-        <w:t>Each cell: SLDS icon + name + count badge</w:t>
+        <w:t xml:space="preserve">Each cell: SLDS icon + CategoryCode as primary label (UA, GU, SRA, SA, CAI, AA, LA, AGA, MS, FUE, CE, MON, HCB) + count badge. Full category name rendered as </w:t>
+      </w:r>
+      <w:r>
+        <w:rPr>
+          <w:rFonts w:ascii="Courier New" w:hAnsi="Courier New"/>
+          <w:color w:val="8B0000"/>
+          <w:sz w:val="20"/>
+        </w:rPr>
+        <w:t>title</w:t>
+      </w:r>
+      <w:r>
+        <w:rPr>
+          <w:sz w:val="20"/>
+        </w:rPr>
+        <w:t xml:space="preserve"> attribute tooltip on hover and as </w:t>
+      </w:r>
+      <w:r>
+        <w:rPr>
+          <w:rFonts w:ascii="Courier New" w:hAnsi="Courier New"/>
+          <w:color w:val="8B0000"/>
+          <w:sz w:val="20"/>
+        </w:rPr>
+        <w:t>aria-label</w:t>
+      </w:r>
+      <w:r>
+        <w:rPr>
+          <w:sz w:val="20"/>
+        </w:rPr>
+        <w:t xml:space="preserve"> for screen readers. Short codes ensure uniform cell width - long names like "Connected Apps &amp; Integrations" (31 chars) overflow at common grid cell widths.</w:t>
       </w:r>
     </w:p>
     <w:p>
@@ -18044,10 +18337,49 @@
       </w:pPr>
       <w:r>
         <w:rPr>
+          <w:sz w:val="20"/>
+        </w:rPr>
+        <w:t xml:space="preserve">Severity group headers: a thin grey divider with label between severity groups ("Critical - 8 findings", "High - 15 findings", etc.). Template </w:t>
+      </w:r>
+      <w:r>
+        <w:rPr>
           <w:rFonts w:ascii="Courier New" w:hAnsi="Courier New"/>
           <w:color w:val="8B0000"/>
           <w:sz w:val="20"/>
         </w:rPr>
+        <w:t>if:true</w:t>
+      </w:r>
+      <w:r>
+        <w:rPr>
+          <w:sz w:val="20"/>
+        </w:rPr>
+        <w:t xml:space="preserve"> checks if the current row's </w:t>
+      </w:r>
+      <w:r>
+        <w:rPr>
+          <w:rFonts w:ascii="Courier New" w:hAnsi="Courier New"/>
+          <w:color w:val="8B0000"/>
+          <w:sz w:val="20"/>
+        </w:rPr>
+        <w:t>SeverityRank__c</w:t>
+      </w:r>
+      <w:r>
+        <w:rPr>
+          <w:sz w:val="20"/>
+        </w:rPr>
+        <w:t xml:space="preserve"> differs from the previous row and renders the divider. CSS only - no new component or state required. Static labels, not collapsible sections.</w:t>
+      </w:r>
+    </w:p>
+    <w:p>
+      <w:pPr>
+        <w:pStyle w:val="ListBullet"/>
+      </w:pPr>
+      <w:r>
+        <w:rPr>
+          <w:rFonts w:ascii="Courier New" w:hAnsi="Courier New"/>
+          <w:color w:val="8B0000"/>
+          <w:sz w:val="20"/>
+        </w:rPr>
         <w:t>template:for:each</w:t>
       </w:r>
       <w:r>
@@ -18137,7 +18469,72 @@
         <w:rPr>
           <w:sz w:val="20"/>
         </w:rPr>
-        <w:t>Row actions: View Details, Acknowledge, Mark Remediated, Mark False Positive, Accept Risk</w:t>
+        <w:t xml:space="preserve">Row actions: </w:t>
+      </w:r>
+      <w:r>
+        <w:rPr>
+          <w:b/>
+          <w:sz w:val="20"/>
+        </w:rPr>
+        <w:t>View Details</w:t>
+      </w:r>
+      <w:r>
+        <w:rPr>
+          <w:sz w:val="20"/>
+        </w:rPr>
+        <w:t xml:space="preserve"> and </w:t>
+      </w:r>
+      <w:r>
+        <w:rPr>
+          <w:b/>
+          <w:sz w:val="20"/>
+        </w:rPr>
+        <w:t>Acknowledge</w:t>
+      </w:r>
+      <w:r>
+        <w:rPr>
+          <w:sz w:val="20"/>
+        </w:rPr>
+        <w:t xml:space="preserve"> execute immediately (safe, non-destructive). </w:t>
+      </w:r>
+      <w:r>
+        <w:rPr>
+          <w:b/>
+          <w:sz w:val="20"/>
+        </w:rPr>
+        <w:t>Mark Remediated</w:t>
+      </w:r>
+      <w:r>
+        <w:rPr>
+          <w:sz w:val="20"/>
+        </w:rPr>
+        <w:t xml:space="preserve">, </w:t>
+      </w:r>
+      <w:r>
+        <w:rPr>
+          <w:b/>
+          <w:sz w:val="20"/>
+        </w:rPr>
+        <w:t>Mark False Positive</w:t>
+      </w:r>
+      <w:r>
+        <w:rPr>
+          <w:sz w:val="20"/>
+        </w:rPr>
+        <w:t xml:space="preserve">, and </w:t>
+      </w:r>
+      <w:r>
+        <w:rPr>
+          <w:b/>
+          <w:sz w:val="20"/>
+        </w:rPr>
+        <w:t>Accept Risk</w:t>
+      </w:r>
+      <w:r>
+        <w:rPr>
+          <w:sz w:val="20"/>
+        </w:rPr>
+        <w:t xml:space="preserve"> open the detail panel's Status tab with the target status pre-selected - they do NOT execute in one click. This enforces the note requirement for Risk Accepted/False Positive and prevents accidental score changes from a mis-click.</w:t>
       </w:r>
     </w:p>
     <w:p>
@@ -18528,7 +18925,7 @@
         <w:rPr>
           <w:sz w:val="20"/>
         </w:rPr>
-        <w:t>): what was detected and why it matters. Truncated at 300 chars with "Read more" expander.</w:t>
+        <w:t>): what was detected and why it matters. Shown in full - no truncation. At 45% panel width (~600px on 1440px screen), even 800-char descriptions render as ~10 lines within the scrollable panel. Impact and Remediation have distinct visual containers (amber box, shade box) that clearly delimit the end of Description - no ambiguity without truncation. Add truncation in v2 only if CMT descriptions exceed 2,000 characters.</w:t>
       </w:r>
     </w:p>
     <w:p>
@@ -18687,7 +19084,7 @@
         <w:rPr>
           <w:sz w:val="20"/>
         </w:rPr>
-        <w:t>Status change form with allowed next-states (state machine enforced)</w:t>
+        <w:t>Status change form showing only valid next-states (state machine enforced - render only allowed transitions as radio buttons, never all 5 values)</w:t>
       </w:r>
     </w:p>
     <w:p>
@@ -18698,7 +19095,7 @@
         <w:rPr>
           <w:sz w:val="20"/>
         </w:rPr>
-        <w:t>Note field (required for Risk Accepted and False Positive)</w:t>
+        <w:t>Allowed transitions:</w:t>
       </w:r>
     </w:p>
     <w:p>
@@ -18707,6 +19104,72 @@
       </w:pPr>
       <w:r>
         <w:rPr>
+          <w:sz w:val="20"/>
+        </w:rPr>
+        <w:t>Open -&gt; Acknowledged, Remediated, Risk Accepted, False Positive</w:t>
+      </w:r>
+    </w:p>
+    <w:p>
+      <w:pPr>
+        <w:pStyle w:val="ListBullet"/>
+      </w:pPr>
+      <w:r>
+        <w:rPr>
+          <w:sz w:val="20"/>
+        </w:rPr>
+        <w:t>Acknowledged -&gt; Remediated, Risk Accepted, False Positive</w:t>
+      </w:r>
+    </w:p>
+    <w:p>
+      <w:pPr>
+        <w:pStyle w:val="ListBullet"/>
+      </w:pPr>
+      <w:r>
+        <w:rPr>
+          <w:sz w:val="20"/>
+        </w:rPr>
+        <w:t>Remediated -&gt; Open (reopen if fix was reverted)</w:t>
+      </w:r>
+    </w:p>
+    <w:p>
+      <w:pPr>
+        <w:pStyle w:val="ListBullet"/>
+      </w:pPr>
+      <w:r>
+        <w:rPr>
+          <w:sz w:val="20"/>
+        </w:rPr>
+        <w:t>Risk Accepted -&gt; Open (revoke acceptance)</w:t>
+      </w:r>
+    </w:p>
+    <w:p>
+      <w:pPr>
+        <w:pStyle w:val="ListBullet"/>
+      </w:pPr>
+      <w:r>
+        <w:rPr>
+          <w:sz w:val="20"/>
+        </w:rPr>
+        <w:t>False Positive -&gt; Open (reconsider classification)</w:t>
+      </w:r>
+    </w:p>
+    <w:p>
+      <w:pPr>
+        <w:pStyle w:val="ListBullet"/>
+      </w:pPr>
+      <w:r>
+        <w:rPr>
+          <w:sz w:val="20"/>
+        </w:rPr>
+        <w:t>Note field (required for Risk Accepted and False Positive - Save button disabled until note is entered for these two transitions)</w:t>
+      </w:r>
+    </w:p>
+    <w:p>
+      <w:pPr>
+        <w:pStyle w:val="ListBullet"/>
+      </w:pPr>
+      <w:r>
+        <w:rPr>
           <w:b/>
           <w:sz w:val="20"/>
         </w:rPr>
@@ -19075,6 +19538,56 @@
           <w:sz w:val="20"/>
         </w:rPr>
         <w:t xml:space="preserve"> destroys and recreates the DOM, resetting native browser scroll position to the top. CSS visibility toggle keeps the list DOM alive and preserves scroll position so the admin returns to finding #85 after closing the overlay, not to finding #1.</w:t>
+      </w:r>
+    </w:p>
+    <w:p>
+      <w:pPr>
+        <w:pStyle w:val="ListBullet"/>
+      </w:pPr>
+      <w:r>
+        <w:rPr>
+          <w:sz w:val="20"/>
+        </w:rPr>
+        <w:t>Below 768px: Add a visible "Back to findings" text link directly below the Close X button in the detail panel. Minimum 44x44px touch target per WCAG 2.1. Sized for thumb tap. Renders in addition to (not replacing) the Close X.</w:t>
+      </w:r>
+    </w:p>
+    <w:p>
+      <w:pPr>
+        <w:pStyle w:val="ListBullet"/>
+      </w:pPr>
+      <w:r>
+        <w:rPr>
+          <w:sz w:val="20"/>
+        </w:rPr>
+        <w:t>Below 768px: Device back button support - push a fake history entry (</w:t>
+      </w:r>
+      <w:r>
+        <w:rPr>
+          <w:rFonts w:ascii="Courier New" w:hAnsi="Courier New"/>
+          <w:color w:val="8B0000"/>
+          <w:sz w:val="20"/>
+        </w:rPr>
+        <w:t>history.pushState</w:t>
+      </w:r>
+      <w:r>
+        <w:rPr>
+          <w:sz w:val="20"/>
+        </w:rPr>
+        <w:t xml:space="preserve">) when the detail panel opens; listen for </w:t>
+      </w:r>
+      <w:r>
+        <w:rPr>
+          <w:rFonts w:ascii="Courier New" w:hAnsi="Courier New"/>
+          <w:color w:val="8B0000"/>
+          <w:sz w:val="20"/>
+        </w:rPr>
+        <w:t>popstate</w:t>
+      </w:r>
+      <w:r>
+        <w:rPr>
+          <w:sz w:val="20"/>
+        </w:rPr>
+        <w:t xml:space="preserve"> to trigger the panel close handler. Android back button and iOS swipe-back then close the panel naturally. Swipe-to-dismiss gesture is v2 (complex in LWC shadow DOM).</w:t>
       </w:r>
     </w:p>
     <w:p>

</xml_diff>

<commit_message>
Apply final review fixes: localStorage -> component state, server-side status transition validation, getScoreCounts bulk test
</commit_message>
<xml_diff>
--- a/projects/org-security-scanner/Org Security Scanner - Technical Plan.docx
+++ b/projects/org-security-scanner/Org Security Scanner - Technical Plan.docx
@@ -17628,7 +17628,7 @@
         <w:rPr>
           <w:sz w:val="20"/>
         </w:rPr>
-        <w:t xml:space="preserve">Width reduced from 320px to 260px. At 1366px viewport (common in government/NGO), the Salesforce nav (~220px) + 320px left panel + 45% detail panel (~515px) leaves only ~311px for the findings list - unusable. At 260px the findings list retains ~371px with the detail panel open, which is workable. The panel has a collapse toggle arrow on its right edge; when collapsed it renders as a 40px icon strip so admins working in the detail panel can recover full width. Collapsed state persisted to </w:t>
+        <w:t xml:space="preserve">Width reduced from 320px to 260px. At 1366px viewport (common in government/NGO), the Salesforce nav (~220px) + 320px left panel + 45% detail panel (~515px) leaves only ~311px for the findings list - unusable. At 260px the findings list retains ~371px with the detail panel open, which is workable. The panel has a collapse toggle arrow on its right edge; when collapsed it renders as a 40px icon strip so admins working in the detail panel can recover full width. Collapsed state is component-level only and resets to expanded on page reload. </w:t>
       </w:r>
       <w:r>
         <w:rPr>
@@ -17642,7 +17642,7 @@
         <w:rPr>
           <w:sz w:val="20"/>
         </w:rPr>
-        <w:t xml:space="preserve"> across sessions.</w:t>
+        <w:t xml:space="preserve"> is not used - it is namespace-scoped under LWS and blocked by CSP in some enterprise orgs, causing a silent failure. Cross-session persistence is not worth the compatibility risk for a convenience toggle.</w:t>
       </w:r>
     </w:p>
     <w:p>
@@ -23086,7 +23086,49 @@
         <w:rPr>
           <w:sz w:val="20"/>
         </w:rPr>
-        <w:t xml:space="preserve"> - NOT cacheable (mutation). Returns updated record.</w:t>
+        <w:t xml:space="preserve"> - NOT cacheable (mutation). Server-side validates the status transition: query current </w:t>
+      </w:r>
+      <w:r>
+        <w:rPr>
+          <w:rFonts w:ascii="Courier New" w:hAnsi="Courier New"/>
+          <w:color w:val="8B0000"/>
+          <w:sz w:val="20"/>
+        </w:rPr>
+        <w:t>Status__c</w:t>
+      </w:r>
+      <w:r>
+        <w:rPr>
+          <w:sz w:val="20"/>
+        </w:rPr>
+        <w:t xml:space="preserve">, check requested transition against the allowed-transition map (same logic as the UI state machine). If invalid: return </w:t>
+      </w:r>
+      <w:r>
+        <w:rPr>
+          <w:rFonts w:ascii="Courier New" w:hAnsi="Courier New"/>
+          <w:color w:val="8B0000"/>
+          <w:sz w:val="20"/>
+        </w:rPr>
+        <w:t>SecScanApiResponse</w:t>
+      </w:r>
+      <w:r>
+        <w:rPr>
+          <w:sz w:val="20"/>
+        </w:rPr>
+        <w:t xml:space="preserve"> with </w:t>
+      </w:r>
+      <w:r>
+        <w:rPr>
+          <w:rFonts w:ascii="Courier New" w:hAnsi="Courier New"/>
+          <w:color w:val="8B0000"/>
+          <w:sz w:val="20"/>
+        </w:rPr>
+        <w:t>errorMessage = 'Invalid status transition from [current] to [requested]'</w:t>
+      </w:r>
+      <w:r>
+        <w:rPr>
+          <w:sz w:val="20"/>
+        </w:rPr>
+        <w:t xml:space="preserve"> - do not throw, return typed error so the LWC can display it non-destructively. Returns updated record on success.</w:t>
       </w:r>
     </w:p>
     <w:p>
@@ -27767,6 +27809,106 @@
                 <w:sz w:val="18"/>
               </w:rPr>
               <w:t xml:space="preserve"> unchanged (Acknowledged is not excluded from score).</w:t>
+            </w:r>
+          </w:p>
+        </w:tc>
+      </w:tr>
+      <w:tr>
+        <w:tc>
+          <w:tcPr>
+            <w:tcW w:type="dxa" w:w="4703"/>
+            <w:vAlign w:val="center"/>
+          </w:tcPr>
+          <w:p>
+            <w:pPr>
+              <w:jc w:val="left"/>
+            </w:pPr>
+            <w:r>
+              <w:rPr>
+                <w:rFonts w:ascii="Courier New" w:hAnsi="Courier New"/>
+                <w:color w:val="8B0000"/>
+                <w:sz w:val="18"/>
+              </w:rPr>
+              <w:t>getScoreCounts()</w:t>
+            </w:r>
+            <w:r>
+              <w:rPr>
+                <w:sz w:val="18"/>
+              </w:rPr>
+              <w:t xml:space="preserve"> after bulk status change</w:t>
+            </w:r>
+          </w:p>
+        </w:tc>
+        <w:tc>
+          <w:tcPr>
+            <w:tcW w:type="dxa" w:w="4703"/>
+            <w:vAlign w:val="center"/>
+          </w:tcPr>
+          <w:p>
+            <w:pPr>
+              <w:jc w:val="left"/>
+            </w:pPr>
+            <w:r>
+              <w:rPr>
+                <w:sz w:val="18"/>
+              </w:rPr>
+              <w:t xml:space="preserve">Create 10 findings (5 Critical, 5 High). Bulk-update all 10 to Remediated via </w:t>
+            </w:r>
+            <w:r>
+              <w:rPr>
+                <w:rFonts w:ascii="Courier New" w:hAnsi="Courier New"/>
+                <w:color w:val="8B0000"/>
+                <w:sz w:val="18"/>
+              </w:rPr>
+              <w:t>bulkUpdateFindingStatus</w:t>
+            </w:r>
+            <w:r>
+              <w:rPr>
+                <w:sz w:val="18"/>
+              </w:rPr>
+              <w:t xml:space="preserve">. Call </w:t>
+            </w:r>
+            <w:r>
+              <w:rPr>
+                <w:rFonts w:ascii="Courier New" w:hAnsi="Courier New"/>
+                <w:color w:val="8B0000"/>
+                <w:sz w:val="18"/>
+              </w:rPr>
+              <w:t>getScoreCounts(runId)</w:t>
+            </w:r>
+            <w:r>
+              <w:rPr>
+                <w:sz w:val="18"/>
+              </w:rPr>
+              <w:t xml:space="preserve">. Verify </w:t>
+            </w:r>
+            <w:r>
+              <w:rPr>
+                <w:rFonts w:ascii="Courier New" w:hAnsi="Courier New"/>
+                <w:color w:val="8B0000"/>
+                <w:sz w:val="18"/>
+              </w:rPr>
+              <w:t>criticalOpen</w:t>
+            </w:r>
+            <w:r>
+              <w:rPr>
+                <w:sz w:val="18"/>
+              </w:rPr>
+              <w:t xml:space="preserve"> = originalCritical - 5, </w:t>
+            </w:r>
+            <w:r>
+              <w:rPr>
+                <w:rFonts w:ascii="Courier New" w:hAnsi="Courier New"/>
+                <w:color w:val="8B0000"/>
+                <w:sz w:val="18"/>
+              </w:rPr>
+              <w:t>highOpen</w:t>
+            </w:r>
+            <w:r>
+              <w:rPr>
+                <w:sz w:val="18"/>
+              </w:rPr>
+              <w:t xml:space="preserve"> = originalHigh - 5. Validates aggregate counts are correct after bulk DML, including partial-failure edge case if FLS drops some records.</w:t>
             </w:r>
           </w:p>
         </w:tc>

</xml_diff>

<commit_message>
Apply technical fixes: CSV heap guard pre-emptive, cascade delete justification corrected, SeverityRank physical field promoted to v1, session ID risk language hardened, CSS toggle memory note
</commit_message>
<xml_diff>
--- a/projects/org-security-scanner/Org Security Scanner - Technical Plan.docx
+++ b/projects/org-security-scanner/Org Security Scanner - Technical Plan.docx
@@ -2607,7 +2607,24 @@
               <w:rPr>
                 <w:sz w:val="18"/>
               </w:rPr>
-              <w:t xml:space="preserve">Formula (Number 1,0): </w:t>
+              <w:t>Number(1,0)</w:t>
+            </w:r>
+          </w:p>
+        </w:tc>
+        <w:tc>
+          <w:tcPr>
+            <w:tcW w:type="dxa" w:w="2351"/>
+            <w:vAlign w:val="center"/>
+          </w:tcPr>
+          <w:p>
+            <w:pPr>
+              <w:jc w:val="left"/>
+            </w:pPr>
+            <w:r>
+              <w:rPr>
+                <w:sz w:val="18"/>
+              </w:rPr>
+              <w:t xml:space="preserve">Numeric severity proxy for deterministic severity-first KEYSET sort: Critical=1, High=2, Medium=3, Low=4, Informational=5. Physical field (not formula) - formula fields cannot be custom-indexed and ORDER BY on a formula against 9,000+ rows degrades sort performance. Set once at insert time by </w:t>
             </w:r>
             <w:r>
               <w:rPr>
@@ -2615,24 +2632,13 @@
                 <w:color w:val="8B0000"/>
                 <w:sz w:val="18"/>
               </w:rPr>
-              <w:t>CASE(Severity__c,'Critical',1,'High',2,'Medium',3,'Low',4,'Informational',5,6)</w:t>
-            </w:r>
-          </w:p>
-        </w:tc>
-        <w:tc>
-          <w:tcPr>
-            <w:tcW w:type="dxa" w:w="2351"/>
-            <w:vAlign w:val="center"/>
-          </w:tcPr>
-          <w:p>
-            <w:pPr>
-              <w:jc w:val="left"/>
-            </w:pPr>
-            <w:r>
-              <w:rPr>
-                <w:sz w:val="18"/>
-              </w:rPr>
-              <w:t>Numeric severity proxy for deterministic severity-first KEYSET sort. Picklist alphabetical order (C/H/I/L/M) does not match severity order (C/H/M/L/I) - formula field is required.</w:t>
+              <w:t>buildFinding()</w:t>
+            </w:r>
+            <w:r>
+              <w:rPr>
+                <w:sz w:val="18"/>
+              </w:rPr>
+              <w:t>. Can receive a custom Salesforce index if needed at production volumes.</w:t>
             </w:r>
           </w:p>
         </w:tc>
@@ -11025,7 +11031,7 @@
         <w:rPr>
           <w:sz w:val="20"/>
         </w:rPr>
-        <w:t xml:space="preserve"> In some org configurations (stricter Connected App policies, Enhanced Domains with API restrictions), the session token obtained from an </w:t>
+        <w:t xml:space="preserve"> Production orgs with standard security hardening (IP locking, "Lock sessions to the IP address from which they originated," "Require HttpOnly attribute," Enhanced Domains with API restrictions) will return </w:t>
       </w:r>
       <w:r>
         <w:rPr>
@@ -11033,27 +11039,13 @@
           <w:color w:val="8B0000"/>
           <w:sz w:val="20"/>
         </w:rPr>
-        <w:t>@AuraEnabled</w:t>
-      </w:r>
-      <w:r>
-        <w:rPr>
-          <w:sz w:val="20"/>
-        </w:rPr>
-        <w:t xml:space="preserve"> method may return </w:t>
-      </w:r>
-      <w:r>
-        <w:rPr>
-          <w:rFonts w:ascii="Courier New" w:hAnsi="Courier New"/>
-          <w:color w:val="8B0000"/>
-          <w:sz w:val="20"/>
-        </w:rPr>
         <w:t>INVALID_SESSION_ID</w:t>
       </w:r>
       <w:r>
         <w:rPr>
           <w:sz w:val="20"/>
         </w:rPr>
-        <w:t xml:space="preserve"> when used against the Tooling API. The LWC -&gt; @AuraEnabled -&gt; same-org Tooling API loopback pattern is used by Salesforce-labs tools (e.g. OrgCheck) and works in most sandbox configurations, but is not guaranteed.</w:t>
+        <w:t xml:space="preserve"> immediately when the Lightning session token is used against the Tooling API. This is not a rare edge case - it is the expected behavior in most well-secured orgs. The LWC -&gt; @AuraEnabled -&gt; same-org Tooling API loopback works in developer sandboxes and orgs with relaxed session security, but should not be assumed to work in production. The v1 build targets developer sandboxes; the Named Credential pattern below must be implemented before deploying to hardened orgs or production.</w:t>
       </w:r>
     </w:p>
     <w:p>
@@ -13580,7 +13572,7 @@
         <w:rPr>
           <w:sz w:val="20"/>
         </w:rPr>
-        <w:t xml:space="preserve"> Inline cascade-delete of parent </w:t>
+        <w:t xml:space="preserve"> Salesforce cascade deletes on Master-Detail do NOT count toward the Apex DML row limit - the platform handles them implicitly. However, the Batchable pattern is still required for a different reason: before/after delete triggers on </w:t>
       </w:r>
       <w:r>
         <w:rPr>
@@ -13588,41 +13580,13 @@
           <w:color w:val="8B0000"/>
           <w:sz w:val="20"/>
         </w:rPr>
-        <w:t>SecurityScanRun__c</w:t>
-      </w:r>
-      <w:r>
-        <w:rPr>
-          <w:sz w:val="20"/>
-        </w:rPr>
-        <w:t xml:space="preserve"> records counts all child </w:t>
-      </w:r>
-      <w:r>
-        <w:rPr>
-          <w:rFonts w:ascii="Courier New" w:hAnsi="Courier New"/>
-          <w:color w:val="8B0000"/>
-          <w:sz w:val="20"/>
-        </w:rPr>
         <w:t>SecurityFinding__c</w:t>
       </w:r>
       <w:r>
         <w:rPr>
           <w:sz w:val="20"/>
         </w:rPr>
-        <w:t xml:space="preserve"> deletions against the Apex DML row limit (10,000 max). 5 runs x 2,500+ findings = 12,500 implicit row deletes - instant </w:t>
-      </w:r>
-      <w:r>
-        <w:rPr>
-          <w:rFonts w:ascii="Courier New" w:hAnsi="Courier New"/>
-          <w:color w:val="8B0000"/>
-          <w:sz w:val="20"/>
-        </w:rPr>
-        <w:t>LimitException</w:t>
-      </w:r>
-      <w:r>
-        <w:rPr>
-          <w:sz w:val="20"/>
-        </w:rPr>
-        <w:t>. The Batchable processes each old run in its own batch transaction, with explicit child deletion first.</w:t>
+        <w:t xml:space="preserve"> fire on cascade-deleted records. If a trigger performs SOQL or DML (even indirectly via process builders, flows, or workflow rules), those operations run in the calling transaction. Deleting 5 runs x 2,500+ findings inline means thousands of trigger executions in one transaction - exhausting SOQL limits, CPU time, or other limits the trigger code consumes. The Batchable processes each run in its own transaction, isolating trigger overhead per run. Explicit child deletion first (before parent) is retained for clarity and trigger control.</w:t>
       </w:r>
     </w:p>
     <w:p>
@@ -19537,7 +19501,62 @@
         <w:rPr>
           <w:sz w:val="20"/>
         </w:rPr>
-        <w:t xml:space="preserve"> destroys and recreates the DOM, resetting native browser scroll position to the top. CSS visibility toggle keeps the list DOM alive and preserves scroll position so the admin returns to finding #85 after closing the overlay, not to finding #1.</w:t>
+        <w:t xml:space="preserve"> destroys and recreates the DOM, resetting native browser scroll position to the top. CSS visibility toggle keeps the list DOM alive and preserves scroll position so the admin returns to finding #85 after closing the overlay, not to finding #1. </w:t>
+      </w:r>
+      <w:r>
+        <w:rPr>
+          <w:b/>
+          <w:sz w:val="20"/>
+        </w:rPr>
+        <w:t>Memory note:</w:t>
+      </w:r>
+      <w:r>
+        <w:rPr>
+          <w:sz w:val="20"/>
+        </w:rPr>
+        <w:t xml:space="preserve"> when the admin has loaded 5+ pages (500+ findings), keeping all finding rows in the DOM on mobile creates memory pressure. If mobile performance degrades in testing, v2 mitigation: store </w:t>
+      </w:r>
+      <w:r>
+        <w:rPr>
+          <w:rFonts w:ascii="Courier New" w:hAnsi="Courier New"/>
+          <w:color w:val="8B0000"/>
+          <w:sz w:val="20"/>
+        </w:rPr>
+        <w:t>window.scrollY</w:t>
+      </w:r>
+      <w:r>
+        <w:rPr>
+          <w:sz w:val="20"/>
+        </w:rPr>
+        <w:t xml:space="preserve"> before toggling </w:t>
+      </w:r>
+      <w:r>
+        <w:rPr>
+          <w:rFonts w:ascii="Courier New" w:hAnsi="Courier New"/>
+          <w:color w:val="8B0000"/>
+          <w:sz w:val="20"/>
+        </w:rPr>
+        <w:t>if:true/false</w:t>
+      </w:r>
+      <w:r>
+        <w:rPr>
+          <w:sz w:val="20"/>
+        </w:rPr>
+        <w:t xml:space="preserve">, restore it in </w:t>
+      </w:r>
+      <w:r>
+        <w:rPr>
+          <w:rFonts w:ascii="Courier New" w:hAnsi="Courier New"/>
+          <w:color w:val="8B0000"/>
+          <w:sz w:val="20"/>
+        </w:rPr>
+        <w:t>renderedCallback</w:t>
+      </w:r>
+      <w:r>
+        <w:rPr>
+          <w:sz w:val="20"/>
+        </w:rPr>
+        <w:t xml:space="preserve"> after re-render. This eliminates the large hidden DOM at the cost of a brief scroll-restore flash.</w:t>
       </w:r>
     </w:p>
     <w:p>
@@ -22592,13 +22611,13 @@
           <w:b/>
           <w:sz w:val="20"/>
         </w:rPr>
-        <w:t>Size guard:</w:t>
-      </w:r>
-      <w:r>
-        <w:rPr>
-          <w:sz w:val="20"/>
-        </w:rPr>
-        <w:t xml:space="preserve"> ContentVersion body limit is ~37MB. After building the CSV string, check </w:t>
+        <w:t>Size guard - pre-emptive, not post-build:</w:t>
+      </w:r>
+      <w:r>
+        <w:rPr>
+          <w:sz w:val="20"/>
+        </w:rPr>
+        <w:t xml:space="preserve"> The synchronous Apex heap limit is 6MB. Building a large CSV string and then checking its length is too late - the heap already crashed. Guard must run BEFORE building: count findings via </w:t>
       </w:r>
       <w:r>
         <w:rPr>
@@ -22606,13 +22625,13 @@
           <w:color w:val="8B0000"/>
           <w:sz w:val="20"/>
         </w:rPr>
-        <w:t>csvBody.length() &gt; 30000000</w:t>
-      </w:r>
-      <w:r>
-        <w:rPr>
-          <w:sz w:val="20"/>
-        </w:rPr>
-        <w:t xml:space="preserve"> (30MB safety margin). If exceeded: truncate </w:t>
+        <w:t>SELECT COUNT()</w:t>
+      </w:r>
+      <w:r>
+        <w:rPr>
+          <w:sz w:val="20"/>
+        </w:rPr>
+        <w:t xml:space="preserve">. If count &gt; 3000 (conservative threshold - 3000 x ~2KB average = ~6MB), truncate </w:t>
       </w:r>
       <w:r>
         <w:rPr>
@@ -22654,7 +22673,7 @@
         <w:rPr>
           <w:sz w:val="20"/>
         </w:rPr>
-        <w:t xml:space="preserve"> to 500 chars each and append </w:t>
+        <w:t xml:space="preserve"> to 500 chars each for all findings before building any string. Append </w:t>
       </w:r>
       <w:r>
         <w:rPr>
@@ -22668,7 +22687,7 @@
         <w:rPr>
           <w:sz w:val="20"/>
         </w:rPr>
-        <w:t xml:space="preserve">, then rebuild and save. Document this in the ContentVersion </w:t>
+        <w:t xml:space="preserve"> to each truncated field. Document this in the ContentVersion </w:t>
       </w:r>
       <w:r>
         <w:rPr>
@@ -22682,7 +22701,7 @@
         <w:rPr>
           <w:sz w:val="20"/>
         </w:rPr>
-        <w:t xml:space="preserve"> field: "Full text columns truncated - finding count exceeded 30MB export limit." At typical v1 volumes (under 1,000 findings at 2KB/finding average) this guard will never fire; it is required for production orgs with verbose CMT definitions and large finding sets.</w:t>
+        <w:t xml:space="preserve"> field: "Text columns truncated - finding count exceeded safe export threshold." At typical v1 volumes (under 1,000 findings) this guard will never fire.</w:t>
       </w:r>
     </w:p>
     <w:p>
@@ -24149,7 +24168,7 @@
               <w:rPr>
                 <w:sz w:val="18"/>
               </w:rPr>
-              <w:t xml:space="preserve"> is a Formula field (not indexed)</w:t>
+              <w:t xml:space="preserve"> as physical field</w:t>
             </w:r>
           </w:p>
         </w:tc>
@@ -24162,42 +24181,19 @@
             <w:pPr>
               <w:jc w:val="left"/>
             </w:pPr>
-            <w:r>
-              <w:rPr>
-                <w:sz w:val="18"/>
-              </w:rPr>
-              <w:t xml:space="preserve">KEYSET pagination sorts on </w:t>
-            </w:r>
             <w:r>
               <w:rPr>
                 <w:rFonts w:ascii="Courier New" w:hAnsi="Courier New"/>
                 <w:color w:val="8B0000"/>
                 <w:sz w:val="18"/>
               </w:rPr>
-              <w:t>SeverityRank__c ASC, Id ASC</w:t>
-            </w:r>
-            <w:r>
-              <w:rPr>
-                <w:sz w:val="18"/>
-              </w:rPr>
-              <w:t xml:space="preserve"> - formula fields cannot have a custom Salesforce index; Salesforce cannot index computed columns. At sandbox volumes (hundreds of findings per run) this is imperceptible. At 10,000+ findings per run the sort may slow.</w:t>
-            </w:r>
-          </w:p>
-        </w:tc>
-        <w:tc>
-          <w:tcPr>
-            <w:tcW w:type="dxa" w:w="3135"/>
-            <w:vAlign w:val="center"/>
-          </w:tcPr>
-          <w:p>
-            <w:pPr>
-              <w:jc w:val="left"/>
-            </w:pPr>
-            <w:r>
-              <w:rPr>
-                <w:sz w:val="18"/>
-              </w:rPr>
-              <w:t xml:space="preserve">v2: replace with a physical </w:t>
+              <w:t>buildFinding()</w:t>
+            </w:r>
+            <w:r>
+              <w:rPr>
+                <w:sz w:val="18"/>
+              </w:rPr>
+              <w:t xml:space="preserve"> stamps a physical </w:t>
             </w:r>
             <w:r>
               <w:rPr>
@@ -24205,13 +24201,13 @@
                 <w:color w:val="8B0000"/>
                 <w:sz w:val="18"/>
               </w:rPr>
-              <w:t>Number(1,0)</w:t>
-            </w:r>
-            <w:r>
-              <w:rPr>
-                <w:sz w:val="18"/>
-              </w:rPr>
-              <w:t xml:space="preserve"> field populated by </w:t>
+              <w:t>Number(1,0) SeverityRank__c</w:t>
+            </w:r>
+            <w:r>
+              <w:rPr>
+                <w:sz w:val="18"/>
+              </w:rPr>
+              <w:t xml:space="preserve"> field based on the severity string. The formula field approach was replaced in v1: formula fields cannot be custom-indexed; ORDER BY on an unindexed formula against 9,000+ findings per run degrades sort performance. Physical field can receive a custom index and is set once at insert time by </w:t>
             </w:r>
             <w:r>
               <w:rPr>
@@ -24225,9 +24221,29 @@
               <w:rPr>
                 <w:sz w:val="18"/>
               </w:rPr>
-              <w:t xml:space="preserve"> - this can receive a custom index. Keep the formula field as a read-only UI convenience.</w:t>
-            </w:r>
-          </w:p>
+              <w:t xml:space="preserve"> - no formula computation at query time. The explicit mapping in </w:t>
+            </w:r>
+            <w:r>
+              <w:rPr>
+                <w:rFonts w:ascii="Courier New" w:hAnsi="Courier New"/>
+                <w:color w:val="8B0000"/>
+                <w:sz w:val="18"/>
+              </w:rPr>
+              <w:t>buildFinding()</w:t>
+            </w:r>
+            <w:r>
+              <w:rPr>
+                <w:sz w:val="18"/>
+              </w:rPr>
+              <w:t>: Critical=1, High=2, Medium=3, Low=4, Informational=5. No formula field needed.</w:t>
+            </w:r>
+          </w:p>
+        </w:tc>
+        <w:tc>
+          <w:tcPr>
+            <w:tcW w:type="dxa" w:w="3135"/>
+          </w:tcPr>
+          <w:p/>
         </w:tc>
       </w:tr>
     </w:tbl>

</xml_diff>

<commit_message>
Add Unlocked Package config: sfdx-project.json, PostInstallHandler, PostUninstallHandler, package lifecycle commands
</commit_message>
<xml_diff>
--- a/projects/org-security-scanner/Org Security Scanner - Technical Plan.docx
+++ b/projects/org-security-scanner/Org Security Scanner - Technical Plan.docx
@@ -9807,7 +9807,7 @@
           <w:color w:val="000080"/>
           <w:sz w:val="17"/>
         </w:rPr>
-        <w:t xml:space="preserve">                                    accumulate indefinitely. Schedule at installation: daily at 02:00.</w:t>
+        <w:t xml:space="preserve">                                    accumulate indefinitely. Scheduled automatically by</w:t>
       </w:r>
     </w:p>
     <w:p>
@@ -9822,7 +9822,7 @@
           <w:color w:val="000080"/>
           <w:sz w:val="17"/>
         </w:rPr>
-        <w:t xml:space="preserve">                                    System.schedule('SecScan Nightly Cleanup', '0 0 2 * * ?',</w:t>
+        <w:t xml:space="preserve">                                    SecScanPostInstallHandler on package install/upgrade.</w:t>
       </w:r>
     </w:p>
     <w:p>
@@ -9837,7 +9837,7 @@
           <w:color w:val="000080"/>
           <w:sz w:val="17"/>
         </w:rPr>
-        <w:t xml:space="preserve">                                        new SecScanOrphanCleanupSchedulable());</w:t>
+        <w:t>SecScanPostInstallHandler.cls     - Implements InstallHandler. Runs on fresh install AND upgrade.</w:t>
       </w:r>
     </w:p>
     <w:p>
@@ -9852,7 +9852,7 @@
           <w:color w:val="000080"/>
           <w:sz w:val="17"/>
         </w:rPr>
-        <w:t>SecScanRunnerContinuation.cls     - Heap-safe continuation Queueable for AA and LA runners</w:t>
+        <w:t xml:space="preserve">                                    On install: System.schedule('SecScan Nightly Cleanup',</w:t>
       </w:r>
     </w:p>
     <w:p>
@@ -9867,7 +9867,7 @@
           <w:color w:val="000080"/>
           <w:sz w:val="17"/>
         </w:rPr>
-        <w:t xml:space="preserve">                                    Constructor: (Id scanRunId, List&lt;String&gt; runners, Integer currentIndex,</w:t>
+        <w:t xml:space="preserve">                                        '0 0 2 * * ?', new SecScanOrphanCleanupSchedulable()).</w:t>
       </w:r>
     </w:p>
     <w:p>
@@ -9882,7 +9882,7 @@
           <w:color w:val="000080"/>
           <w:sz w:val="17"/>
         </w:rPr>
-        <w:t xml:space="preserve">                                    String sessionId, Integer pageOffset)</w:t>
+        <w:t xml:space="preserve">                                    On upgrade: abort existing job first (query CronTrigger for</w:t>
       </w:r>
     </w:p>
     <w:p>
@@ -9897,7 +9897,7 @@
           <w:color w:val="000080"/>
           <w:sz w:val="17"/>
         </w:rPr>
-        <w:t xml:space="preserve">                                    execute() MUST check Status__c for Cancelled first (same pattern as</w:t>
+        <w:t xml:space="preserve">                                    name = 'SecScan Nightly Cleanup'), then reschedule - prevents</w:t>
       </w:r>
     </w:p>
     <w:p>
@@ -9912,7 +9912,7 @@
           <w:color w:val="000080"/>
           <w:sz w:val="17"/>
         </w:rPr>
-        <w:t xml:space="preserve">                                    SecScanRunnerChain). Without this check, a cancelled scan that triggered</w:t>
+        <w:t xml:space="preserve">                                    duplicate scheduled jobs across package upgrades.</w:t>
       </w:r>
     </w:p>
     <w:p>
@@ -9927,7 +9927,7 @@
           <w:color w:val="000080"/>
           <w:sz w:val="17"/>
         </w:rPr>
-        <w:t xml:space="preserve">                                    a continuation still processes all remaining Tooling API pages (30+ seconds</w:t>
+        <w:t xml:space="preserve">                                    Returns silently on failure (cannot throw from InstallHandler -</w:t>
       </w:r>
     </w:p>
     <w:p>
@@ -9942,7 +9942,7 @@
           <w:color w:val="000080"/>
           <w:sz w:val="17"/>
         </w:rPr>
-        <w:t xml:space="preserve">                                    of wasted callouts and DML in large orgs) before the next chain link</w:t>
+        <w:t xml:space="preserve">                                    a thrown exception rolls back the install).</w:t>
       </w:r>
     </w:p>
     <w:p>
@@ -9957,7 +9957,7 @@
           <w:color w:val="000080"/>
           <w:sz w:val="17"/>
         </w:rPr>
-        <w:t xml:space="preserve">                                    checks and halts. Guard: query Status__c; if Cancelled, call</w:t>
+        <w:t>SecScanPostUninstallHandler.cls   - Implements UninstallHandler. Aborts the scheduled job on</w:t>
       </w:r>
     </w:p>
     <w:p>
@@ -9972,7 +9972,7 @@
           <w:color w:val="000080"/>
           <w:sz w:val="17"/>
         </w:rPr>
-        <w:t xml:space="preserve">                                    finalizeScan() and return without enqueueing the next chain link.</w:t>
+        <w:t xml:space="preserve">                                    package removal. Queries CronTrigger by name and calls</w:t>
       </w:r>
     </w:p>
     <w:p>
@@ -9987,7 +9987,7 @@
           <w:color w:val="000080"/>
           <w:sz w:val="17"/>
         </w:rPr>
-        <w:t xml:space="preserve">                                    Resumes Tooling API paging from pageOffset, saves additional findings,</w:t>
+        <w:t xml:space="preserve">                                    System.abortJob(). Silent on failure (job may already be absent).</w:t>
       </w:r>
     </w:p>
     <w:p>
@@ -10002,7 +10002,7 @@
           <w:color w:val="000080"/>
           <w:sz w:val="17"/>
         </w:rPr>
-        <w:t xml:space="preserve">                                    then calls System.enqueueJob(new SecScanRunnerChain(scanRunId, runners,</w:t>
+        <w:t>SecScanRunnerContinuation.cls     - Heap-safe continuation Queueable for AA and LA runners</w:t>
       </w:r>
     </w:p>
     <w:p>
@@ -10017,7 +10017,7 @@
           <w:color w:val="000080"/>
           <w:sz w:val="17"/>
         </w:rPr>
-        <w:t xml:space="preserve">                                    currentIndex + 1, sessionId)) to resume the main chain</w:t>
+        <w:t xml:space="preserve">                                    Constructor: (Id scanRunId, List&lt;String&gt; runners, Integer currentIndex,</w:t>
       </w:r>
     </w:p>
     <w:p>
@@ -10032,7 +10032,7 @@
           <w:color w:val="000080"/>
           <w:sz w:val="17"/>
         </w:rPr>
-        <w:t xml:space="preserve">                                    CRITICAL: must carry the full runner list and currentIndex - without</w:t>
+        <w:t xml:space="preserve">                                    String sessionId, Integer pageOffset)</w:t>
       </w:r>
     </w:p>
     <w:p>
@@ -10047,7 +10047,7 @@
           <w:color w:val="000080"/>
           <w:sz w:val="17"/>
         </w:rPr>
-        <w:t xml:space="preserve">                                    this, the chain terminates after the heap-overflow category</w:t>
+        <w:t xml:space="preserve">                                    execute() MUST check Status__c for Cancelled first (same pattern as</w:t>
       </w:r>
     </w:p>
     <w:p>
@@ -10062,6 +10062,7 @@
           <w:color w:val="000080"/>
           <w:sz w:val="17"/>
         </w:rPr>
+        <w:t xml:space="preserve">                                    SecScanRunnerChain). Without this check, a cancelled scan that triggered</w:t>
       </w:r>
     </w:p>
     <w:p>
@@ -10076,7 +10077,7 @@
           <w:color w:val="000080"/>
           <w:sz w:val="17"/>
         </w:rPr>
-        <w:t>13 Category Runners (each extends SecScanCategoryRunner):</w:t>
+        <w:t xml:space="preserve">                                    a continuation still processes all remaining Tooling API pages (30+ seconds</w:t>
       </w:r>
     </w:p>
     <w:p>
@@ -10091,7 +10092,7 @@
           <w:color w:val="000080"/>
           <w:sz w:val="17"/>
         </w:rPr>
-        <w:t xml:space="preserve">  SecScanRunnerUserAccess.cls         - UA  - 7 checks</w:t>
+        <w:t xml:space="preserve">                                    of wasted callouts and DML in large orgs) before the next chain link</w:t>
       </w:r>
     </w:p>
     <w:p>
@@ -10106,7 +10107,7 @@
           <w:color w:val="000080"/>
           <w:sz w:val="17"/>
         </w:rPr>
-        <w:t xml:space="preserve">  SecScanRunnerGuestUser.cls          - GU  - 15 checks (most API-intensive)</w:t>
+        <w:t xml:space="preserve">                                    checks and halts. Guard: query Status__c; if Cancelled, call</w:t>
       </w:r>
     </w:p>
     <w:p>
@@ -10121,7 +10122,7 @@
           <w:color w:val="000080"/>
           <w:sz w:val="17"/>
         </w:rPr>
-        <w:t xml:space="preserve">                                        CRITICAL: all 15 checks must operate on data fetched</w:t>
+        <w:t xml:space="preserve">                                    finalizeScan() and return without enqueueing the next chain link.</w:t>
       </w:r>
     </w:p>
     <w:p>
@@ -10136,7 +10137,7 @@
           <w:color w:val="000080"/>
           <w:sz w:val="17"/>
         </w:rPr>
-        <w:t xml:space="preserve">                                        in bulk - never one Tooling API call per profile per check.</w:t>
+        <w:t xml:space="preserve">                                    Resumes Tooling API paging from pageOffset, saves additional findings,</w:t>
       </w:r>
     </w:p>
     <w:p>
@@ -10151,7 +10152,7 @@
           <w:color w:val="000080"/>
           <w:sz w:val="17"/>
         </w:rPr>
-        <w:t xml:space="preserve">                                        Pattern: one query fetches all Guest profiles + permissions,</w:t>
+        <w:t xml:space="preserve">                                    then calls System.enqueueJob(new SecScanRunnerChain(scanRunId, runners,</w:t>
       </w:r>
     </w:p>
     <w:p>
@@ -10166,7 +10167,7 @@
           <w:color w:val="000080"/>
           <w:sz w:val="17"/>
         </w:rPr>
-        <w:t xml:space="preserve">                                        load into memory as Map&lt;Id, Map&lt;String,Object&gt;&gt;,</w:t>
+        <w:t xml:space="preserve">                                    currentIndex + 1, sessionId)) to resume the main chain</w:t>
       </w:r>
     </w:p>
     <w:p>
@@ -10181,7 +10182,7 @@
           <w:color w:val="000080"/>
           <w:sz w:val="17"/>
         </w:rPr>
-        <w:t xml:space="preserve">                                        run all 15 checks against the in-memory collection.</w:t>
+        <w:t xml:space="preserve">                                    CRITICAL: must carry the full runner list and currentIndex - without</w:t>
       </w:r>
     </w:p>
     <w:p>
@@ -10196,7 +10197,7 @@
           <w:color w:val="000080"/>
           <w:sz w:val="17"/>
         </w:rPr>
-        <w:t xml:space="preserve">                                        Maximum callouts for GU: ~3 (profiles, settings, experience).</w:t>
+        <w:t xml:space="preserve">                                    this, the chain terminates after the heap-overflow category</w:t>
       </w:r>
     </w:p>
     <w:p>
@@ -10211,7 +10212,6 @@
           <w:color w:val="000080"/>
           <w:sz w:val="17"/>
         </w:rPr>
-        <w:t xml:space="preserve">                                        Per-profile queries would exceed the 100-callout limit.</w:t>
       </w:r>
     </w:p>
     <w:p>
@@ -10226,7 +10226,7 @@
           <w:color w:val="000080"/>
           <w:sz w:val="17"/>
         </w:rPr>
-        <w:t xml:space="preserve">  SecScanRunnerSharingAccess.cls      - SRA - 7 checks</w:t>
+        <w:t>13 Category Runners (each extends SecScanCategoryRunner):</w:t>
       </w:r>
     </w:p>
     <w:p>
@@ -10241,7 +10241,7 @@
           <w:color w:val="000080"/>
           <w:sz w:val="17"/>
         </w:rPr>
-        <w:t xml:space="preserve">  SecScanRunnerSessionAuth.cls        - SA  - 12 checks</w:t>
+        <w:t xml:space="preserve">  SecScanRunnerUserAccess.cls         - UA  - 7 checks</w:t>
       </w:r>
     </w:p>
     <w:p>
@@ -10256,7 +10256,7 @@
           <w:color w:val="000080"/>
           <w:sz w:val="17"/>
         </w:rPr>
-        <w:t xml:space="preserve">  SecScanRunnerConnectedApps.cls      - CAI - 8 checks</w:t>
+        <w:t xml:space="preserve">  SecScanRunnerGuestUser.cls          - GU  - 15 checks (most API-intensive)</w:t>
       </w:r>
     </w:p>
     <w:p>
@@ -10271,7 +10271,7 @@
           <w:color w:val="000080"/>
           <w:sz w:val="17"/>
         </w:rPr>
-        <w:t xml:space="preserve">  SecScanRunnerApexAutomation.cls     - AA  - 8 checks</w:t>
+        <w:t xml:space="preserve">                                        CRITICAL: all 15 checks must operate on data fetched</w:t>
       </w:r>
     </w:p>
     <w:p>
@@ -10286,7 +10286,7 @@
           <w:color w:val="000080"/>
           <w:sz w:val="17"/>
         </w:rPr>
-        <w:t xml:space="preserve">  SecScanRunnerLwcAura.cls            - LA  - 3 checks</w:t>
+        <w:t xml:space="preserve">                                        in bulk - never one Tooling API call per profile per check.</w:t>
       </w:r>
     </w:p>
     <w:p>
@@ -10301,7 +10301,7 @@
           <w:color w:val="000080"/>
           <w:sz w:val="17"/>
         </w:rPr>
-        <w:t xml:space="preserve">  SecScanRunnerAgentforce.cls         - AGA - 5 checks</w:t>
+        <w:t xml:space="preserve">                                        Pattern: one query fetches all Guest profiles + permissions,</w:t>
       </w:r>
     </w:p>
     <w:p>
@@ -10316,7 +10316,7 @@
           <w:color w:val="000080"/>
           <w:sz w:val="17"/>
         </w:rPr>
-        <w:t xml:space="preserve">  SecScanRunnerMetadataSecrets.cls    - MS  - 4 checks</w:t>
+        <w:t xml:space="preserve">                                        load into memory as Map&lt;Id, Map&lt;String,Object&gt;&gt;,</w:t>
       </w:r>
     </w:p>
     <w:p>
@@ -10331,7 +10331,7 @@
           <w:color w:val="000080"/>
           <w:sz w:val="17"/>
         </w:rPr>
-        <w:t xml:space="preserve">  SecScanRunnerFileUpload.cls         - FUE - 3 checks (uses SecScanMetadataService)</w:t>
+        <w:t xml:space="preserve">                                        run all 15 checks against the in-memory collection.</w:t>
       </w:r>
     </w:p>
     <w:p>
@@ -10346,7 +10346,7 @@
           <w:color w:val="000080"/>
           <w:sz w:val="17"/>
         </w:rPr>
-        <w:t xml:space="preserve">  SecScanRunnerCertEncryption.cls     - CE  - 2 checks</w:t>
+        <w:t xml:space="preserve">                                        Maximum callouts for GU: ~3 (profiles, settings, experience).</w:t>
       </w:r>
     </w:p>
     <w:p>
@@ -10361,7 +10361,7 @@
           <w:color w:val="000080"/>
           <w:sz w:val="17"/>
         </w:rPr>
-        <w:t xml:space="preserve">  SecScanRunnerMonitoring.cls         - MON - 4 checks</w:t>
+        <w:t xml:space="preserve">                                        Per-profile queries would exceed the 100-callout limit.</w:t>
       </w:r>
     </w:p>
     <w:p>
@@ -10376,7 +10376,7 @@
           <w:color w:val="000080"/>
           <w:sz w:val="17"/>
         </w:rPr>
-        <w:t xml:space="preserve">  SecScanRunnerHealthCheck.cls        - HCB - 3 checks (uses SecScanMetadataService)</w:t>
+        <w:t xml:space="preserve">  SecScanRunnerSharingAccess.cls      - SRA - 7 checks</w:t>
       </w:r>
     </w:p>
     <w:p>
@@ -10391,6 +10391,7 @@
           <w:color w:val="000080"/>
           <w:sz w:val="17"/>
         </w:rPr>
+        <w:t xml:space="preserve">  SecScanRunnerSessionAuth.cls        - SA  - 12 checks</w:t>
       </w:r>
     </w:p>
     <w:p>
@@ -10405,7 +10406,7 @@
           <w:color w:val="000080"/>
           <w:sz w:val="17"/>
         </w:rPr>
-        <w:t>Apex Controllers (with sharing + WITH USER_MODE):</w:t>
+        <w:t xml:space="preserve">  SecScanRunnerConnectedApps.cls      - CAI - 8 checks</w:t>
       </w:r>
     </w:p>
     <w:p>
@@ -10420,7 +10421,7 @@
           <w:color w:val="000080"/>
           <w:sz w:val="17"/>
         </w:rPr>
-        <w:t xml:space="preserve">  SecScanController.cls             - startScan, getScanRuns, getScanRunStatus, cancelScan, exportFindingsCsv</w:t>
+        <w:t xml:space="preserve">  SecScanRunnerApexAutomation.cls     - AA  - 8 checks</w:t>
       </w:r>
     </w:p>
     <w:p>
@@ -10435,7 +10436,7 @@
           <w:color w:val="000080"/>
           <w:sz w:val="17"/>
         </w:rPr>
-        <w:t xml:space="preserve">  SecScanFindingsController.cls     - getCurrentScanFindings, getFindingDetail, updateFindingStatus, bulkUpdateFindingStatus</w:t>
+        <w:t xml:space="preserve">  SecScanRunnerLwcAura.cls            - LA  - 3 checks</w:t>
       </w:r>
     </w:p>
     <w:p>
@@ -10450,6 +10451,7 @@
           <w:color w:val="000080"/>
           <w:sz w:val="17"/>
         </w:rPr>
+        <w:t xml:space="preserve">  SecScanRunnerAgentforce.cls         - AGA - 5 checks</w:t>
       </w:r>
     </w:p>
     <w:p>
@@ -10464,7 +10466,7 @@
           <w:color w:val="000080"/>
           <w:sz w:val="17"/>
         </w:rPr>
-        <w:t>SecScanTestDataFactory.cls        - Shared test utility. Single source of truth for</w:t>
+        <w:t xml:space="preserve">  SecScanRunnerMetadataSecrets.cls    - MS  - 4 checks</w:t>
       </w:r>
     </w:p>
     <w:p>
@@ -10479,7 +10481,7 @@
           <w:color w:val="000080"/>
           <w:sz w:val="17"/>
         </w:rPr>
-        <w:t xml:space="preserve">                                    creating SecurityScanRun__c and SecurityFinding__c</w:t>
+        <w:t xml:space="preserve">  SecScanRunnerFileUpload.cls         - FUE - 3 checks (uses SecScanMetadataService)</w:t>
       </w:r>
     </w:p>
     <w:p>
@@ -10494,7 +10496,7 @@
           <w:color w:val="000080"/>
           <w:sz w:val="17"/>
         </w:rPr>
-        <w:t xml:space="preserve">                                    test records. All test classes use this - never</w:t>
+        <w:t xml:space="preserve">  SecScanRunnerCertEncryption.cls     - CE  - 2 checks</w:t>
       </w:r>
     </w:p>
     <w:p>
@@ -10509,7 +10511,7 @@
           <w:color w:val="000080"/>
           <w:sz w:val="17"/>
         </w:rPr>
-        <w:t xml:space="preserve">                                    construct records inline. Field changes require</w:t>
+        <w:t xml:space="preserve">  SecScanRunnerMonitoring.cls         - MON - 4 checks</w:t>
       </w:r>
     </w:p>
     <w:p>
@@ -10524,7 +10526,7 @@
           <w:color w:val="000080"/>
           <w:sz w:val="17"/>
         </w:rPr>
-        <w:t xml:space="preserve">                                    updating one file only.</w:t>
+        <w:t xml:space="preserve">  SecScanRunnerHealthCheck.cls        - HCB - 3 checks (uses SecScanMetadataService)</w:t>
       </w:r>
     </w:p>
     <w:p>
@@ -10553,7 +10555,7 @@
           <w:color w:val="000080"/>
           <w:sz w:val="17"/>
         </w:rPr>
-        <w:t>Tests:</w:t>
+        <w:t>Apex Controllers (with sharing + WITH USER_MODE):</w:t>
       </w:r>
     </w:p>
     <w:p>
@@ -10568,7 +10570,7 @@
           <w:color w:val="000080"/>
           <w:sz w:val="17"/>
         </w:rPr>
-        <w:t xml:space="preserve">  SecScanOrchestratorTest.cls</w:t>
+        <w:t xml:space="preserve">  SecScanController.cls             - startScan, getScanRuns, getScanRunStatus, cancelScan, exportFindingsCsv</w:t>
       </w:r>
     </w:p>
     <w:p>
@@ -10583,7 +10585,7 @@
           <w:color w:val="000080"/>
           <w:sz w:val="17"/>
         </w:rPr>
-        <w:t xml:space="preserve">  SecScanToolingServiceTest.cls</w:t>
+        <w:t xml:space="preserve">  SecScanFindingsController.cls     - getCurrentScanFindings, getFindingDetail, updateFindingStatus, bulkUpdateFindingStatus</w:t>
       </w:r>
     </w:p>
     <w:p>
@@ -10598,7 +10600,6 @@
           <w:color w:val="000080"/>
           <w:sz w:val="17"/>
         </w:rPr>
-        <w:t xml:space="preserve">  SecScanMetadataServiceTest.cls          - SOAP fault parsing, malformed XML, timeout handling</w:t>
       </w:r>
     </w:p>
     <w:p>
@@ -10613,7 +10614,7 @@
           <w:color w:val="000080"/>
           <w:sz w:val="17"/>
         </w:rPr>
-        <w:t xml:space="preserve">  SecScanRunnerUserAccessTest.cls         - UA</w:t>
+        <w:t>SecScanTestDataFactory.cls        - Shared test utility. Single source of truth for</w:t>
       </w:r>
     </w:p>
     <w:p>
@@ -10628,7 +10629,7 @@
           <w:color w:val="000080"/>
           <w:sz w:val="17"/>
         </w:rPr>
-        <w:t xml:space="preserve">  SecScanRunnerGuestUserTest.cls          - GU</w:t>
+        <w:t xml:space="preserve">                                    creating SecurityScanRun__c and SecurityFinding__c</w:t>
       </w:r>
     </w:p>
     <w:p>
@@ -10643,7 +10644,7 @@
           <w:color w:val="000080"/>
           <w:sz w:val="17"/>
         </w:rPr>
-        <w:t xml:space="preserve">  SecScanRunnerSharingAccessTest.cls      - SRA</w:t>
+        <w:t xml:space="preserve">                                    test records. All test classes use this - never</w:t>
       </w:r>
     </w:p>
     <w:p>
@@ -10658,7 +10659,7 @@
           <w:color w:val="000080"/>
           <w:sz w:val="17"/>
         </w:rPr>
-        <w:t xml:space="preserve">  SecScanRunnerSessionAuthTest.cls        - SA</w:t>
+        <w:t xml:space="preserve">                                    construct records inline. Field changes require</w:t>
       </w:r>
     </w:p>
     <w:p>
@@ -10673,7 +10674,7 @@
           <w:color w:val="000080"/>
           <w:sz w:val="17"/>
         </w:rPr>
-        <w:t xml:space="preserve">  SecScanRunnerConnectedAppsTest.cls      - CAI</w:t>
+        <w:t xml:space="preserve">                                    updating one file only.</w:t>
       </w:r>
     </w:p>
     <w:p>
@@ -10688,7 +10689,6 @@
           <w:color w:val="000080"/>
           <w:sz w:val="17"/>
         </w:rPr>
-        <w:t xml:space="preserve">  SecScanRunnerApexAutomationTest.cls     - AA</w:t>
       </w:r>
     </w:p>
     <w:p>
@@ -10703,7 +10703,7 @@
           <w:color w:val="000080"/>
           <w:sz w:val="17"/>
         </w:rPr>
-        <w:t xml:space="preserve">  SecScanRunnerLwcAuraTest.cls            - LA</w:t>
+        <w:t>Tests:</w:t>
       </w:r>
     </w:p>
     <w:p>
@@ -10718,7 +10718,7 @@
           <w:color w:val="000080"/>
           <w:sz w:val="17"/>
         </w:rPr>
-        <w:t xml:space="preserve">  SecScanRunnerAgentforceTest.cls         - AGA</w:t>
+        <w:t xml:space="preserve">  SecScanOrchestratorTest.cls</w:t>
       </w:r>
     </w:p>
     <w:p>
@@ -10733,7 +10733,7 @@
           <w:color w:val="000080"/>
           <w:sz w:val="17"/>
         </w:rPr>
-        <w:t xml:space="preserve">  SecScanRunnerMetadataSecretsTest.cls    - MS</w:t>
+        <w:t xml:space="preserve">  SecScanToolingServiceTest.cls</w:t>
       </w:r>
     </w:p>
     <w:p>
@@ -10748,7 +10748,7 @@
           <w:color w:val="000080"/>
           <w:sz w:val="17"/>
         </w:rPr>
-        <w:t xml:space="preserve">  SecScanRunnerFileUploadTest.cls         - FUE</w:t>
+        <w:t xml:space="preserve">  SecScanMetadataServiceTest.cls          - SOAP fault parsing, malformed XML, timeout handling</w:t>
       </w:r>
     </w:p>
     <w:p>
@@ -10763,7 +10763,7 @@
           <w:color w:val="000080"/>
           <w:sz w:val="17"/>
         </w:rPr>
-        <w:t xml:space="preserve">  SecScanRunnerCertEncryptionTest.cls     - CE</w:t>
+        <w:t xml:space="preserve">  SecScanRunnerUserAccessTest.cls         - UA</w:t>
       </w:r>
     </w:p>
     <w:p>
@@ -10778,7 +10778,7 @@
           <w:color w:val="000080"/>
           <w:sz w:val="17"/>
         </w:rPr>
-        <w:t xml:space="preserve">  SecScanRunnerMonitoringTest.cls         - MON</w:t>
+        <w:t xml:space="preserve">  SecScanRunnerGuestUserTest.cls          - GU</w:t>
       </w:r>
     </w:p>
     <w:p>
@@ -10793,7 +10793,7 @@
           <w:color w:val="000080"/>
           <w:sz w:val="17"/>
         </w:rPr>
-        <w:t xml:space="preserve">  SecScanRunnerHealthCheckTest.cls        - HCB</w:t>
+        <w:t xml:space="preserve">  SecScanRunnerSharingAccessTest.cls      - SRA</w:t>
       </w:r>
     </w:p>
     <w:p>
@@ -10808,7 +10808,7 @@
           <w:color w:val="000080"/>
           <w:sz w:val="17"/>
         </w:rPr>
-        <w:t xml:space="preserve">  SecScanControllerTest.cls</w:t>
+        <w:t xml:space="preserve">  SecScanRunnerSessionAuthTest.cls        - SA</w:t>
       </w:r>
     </w:p>
     <w:p>
@@ -10823,7 +10823,7 @@
           <w:color w:val="000080"/>
           <w:sz w:val="17"/>
         </w:rPr>
-        <w:t xml:space="preserve">  SecScanFindingsControllerTest.cls</w:t>
+        <w:t xml:space="preserve">  SecScanRunnerConnectedAppsTest.cls      - CAI</w:t>
       </w:r>
     </w:p>
     <w:p>
@@ -10838,7 +10838,7 @@
           <w:color w:val="000080"/>
           <w:sz w:val="17"/>
         </w:rPr>
-        <w:t xml:space="preserve">  SecScanCategoryRunnerTest.cls           - enforces buildFinding() normalization contract</w:t>
+        <w:t xml:space="preserve">  SecScanRunnerApexAutomationTest.cls     - AA</w:t>
       </w:r>
     </w:p>
     <w:p>
@@ -10853,7 +10853,7 @@
           <w:color w:val="000080"/>
           <w:sz w:val="17"/>
         </w:rPr>
-        <w:t xml:space="preserve">  SecScanRetentionBatchTest.cls           - verifies old runs deleted, findings cascade-deleted</w:t>
+        <w:t xml:space="preserve">  SecScanRunnerLwcAuraTest.cls            - LA</w:t>
       </w:r>
     </w:p>
     <w:p>
@@ -10868,7 +10868,187 @@
           <w:color w:val="000080"/>
           <w:sz w:val="17"/>
         </w:rPr>
+        <w:t xml:space="preserve">  SecScanRunnerAgentforceTest.cls         - AGA</w:t>
+      </w:r>
+    </w:p>
+    <w:p>
+      <w:pPr>
+        <w:pStyle w:val="NoSpacing"/>
+        <w:ind w:left="567"/>
+        <w:shd w:val="clear" w:color="auto" w:fill="F0F0F0"/>
+      </w:pPr>
+      <w:r>
+        <w:rPr>
+          <w:rFonts w:ascii="Courier New" w:hAnsi="Courier New"/>
+          <w:color w:val="000080"/>
+          <w:sz w:val="17"/>
+        </w:rPr>
+        <w:t xml:space="preserve">  SecScanRunnerMetadataSecretsTest.cls    - MS</w:t>
+      </w:r>
+    </w:p>
+    <w:p>
+      <w:pPr>
+        <w:pStyle w:val="NoSpacing"/>
+        <w:ind w:left="567"/>
+        <w:shd w:val="clear" w:color="auto" w:fill="F0F0F0"/>
+      </w:pPr>
+      <w:r>
+        <w:rPr>
+          <w:rFonts w:ascii="Courier New" w:hAnsi="Courier New"/>
+          <w:color w:val="000080"/>
+          <w:sz w:val="17"/>
+        </w:rPr>
+        <w:t xml:space="preserve">  SecScanRunnerFileUploadTest.cls         - FUE</w:t>
+      </w:r>
+    </w:p>
+    <w:p>
+      <w:pPr>
+        <w:pStyle w:val="NoSpacing"/>
+        <w:ind w:left="567"/>
+        <w:shd w:val="clear" w:color="auto" w:fill="F0F0F0"/>
+      </w:pPr>
+      <w:r>
+        <w:rPr>
+          <w:rFonts w:ascii="Courier New" w:hAnsi="Courier New"/>
+          <w:color w:val="000080"/>
+          <w:sz w:val="17"/>
+        </w:rPr>
+        <w:t xml:space="preserve">  SecScanRunnerCertEncryptionTest.cls     - CE</w:t>
+      </w:r>
+    </w:p>
+    <w:p>
+      <w:pPr>
+        <w:pStyle w:val="NoSpacing"/>
+        <w:ind w:left="567"/>
+        <w:shd w:val="clear" w:color="auto" w:fill="F0F0F0"/>
+      </w:pPr>
+      <w:r>
+        <w:rPr>
+          <w:rFonts w:ascii="Courier New" w:hAnsi="Courier New"/>
+          <w:color w:val="000080"/>
+          <w:sz w:val="17"/>
+        </w:rPr>
+        <w:t xml:space="preserve">  SecScanRunnerMonitoringTest.cls         - MON</w:t>
+      </w:r>
+    </w:p>
+    <w:p>
+      <w:pPr>
+        <w:pStyle w:val="NoSpacing"/>
+        <w:ind w:left="567"/>
+        <w:shd w:val="clear" w:color="auto" w:fill="F0F0F0"/>
+      </w:pPr>
+      <w:r>
+        <w:rPr>
+          <w:rFonts w:ascii="Courier New" w:hAnsi="Courier New"/>
+          <w:color w:val="000080"/>
+          <w:sz w:val="17"/>
+        </w:rPr>
+        <w:t xml:space="preserve">  SecScanRunnerHealthCheckTest.cls        - HCB</w:t>
+      </w:r>
+    </w:p>
+    <w:p>
+      <w:pPr>
+        <w:pStyle w:val="NoSpacing"/>
+        <w:ind w:left="567"/>
+        <w:shd w:val="clear" w:color="auto" w:fill="F0F0F0"/>
+      </w:pPr>
+      <w:r>
+        <w:rPr>
+          <w:rFonts w:ascii="Courier New" w:hAnsi="Courier New"/>
+          <w:color w:val="000080"/>
+          <w:sz w:val="17"/>
+        </w:rPr>
+        <w:t xml:space="preserve">  SecScanControllerTest.cls</w:t>
+      </w:r>
+    </w:p>
+    <w:p>
+      <w:pPr>
+        <w:pStyle w:val="NoSpacing"/>
+        <w:ind w:left="567"/>
+        <w:shd w:val="clear" w:color="auto" w:fill="F0F0F0"/>
+      </w:pPr>
+      <w:r>
+        <w:rPr>
+          <w:rFonts w:ascii="Courier New" w:hAnsi="Courier New"/>
+          <w:color w:val="000080"/>
+          <w:sz w:val="17"/>
+        </w:rPr>
+        <w:t xml:space="preserve">  SecScanFindingsControllerTest.cls</w:t>
+      </w:r>
+    </w:p>
+    <w:p>
+      <w:pPr>
+        <w:pStyle w:val="NoSpacing"/>
+        <w:ind w:left="567"/>
+        <w:shd w:val="clear" w:color="auto" w:fill="F0F0F0"/>
+      </w:pPr>
+      <w:r>
+        <w:rPr>
+          <w:rFonts w:ascii="Courier New" w:hAnsi="Courier New"/>
+          <w:color w:val="000080"/>
+          <w:sz w:val="17"/>
+        </w:rPr>
+        <w:t xml:space="preserve">  SecScanCategoryRunnerTest.cls           - enforces buildFinding() normalization contract</w:t>
+      </w:r>
+    </w:p>
+    <w:p>
+      <w:pPr>
+        <w:pStyle w:val="NoSpacing"/>
+        <w:ind w:left="567"/>
+        <w:shd w:val="clear" w:color="auto" w:fill="F0F0F0"/>
+      </w:pPr>
+      <w:r>
+        <w:rPr>
+          <w:rFonts w:ascii="Courier New" w:hAnsi="Courier New"/>
+          <w:color w:val="000080"/>
+          <w:sz w:val="17"/>
+        </w:rPr>
+        <w:t xml:space="preserve">  SecScanRetentionBatchTest.cls           - verifies old runs deleted, findings cascade-deleted</w:t>
+      </w:r>
+    </w:p>
+    <w:p>
+      <w:pPr>
+        <w:pStyle w:val="NoSpacing"/>
+        <w:ind w:left="567"/>
+        <w:shd w:val="clear" w:color="auto" w:fill="F0F0F0"/>
+      </w:pPr>
+      <w:r>
+        <w:rPr>
+          <w:rFonts w:ascii="Courier New" w:hAnsi="Courier New"/>
+          <w:color w:val="000080"/>
+          <w:sz w:val="17"/>
+        </w:rPr>
         <w:t xml:space="preserve">  SecScanOrphanCleanupSchedulableTest.cls - schedule the job, verify it appears in CronTrigger, unschedule. Minimal coverage sufficient for deployment.</w:t>
+      </w:r>
+    </w:p>
+    <w:p>
+      <w:pPr>
+        <w:pStyle w:val="NoSpacing"/>
+        <w:ind w:left="567"/>
+        <w:shd w:val="clear" w:color="auto" w:fill="F0F0F0"/>
+      </w:pPr>
+      <w:r>
+        <w:rPr>
+          <w:rFonts w:ascii="Courier New" w:hAnsi="Courier New"/>
+          <w:color w:val="000080"/>
+          <w:sz w:val="17"/>
+        </w:rPr>
+        <w:t xml:space="preserve">  SecScanPostInstallHandlerTest.cls       - simulate fresh install and upgrade contexts. Verify job scheduled on install. Verify old job aborted and new job created on upgrade (no duplicate CronTrigger entries).</w:t>
+      </w:r>
+    </w:p>
+    <w:p>
+      <w:pPr>
+        <w:pStyle w:val="NoSpacing"/>
+        <w:ind w:left="567"/>
+        <w:shd w:val="clear" w:color="auto" w:fill="F0F0F0"/>
+      </w:pPr>
+      <w:r>
+        <w:rPr>
+          <w:rFonts w:ascii="Courier New" w:hAnsi="Courier New"/>
+          <w:color w:val="000080"/>
+          <w:sz w:val="17"/>
+        </w:rPr>
+        <w:t xml:space="preserve">  SecScanPostUninstallHandlerTest.cls     - verify scheduled job is aborted. Silent on already-absent job.</w:t>
       </w:r>
     </w:p>
     <w:p>
@@ -24684,22 +24864,11 @@
               </w:rPr>
               <w:t>SecScanOrphanCleanupSchedulable</w:t>
             </w:r>
-          </w:p>
-        </w:tc>
-        <w:tc>
-          <w:tcPr>
-            <w:tcW w:type="dxa" w:w="3135"/>
-            <w:vAlign w:val="center"/>
-          </w:tcPr>
-          <w:p>
-            <w:pPr>
-              <w:jc w:val="left"/>
-            </w:pPr>
-            <w:r>
-              <w:rPr>
-                <w:sz w:val="18"/>
-              </w:rPr>
-              <w:t xml:space="preserve">Must deploy together in one unit before runners. </w:t>
+            <w:r>
+              <w:rPr>
+                <w:sz w:val="18"/>
+              </w:rPr>
+              <w:t xml:space="preserve">, </w:t>
             </w:r>
             <w:r>
               <w:rPr>
@@ -24707,13 +24876,13 @@
                 <w:color w:val="8B0000"/>
                 <w:sz w:val="18"/>
               </w:rPr>
-              <w:t>SecScanRunnerChain</w:t>
-            </w:r>
-            <w:r>
-              <w:rPr>
-                <w:sz w:val="18"/>
-              </w:rPr>
-              <w:t xml:space="preserve"> calls </w:t>
+              <w:t>SecScanPostInstallHandler</w:t>
+            </w:r>
+            <w:r>
+              <w:rPr>
+                <w:sz w:val="18"/>
+              </w:rPr>
+              <w:t xml:space="preserve">, </w:t>
             </w:r>
             <w:r>
               <w:rPr>
@@ -24721,13 +24890,24 @@
                 <w:color w:val="8B0000"/>
                 <w:sz w:val="18"/>
               </w:rPr>
-              <w:t>SecScanOrchestrator.finalizeScan()</w:t>
-            </w:r>
-            <w:r>
-              <w:rPr>
-                <w:sz w:val="18"/>
-              </w:rPr>
-              <w:t xml:space="preserve"> and </w:t>
+              <w:t>SecScanPostUninstallHandler</w:t>
+            </w:r>
+          </w:p>
+        </w:tc>
+        <w:tc>
+          <w:tcPr>
+            <w:tcW w:type="dxa" w:w="3135"/>
+            <w:vAlign w:val="center"/>
+          </w:tcPr>
+          <w:p>
+            <w:pPr>
+              <w:jc w:val="left"/>
+            </w:pPr>
+            <w:r>
+              <w:rPr>
+                <w:sz w:val="18"/>
+              </w:rPr>
+              <w:t xml:space="preserve">Must deploy together in one unit before runners. </w:t>
             </w:r>
             <w:r>
               <w:rPr>
@@ -24735,7 +24915,7 @@
                 <w:color w:val="8B0000"/>
                 <w:sz w:val="18"/>
               </w:rPr>
-              <w:t>SecScanOrchestrator.startScan()</w:t>
+              <w:t>SecScanRunnerChain</w:t>
             </w:r>
             <w:r>
               <w:rPr>
@@ -24749,13 +24929,13 @@
                 <w:color w:val="8B0000"/>
                 <w:sz w:val="18"/>
               </w:rPr>
-              <w:t>SecScanRunnerChain</w:t>
-            </w:r>
-            <w:r>
-              <w:rPr>
-                <w:sz w:val="18"/>
-              </w:rPr>
-              <w:t xml:space="preserve"> - mutual reference, safe when deployed together. </w:t>
+              <w:t>SecScanOrchestrator.finalizeScan()</w:t>
+            </w:r>
+            <w:r>
+              <w:rPr>
+                <w:sz w:val="18"/>
+              </w:rPr>
+              <w:t xml:space="preserve"> and </w:t>
             </w:r>
             <w:r>
               <w:rPr>
@@ -24763,7 +24943,7 @@
                 <w:color w:val="8B0000"/>
                 <w:sz w:val="18"/>
               </w:rPr>
-              <w:t>SecScanRunnerContinuation</w:t>
+              <w:t>SecScanOrchestrator.startScan()</w:t>
             </w:r>
             <w:r>
               <w:rPr>
@@ -24777,13 +24957,13 @@
                 <w:color w:val="8B0000"/>
                 <w:sz w:val="18"/>
               </w:rPr>
-              <w:t>new SecScanRunnerChain(...)</w:t>
-            </w:r>
-            <w:r>
-              <w:rPr>
-                <w:sz w:val="18"/>
-              </w:rPr>
-              <w:t xml:space="preserve"> - all in same unit. AA/LA runners call </w:t>
+              <w:t>SecScanRunnerChain</w:t>
+            </w:r>
+            <w:r>
+              <w:rPr>
+                <w:sz w:val="18"/>
+              </w:rPr>
+              <w:t xml:space="preserve"> - mutual reference, safe when deployed together. </w:t>
             </w:r>
             <w:r>
               <w:rPr>
@@ -24791,13 +24971,55 @@
                 <w:color w:val="8B0000"/>
                 <w:sz w:val="18"/>
               </w:rPr>
+              <w:t>SecScanRunnerContinuation</w:t>
+            </w:r>
+            <w:r>
+              <w:rPr>
+                <w:sz w:val="18"/>
+              </w:rPr>
+              <w:t xml:space="preserve"> calls </w:t>
+            </w:r>
+            <w:r>
+              <w:rPr>
+                <w:rFonts w:ascii="Courier New" w:hAnsi="Courier New"/>
+                <w:color w:val="8B0000"/>
+                <w:sz w:val="18"/>
+              </w:rPr>
+              <w:t>new SecScanRunnerChain(...)</w:t>
+            </w:r>
+            <w:r>
+              <w:rPr>
+                <w:sz w:val="18"/>
+              </w:rPr>
+              <w:t xml:space="preserve"> - all in same unit. AA/LA runners call </w:t>
+            </w:r>
+            <w:r>
+              <w:rPr>
+                <w:rFonts w:ascii="Courier New" w:hAnsi="Courier New"/>
+                <w:color w:val="8B0000"/>
+                <w:sz w:val="18"/>
+              </w:rPr>
               <w:t>new SecScanRunnerContinuation(...)</w:t>
             </w:r>
             <w:r>
               <w:rPr>
                 <w:sz w:val="18"/>
               </w:rPr>
-              <w:t xml:space="preserve"> at compile time - this class must exist before runners deploy. Deploying Chain and Continuation in Phase 4 (after runners) causes a compile error in Phase 3 runners.</w:t>
+              <w:t xml:space="preserve"> at compile time - this class must exist before runners deploy. Deploying Chain and Continuation in Phase 4 (after runners) causes a compile error in Phase 3 runners. Post-install/uninstall handlers reference </w:t>
+            </w:r>
+            <w:r>
+              <w:rPr>
+                <w:rFonts w:ascii="Courier New" w:hAnsi="Courier New"/>
+                <w:color w:val="8B0000"/>
+                <w:sz w:val="18"/>
+              </w:rPr>
+              <w:t>SecScanOrphanCleanupSchedulable</w:t>
+            </w:r>
+            <w:r>
+              <w:rPr>
+                <w:sz w:val="18"/>
+              </w:rPr>
+              <w:t xml:space="preserve"> - same unit.</w:t>
             </w:r>
           </w:p>
         </w:tc>
@@ -25603,6 +25825,632 @@
       </w:tr>
     </w:tbl>
     <w:p/>
+    <w:p>
+      <w:pPr>
+        <w:pBdr>
+          <w:bottom w:val="single" w:sz="6" w:space="1" w:color="2E74B5"/>
+        </w:pBdr>
+      </w:pPr>
+    </w:p>
+    <w:p>
+      <w:pPr>
+        <w:pStyle w:val="Heading2"/>
+      </w:pPr>
+      <w:r>
+        <w:t>Package Configuration</w:t>
+      </w:r>
+    </w:p>
+    <w:p>
+      <w:r>
+        <w:rPr>
+          <w:b/>
+          <w:sz w:val="20"/>
+        </w:rPr>
+        <w:t>Type:</w:t>
+      </w:r>
+      <w:r>
+        <w:rPr>
+          <w:sz w:val="20"/>
+        </w:rPr>
+        <w:t xml:space="preserve"> Unlocked Package (no namespace). Installable via URL. CMT records, Permission Set, and all metadata deploy with the package. Subscriber org data (</w:t>
+      </w:r>
+      <w:r>
+        <w:rPr>
+          <w:rFonts w:ascii="Courier New" w:hAnsi="Courier New"/>
+          <w:color w:val="8B0000"/>
+          <w:sz w:val="20"/>
+        </w:rPr>
+        <w:t>SecurityScanRun__c</w:t>
+      </w:r>
+      <w:r>
+        <w:rPr>
+          <w:sz w:val="20"/>
+        </w:rPr>
+        <w:t xml:space="preserve">, </w:t>
+      </w:r>
+      <w:r>
+        <w:rPr>
+          <w:rFonts w:ascii="Courier New" w:hAnsi="Courier New"/>
+          <w:color w:val="8B0000"/>
+          <w:sz w:val="20"/>
+        </w:rPr>
+        <w:t>SecurityFinding__c</w:t>
+      </w:r>
+      <w:r>
+        <w:rPr>
+          <w:sz w:val="20"/>
+        </w:rPr>
+        <w:t xml:space="preserve"> records) is preserved on upgrade.</w:t>
+      </w:r>
+    </w:p>
+    <w:p>
+      <w:pPr>
+        <w:pStyle w:val="Heading3"/>
+      </w:pPr>
+      <w:r>
+        <w:t>`sfdx-project.json`</w:t>
+      </w:r>
+    </w:p>
+    <w:p>
+      <w:pPr>
+        <w:pStyle w:val="NoSpacing"/>
+        <w:ind w:left="567"/>
+        <w:shd w:val="clear" w:color="auto" w:fill="F0F0F0"/>
+      </w:pPr>
+      <w:r>
+        <w:rPr>
+          <w:rFonts w:ascii="Courier New" w:hAnsi="Courier New"/>
+          <w:color w:val="000080"/>
+          <w:sz w:val="17"/>
+        </w:rPr>
+        <w:t>{</w:t>
+      </w:r>
+    </w:p>
+    <w:p>
+      <w:pPr>
+        <w:pStyle w:val="NoSpacing"/>
+        <w:ind w:left="567"/>
+        <w:shd w:val="clear" w:color="auto" w:fill="F0F0F0"/>
+      </w:pPr>
+      <w:r>
+        <w:rPr>
+          <w:rFonts w:ascii="Courier New" w:hAnsi="Courier New"/>
+          <w:color w:val="000080"/>
+          <w:sz w:val="17"/>
+        </w:rPr>
+        <w:t xml:space="preserve">  "packageDirectories": [</w:t>
+      </w:r>
+    </w:p>
+    <w:p>
+      <w:pPr>
+        <w:pStyle w:val="NoSpacing"/>
+        <w:ind w:left="567"/>
+        <w:shd w:val="clear" w:color="auto" w:fill="F0F0F0"/>
+      </w:pPr>
+      <w:r>
+        <w:rPr>
+          <w:rFonts w:ascii="Courier New" w:hAnsi="Courier New"/>
+          <w:color w:val="000080"/>
+          <w:sz w:val="17"/>
+        </w:rPr>
+        <w:t xml:space="preserve">    {</w:t>
+      </w:r>
+    </w:p>
+    <w:p>
+      <w:pPr>
+        <w:pStyle w:val="NoSpacing"/>
+        <w:ind w:left="567"/>
+        <w:shd w:val="clear" w:color="auto" w:fill="F0F0F0"/>
+      </w:pPr>
+      <w:r>
+        <w:rPr>
+          <w:rFonts w:ascii="Courier New" w:hAnsi="Courier New"/>
+          <w:color w:val="000080"/>
+          <w:sz w:val="17"/>
+        </w:rPr>
+        <w:t xml:space="preserve">      "path": "force-app",</w:t>
+      </w:r>
+    </w:p>
+    <w:p>
+      <w:pPr>
+        <w:pStyle w:val="NoSpacing"/>
+        <w:ind w:left="567"/>
+        <w:shd w:val="clear" w:color="auto" w:fill="F0F0F0"/>
+      </w:pPr>
+      <w:r>
+        <w:rPr>
+          <w:rFonts w:ascii="Courier New" w:hAnsi="Courier New"/>
+          <w:color w:val="000080"/>
+          <w:sz w:val="17"/>
+        </w:rPr>
+        <w:t xml:space="preserve">      "default": true,</w:t>
+      </w:r>
+    </w:p>
+    <w:p>
+      <w:pPr>
+        <w:pStyle w:val="NoSpacing"/>
+        <w:ind w:left="567"/>
+        <w:shd w:val="clear" w:color="auto" w:fill="F0F0F0"/>
+      </w:pPr>
+      <w:r>
+        <w:rPr>
+          <w:rFonts w:ascii="Courier New" w:hAnsi="Courier New"/>
+          <w:color w:val="000080"/>
+          <w:sz w:val="17"/>
+        </w:rPr>
+        <w:t xml:space="preserve">      "package": "OrgSecurityScanner",</w:t>
+      </w:r>
+    </w:p>
+    <w:p>
+      <w:pPr>
+        <w:pStyle w:val="NoSpacing"/>
+        <w:ind w:left="567"/>
+        <w:shd w:val="clear" w:color="auto" w:fill="F0F0F0"/>
+      </w:pPr>
+      <w:r>
+        <w:rPr>
+          <w:rFonts w:ascii="Courier New" w:hAnsi="Courier New"/>
+          <w:color w:val="000080"/>
+          <w:sz w:val="17"/>
+        </w:rPr>
+        <w:t xml:space="preserve">      "versionName": "v1.0",</w:t>
+      </w:r>
+    </w:p>
+    <w:p>
+      <w:pPr>
+        <w:pStyle w:val="NoSpacing"/>
+        <w:ind w:left="567"/>
+        <w:shd w:val="clear" w:color="auto" w:fill="F0F0F0"/>
+      </w:pPr>
+      <w:r>
+        <w:rPr>
+          <w:rFonts w:ascii="Courier New" w:hAnsi="Courier New"/>
+          <w:color w:val="000080"/>
+          <w:sz w:val="17"/>
+        </w:rPr>
+        <w:t xml:space="preserve">      "versionNumber": "1.0.0.NEXT",</w:t>
+      </w:r>
+    </w:p>
+    <w:p>
+      <w:pPr>
+        <w:pStyle w:val="NoSpacing"/>
+        <w:ind w:left="567"/>
+        <w:shd w:val="clear" w:color="auto" w:fill="F0F0F0"/>
+      </w:pPr>
+      <w:r>
+        <w:rPr>
+          <w:rFonts w:ascii="Courier New" w:hAnsi="Courier New"/>
+          <w:color w:val="000080"/>
+          <w:sz w:val="17"/>
+        </w:rPr>
+        <w:t xml:space="preserve">      "definitionFile": "config/project-scratch-def.json"</w:t>
+      </w:r>
+    </w:p>
+    <w:p>
+      <w:pPr>
+        <w:pStyle w:val="NoSpacing"/>
+        <w:ind w:left="567"/>
+        <w:shd w:val="clear" w:color="auto" w:fill="F0F0F0"/>
+      </w:pPr>
+      <w:r>
+        <w:rPr>
+          <w:rFonts w:ascii="Courier New" w:hAnsi="Courier New"/>
+          <w:color w:val="000080"/>
+          <w:sz w:val="17"/>
+        </w:rPr>
+        <w:t xml:space="preserve">    }</w:t>
+      </w:r>
+    </w:p>
+    <w:p>
+      <w:pPr>
+        <w:pStyle w:val="NoSpacing"/>
+        <w:ind w:left="567"/>
+        <w:shd w:val="clear" w:color="auto" w:fill="F0F0F0"/>
+      </w:pPr>
+      <w:r>
+        <w:rPr>
+          <w:rFonts w:ascii="Courier New" w:hAnsi="Courier New"/>
+          <w:color w:val="000080"/>
+          <w:sz w:val="17"/>
+        </w:rPr>
+        <w:t xml:space="preserve">  ],</w:t>
+      </w:r>
+    </w:p>
+    <w:p>
+      <w:pPr>
+        <w:pStyle w:val="NoSpacing"/>
+        <w:ind w:left="567"/>
+        <w:shd w:val="clear" w:color="auto" w:fill="F0F0F0"/>
+      </w:pPr>
+      <w:r>
+        <w:rPr>
+          <w:rFonts w:ascii="Courier New" w:hAnsi="Courier New"/>
+          <w:color w:val="000080"/>
+          <w:sz w:val="17"/>
+        </w:rPr>
+        <w:t xml:space="preserve">  "name": "OrgSecurityScanner",</w:t>
+      </w:r>
+    </w:p>
+    <w:p>
+      <w:pPr>
+        <w:pStyle w:val="NoSpacing"/>
+        <w:ind w:left="567"/>
+        <w:shd w:val="clear" w:color="auto" w:fill="F0F0F0"/>
+      </w:pPr>
+      <w:r>
+        <w:rPr>
+          <w:rFonts w:ascii="Courier New" w:hAnsi="Courier New"/>
+          <w:color w:val="000080"/>
+          <w:sz w:val="17"/>
+        </w:rPr>
+        <w:t xml:space="preserve">  "namespace": "",</w:t>
+      </w:r>
+    </w:p>
+    <w:p>
+      <w:pPr>
+        <w:pStyle w:val="NoSpacing"/>
+        <w:ind w:left="567"/>
+        <w:shd w:val="clear" w:color="auto" w:fill="F0F0F0"/>
+      </w:pPr>
+      <w:r>
+        <w:rPr>
+          <w:rFonts w:ascii="Courier New" w:hAnsi="Courier New"/>
+          <w:color w:val="000080"/>
+          <w:sz w:val="17"/>
+        </w:rPr>
+        <w:t xml:space="preserve">  "sourceApiVersion": "66.0",</w:t>
+      </w:r>
+    </w:p>
+    <w:p>
+      <w:pPr>
+        <w:pStyle w:val="NoSpacing"/>
+        <w:ind w:left="567"/>
+        <w:shd w:val="clear" w:color="auto" w:fill="F0F0F0"/>
+      </w:pPr>
+      <w:r>
+        <w:rPr>
+          <w:rFonts w:ascii="Courier New" w:hAnsi="Courier New"/>
+          <w:color w:val="000080"/>
+          <w:sz w:val="17"/>
+        </w:rPr>
+        <w:t xml:space="preserve">  "packageAliases": {}</w:t>
+      </w:r>
+    </w:p>
+    <w:p>
+      <w:pPr>
+        <w:pStyle w:val="NoSpacing"/>
+        <w:ind w:left="567"/>
+        <w:shd w:val="clear" w:color="auto" w:fill="F0F0F0"/>
+      </w:pPr>
+      <w:r>
+        <w:rPr>
+          <w:rFonts w:ascii="Courier New" w:hAnsi="Courier New"/>
+          <w:color w:val="000080"/>
+          <w:sz w:val="17"/>
+        </w:rPr>
+        <w:t>}</w:t>
+      </w:r>
+    </w:p>
+    <w:p/>
+    <w:p>
+      <w:r>
+        <w:rPr>
+          <w:rFonts w:ascii="Courier New" w:hAnsi="Courier New"/>
+          <w:color w:val="8B0000"/>
+          <w:sz w:val="20"/>
+        </w:rPr>
+        <w:t>packageAliases</w:t>
+      </w:r>
+      <w:r>
+        <w:rPr>
+          <w:sz w:val="20"/>
+        </w:rPr>
+        <w:t xml:space="preserve"> is populated by </w:t>
+      </w:r>
+      <w:r>
+        <w:rPr>
+          <w:rFonts w:ascii="Courier New" w:hAnsi="Courier New"/>
+          <w:color w:val="8B0000"/>
+          <w:sz w:val="20"/>
+        </w:rPr>
+        <w:t>sf package create</w:t>
+      </w:r>
+      <w:r>
+        <w:rPr>
+          <w:sz w:val="20"/>
+        </w:rPr>
+        <w:t xml:space="preserve"> and </w:t>
+      </w:r>
+      <w:r>
+        <w:rPr>
+          <w:rFonts w:ascii="Courier New" w:hAnsi="Courier New"/>
+          <w:color w:val="8B0000"/>
+          <w:sz w:val="20"/>
+        </w:rPr>
+        <w:t>sf package version create</w:t>
+      </w:r>
+      <w:r>
+        <w:rPr>
+          <w:sz w:val="20"/>
+        </w:rPr>
+        <w:t xml:space="preserve"> - commit the updated </w:t>
+      </w:r>
+      <w:r>
+        <w:rPr>
+          <w:rFonts w:ascii="Courier New" w:hAnsi="Courier New"/>
+          <w:color w:val="8B0000"/>
+          <w:sz w:val="20"/>
+        </w:rPr>
+        <w:t>sfdx-project.json</w:t>
+      </w:r>
+      <w:r>
+        <w:rPr>
+          <w:sz w:val="20"/>
+        </w:rPr>
+        <w:t xml:space="preserve"> after each command.</w:t>
+      </w:r>
+    </w:p>
+    <w:p>
+      <w:pPr>
+        <w:pStyle w:val="Heading3"/>
+      </w:pPr>
+      <w:r>
+        <w:t>Package Lifecycle Commands</w:t>
+      </w:r>
+    </w:p>
+    <w:p>
+      <w:pPr>
+        <w:pStyle w:val="NoSpacing"/>
+        <w:ind w:left="567"/>
+        <w:shd w:val="clear" w:color="auto" w:fill="F0F0F0"/>
+      </w:pPr>
+      <w:r>
+        <w:rPr>
+          <w:rFonts w:ascii="Courier New" w:hAnsi="Courier New"/>
+          <w:color w:val="000080"/>
+          <w:sz w:val="17"/>
+        </w:rPr>
+        <w:t># 1. Create the package (one-time)</w:t>
+      </w:r>
+    </w:p>
+    <w:p>
+      <w:pPr>
+        <w:pStyle w:val="NoSpacing"/>
+        <w:ind w:left="567"/>
+        <w:shd w:val="clear" w:color="auto" w:fill="F0F0F0"/>
+      </w:pPr>
+      <w:r>
+        <w:rPr>
+          <w:rFonts w:ascii="Courier New" w:hAnsi="Courier New"/>
+          <w:color w:val="000080"/>
+          <w:sz w:val="17"/>
+        </w:rPr>
+        <w:t>sf package create --name "OrgSecurityScanner" --package-type Unlocked --path force-app --target-dev-hub &lt;DevHub&gt;</w:t>
+      </w:r>
+    </w:p>
+    <w:p>
+      <w:pPr>
+        <w:pStyle w:val="NoSpacing"/>
+        <w:ind w:left="567"/>
+        <w:shd w:val="clear" w:color="auto" w:fill="F0F0F0"/>
+      </w:pPr>
+      <w:r>
+        <w:rPr>
+          <w:rFonts w:ascii="Courier New" w:hAnsi="Courier New"/>
+          <w:color w:val="000080"/>
+          <w:sz w:val="17"/>
+        </w:rPr>
+      </w:r>
+    </w:p>
+    <w:p>
+      <w:pPr>
+        <w:pStyle w:val="NoSpacing"/>
+        <w:ind w:left="567"/>
+        <w:shd w:val="clear" w:color="auto" w:fill="F0F0F0"/>
+      </w:pPr>
+      <w:r>
+        <w:rPr>
+          <w:rFonts w:ascii="Courier New" w:hAnsi="Courier New"/>
+          <w:color w:val="000080"/>
+          <w:sz w:val="17"/>
+        </w:rPr>
+        <w:t># 2. Create a new version</w:t>
+      </w:r>
+    </w:p>
+    <w:p>
+      <w:pPr>
+        <w:pStyle w:val="NoSpacing"/>
+        <w:ind w:left="567"/>
+        <w:shd w:val="clear" w:color="auto" w:fill="F0F0F0"/>
+      </w:pPr>
+      <w:r>
+        <w:rPr>
+          <w:rFonts w:ascii="Courier New" w:hAnsi="Courier New"/>
+          <w:color w:val="000080"/>
+          <w:sz w:val="17"/>
+        </w:rPr>
+        <w:t>sf package version create --package "OrgSecurityScanner" --installation-key-bypass --wait 20 --target-dev-hub &lt;DevHub&gt;</w:t>
+      </w:r>
+    </w:p>
+    <w:p>
+      <w:pPr>
+        <w:pStyle w:val="NoSpacing"/>
+        <w:ind w:left="567"/>
+        <w:shd w:val="clear" w:color="auto" w:fill="F0F0F0"/>
+      </w:pPr>
+      <w:r>
+        <w:rPr>
+          <w:rFonts w:ascii="Courier New" w:hAnsi="Courier New"/>
+          <w:color w:val="000080"/>
+          <w:sz w:val="17"/>
+        </w:rPr>
+      </w:r>
+    </w:p>
+    <w:p>
+      <w:pPr>
+        <w:pStyle w:val="NoSpacing"/>
+        <w:ind w:left="567"/>
+        <w:shd w:val="clear" w:color="auto" w:fill="F0F0F0"/>
+      </w:pPr>
+      <w:r>
+        <w:rPr>
+          <w:rFonts w:ascii="Courier New" w:hAnsi="Courier New"/>
+          <w:color w:val="000080"/>
+          <w:sz w:val="17"/>
+        </w:rPr>
+        <w:t># 3. Promote to released (required before installing in production)</w:t>
+      </w:r>
+    </w:p>
+    <w:p>
+      <w:pPr>
+        <w:pStyle w:val="NoSpacing"/>
+        <w:ind w:left="567"/>
+        <w:shd w:val="clear" w:color="auto" w:fill="F0F0F0"/>
+      </w:pPr>
+      <w:r>
+        <w:rPr>
+          <w:rFonts w:ascii="Courier New" w:hAnsi="Courier New"/>
+          <w:color w:val="000080"/>
+          <w:sz w:val="17"/>
+        </w:rPr>
+        <w:t>sf package version promote --package "OrgSecurityScanner@1.0.0-1" --target-dev-hub &lt;DevHub&gt;</w:t>
+      </w:r>
+    </w:p>
+    <w:p>
+      <w:pPr>
+        <w:pStyle w:val="NoSpacing"/>
+        <w:ind w:left="567"/>
+        <w:shd w:val="clear" w:color="auto" w:fill="F0F0F0"/>
+      </w:pPr>
+      <w:r>
+        <w:rPr>
+          <w:rFonts w:ascii="Courier New" w:hAnsi="Courier New"/>
+          <w:color w:val="000080"/>
+          <w:sz w:val="17"/>
+        </w:rPr>
+      </w:r>
+    </w:p>
+    <w:p>
+      <w:pPr>
+        <w:pStyle w:val="NoSpacing"/>
+        <w:ind w:left="567"/>
+        <w:shd w:val="clear" w:color="auto" w:fill="F0F0F0"/>
+      </w:pPr>
+      <w:r>
+        <w:rPr>
+          <w:rFonts w:ascii="Courier New" w:hAnsi="Courier New"/>
+          <w:color w:val="000080"/>
+          <w:sz w:val="17"/>
+        </w:rPr>
+        <w:t># 4. Install in a target org</w:t>
+      </w:r>
+    </w:p>
+    <w:p>
+      <w:pPr>
+        <w:pStyle w:val="NoSpacing"/>
+        <w:ind w:left="567"/>
+        <w:shd w:val="clear" w:color="auto" w:fill="F0F0F0"/>
+      </w:pPr>
+      <w:r>
+        <w:rPr>
+          <w:rFonts w:ascii="Courier New" w:hAnsi="Courier New"/>
+          <w:color w:val="000080"/>
+          <w:sz w:val="17"/>
+        </w:rPr>
+        <w:t>sf package install --package "OrgSecurityScanner@1.0.0-1" --target-org &lt;alias&gt; --wait 10</w:t>
+      </w:r>
+    </w:p>
+    <w:p/>
+    <w:p>
+      <w:pPr>
+        <w:pStyle w:val="Heading3"/>
+      </w:pPr>
+      <w:r>
+        <w:t>Post-Install Behavior</w:t>
+      </w:r>
+    </w:p>
+    <w:p>
+      <w:r>
+        <w:rPr>
+          <w:rFonts w:ascii="Courier New" w:hAnsi="Courier New"/>
+          <w:color w:val="8B0000"/>
+          <w:sz w:val="20"/>
+        </w:rPr>
+        <w:t>SecScanPostInstallHandler</w:t>
+      </w:r>
+      <w:r>
+        <w:rPr>
+          <w:sz w:val="20"/>
+        </w:rPr>
+        <w:t xml:space="preserve"> runs automatically after </w:t>
+      </w:r>
+      <w:r>
+        <w:rPr>
+          <w:rFonts w:ascii="Courier New" w:hAnsi="Courier New"/>
+          <w:color w:val="8B0000"/>
+          <w:sz w:val="20"/>
+        </w:rPr>
+        <w:t>sf package install</w:t>
+      </w:r>
+      <w:r>
+        <w:rPr>
+          <w:sz w:val="20"/>
+        </w:rPr>
+        <w:t>. It schedules the nightly cleanup job - no manual Execute Anonymous step required. On upgrade, it aborts the existing scheduled job and reschedules to prevent duplicates.</w:t>
+      </w:r>
+    </w:p>
+    <w:p>
+      <w:pPr>
+        <w:pStyle w:val="Heading3"/>
+      </w:pPr>
+      <w:r>
+        <w:t>Uninstall Behavior</w:t>
+      </w:r>
+    </w:p>
+    <w:p>
+      <w:r>
+        <w:rPr>
+          <w:rFonts w:ascii="Courier New" w:hAnsi="Courier New"/>
+          <w:color w:val="8B0000"/>
+          <w:sz w:val="20"/>
+        </w:rPr>
+        <w:t>SecScanPostUninstallHandler</w:t>
+      </w:r>
+      <w:r>
+        <w:rPr>
+          <w:sz w:val="20"/>
+        </w:rPr>
+        <w:t xml:space="preserve"> aborts the scheduled job before package removal. </w:t>
+      </w:r>
+      <w:r>
+        <w:rPr>
+          <w:rFonts w:ascii="Courier New" w:hAnsi="Courier New"/>
+          <w:color w:val="8B0000"/>
+          <w:sz w:val="20"/>
+        </w:rPr>
+        <w:t>SecurityScanRun__c</w:t>
+      </w:r>
+      <w:r>
+        <w:rPr>
+          <w:sz w:val="20"/>
+        </w:rPr>
+        <w:t xml:space="preserve"> and </w:t>
+      </w:r>
+      <w:r>
+        <w:rPr>
+          <w:rFonts w:ascii="Courier New" w:hAnsi="Courier New"/>
+          <w:color w:val="8B0000"/>
+          <w:sz w:val="20"/>
+        </w:rPr>
+        <w:t>SecurityFinding__c</w:t>
+      </w:r>
+      <w:r>
+        <w:rPr>
+          <w:sz w:val="20"/>
+        </w:rPr>
+        <w:t xml:space="preserve"> data is deleted when the objects are removed (subscriber must export first if needed).</w:t>
+      </w:r>
+    </w:p>
     <w:p>
       <w:pPr>
         <w:pBdr>

</xml_diff>